<commit_message>
Signature sheet: remove Seokjeom village page
Co-Authored-By: Claude Opus 5.5 <noreply@anthropic.com>
Claude-Session: https://claude.ai/code/session_01H9b7FFp3sXnkbpWqGcr2Bw
</commit_message>
<xml_diff>
--- a/주민서명부_수사의뢰동참.docx
+++ b/주민서명부_수사의뢰동참.docx
@@ -3014,2532 +3014,6 @@
           <w:szCs w:val="30"/>
         </w:rPr>
         <w:t xml:space="preserve">주민 서명부 — 횡룡마을</w:t>
-      </w:r>
-    </w:p>
-    <w:tbl>
-      <w:tblPr>
-        <w:tblW w:type="dxa" w:w="14838"/>
-        <w:tblBorders>
-          <w:top w:val="single" w:color="auto" w:sz="4"/>
-          <w:left w:val="single" w:color="auto" w:sz="4"/>
-          <w:bottom w:val="single" w:color="auto" w:sz="4"/>
-          <w:right w:val="single" w:color="auto" w:sz="4"/>
-          <w:insideH w:val="single" w:color="auto" w:sz="4"/>
-          <w:insideV w:val="single" w:color="auto" w:sz="4"/>
-        </w:tblBorders>
-      </w:tblPr>
-      <w:tblGrid>
-        <w:gridCol w:w="14838"/>
-      </w:tblGrid>
-      <w:tr>
-        <w:tc>
-          <w:tcPr>
-            <w:tcW w:type="dxa" w:w="14838"/>
-            <w:tcBorders>
-              <w:top w:val="single" w:color="000000" w:sz="6"/>
-              <w:left w:val="single" w:color="000000" w:sz="6"/>
-              <w:bottom w:val="single" w:color="000000" w:sz="6"/>
-              <w:right w:val="single" w:color="000000" w:sz="6"/>
-            </w:tcBorders>
-            <w:shd w:fill="F2F2F2" w:color="auto" w:val="clear"/>
-            <w:tcMar>
-              <w:top w:type="dxa" w:w="100"/>
-              <w:left w:type="dxa" w:w="160"/>
-              <w:bottom w:type="dxa" w:w="100"/>
-              <w:right w:type="dxa" w:w="160"/>
-            </w:tcMar>
-          </w:tcPr>
-          <w:p>
-            <w:pPr>
-              <w:spacing w:after="0" w:before="0" w:line="270"/>
-              <w:jc w:val="both"/>
-            </w:pPr>
-            <w:r>
-              <w:rPr>
-                <w:rFonts w:ascii="맑은 고딕" w:cs="맑은 고딕" w:eastAsia="맑은 고딕" w:hAnsi="맑은 고딕"/>
-                <w:b/>
-                <w:bCs/>
-                <w:sz w:val="18"/>
-                <w:szCs w:val="18"/>
-              </w:rPr>
-              <w:t xml:space="preserve">[결의 요약]</w:t>
-            </w:r>
-            <w:r>
-              <w:rPr>
-                <w:rFonts w:ascii="맑은 고딕" w:cs="맑은 고딕" w:eastAsia="맑은 고딕" w:hAnsi="맑은 고딕"/>
-                <w:sz w:val="18"/>
-                <w:szCs w:val="18"/>
-              </w:rPr>
-              <w:t xml:space="preserve"> ① 2023. 1. 30. 순정축협 공동협약에 우리 마을 이장이 서명할 때 주민총회 결의나 본인의 위임을 알지 못하고 참여·통지받은 사실이 없음 ② 이장 또는 환경개선위원회가 우리 마을 주민을 대표하여 한 협약 체결·금원 수령과 사용·퇴비사 신축 "반대 의견 없음" 의견 제출 등을 </w:t>
-            </w:r>
-            <w:r>
-              <w:rPr>
-                <w:rFonts w:ascii="맑은 고딕" w:cs="맑은 고딕" w:eastAsia="맑은 고딕" w:hAnsi="맑은 고딕"/>
-                <w:b/>
-                <w:bCs/>
-                <w:sz w:val="18"/>
-                <w:szCs w:val="18"/>
-              </w:rPr>
-              <w:t xml:space="preserve">추인하지 않음</w:t>
-            </w:r>
-            <w:r>
-              <w:rPr>
-                <w:rFonts w:ascii="맑은 고딕" w:cs="맑은 고딕" w:eastAsia="맑은 고딕" w:hAnsi="맑은 고딕"/>
-                <w:sz w:val="18"/>
-                <w:szCs w:val="18"/>
-              </w:rPr>
-              <w:t xml:space="preserve"> ③ 1억 원의 지급·사용 경위를 밝히기 위한 </w:t>
-            </w:r>
-            <w:r>
-              <w:rPr>
-                <w:rFonts w:ascii="맑은 고딕" w:cs="맑은 고딕" w:eastAsia="맑은 고딕" w:hAnsi="맑은 고딕"/>
-                <w:b/>
-                <w:bCs/>
-                <w:sz w:val="18"/>
-                <w:szCs w:val="18"/>
-              </w:rPr>
-              <w:t xml:space="preserve">수사의뢰 진정에 동참</w:t>
-            </w:r>
-            <w:r>
-              <w:rPr>
-                <w:rFonts w:ascii="맑은 고딕" w:cs="맑은 고딕" w:eastAsia="맑은 고딕" w:hAnsi="맑은 고딕"/>
-                <w:sz w:val="18"/>
-                <w:szCs w:val="18"/>
-              </w:rPr>
-              <w:t xml:space="preserve">하고 이 서명부의 수사기관 제출 및 개인정보 수집·이용(1쪽)에 동의함</w:t>
-            </w:r>
-          </w:p>
-        </w:tc>
-      </w:tr>
-    </w:tbl>
-    <w:p>
-      <w:pPr>
-        <w:spacing w:after="80"/>
-      </w:pPr>
-    </w:p>
-    <w:tbl>
-      <w:tblPr>
-        <w:tblW w:type="dxa" w:w="14838"/>
-        <w:tblBorders>
-          <w:top w:val="single" w:color="auto" w:sz="4"/>
-          <w:left w:val="single" w:color="auto" w:sz="4"/>
-          <w:bottom w:val="single" w:color="auto" w:sz="4"/>
-          <w:right w:val="single" w:color="auto" w:sz="4"/>
-          <w:insideH w:val="single" w:color="auto" w:sz="4"/>
-          <w:insideV w:val="single" w:color="auto" w:sz="4"/>
-        </w:tblBorders>
-      </w:tblPr>
-      <w:tblGrid>
-        <w:gridCol w:w="700"/>
-        <w:gridCol w:w="2300"/>
-        <w:gridCol w:w="1900"/>
-        <w:gridCol w:w="3600"/>
-        <w:gridCol w:w="2600"/>
-        <w:gridCol w:w="2200"/>
-        <w:gridCol w:w="1538"/>
-      </w:tblGrid>
-      <w:tr>
-        <w:trPr>
-          <w:tblHeader/>
-          <w:trHeight w:val="420" w:hRule="atLeast"/>
-        </w:trPr>
-        <w:tc>
-          <w:tcPr>
-            <w:tcW w:type="dxa" w:w="700"/>
-            <w:tcBorders>
-              <w:top w:val="single" w:color="000000" w:sz="6"/>
-              <w:left w:val="single" w:color="000000" w:sz="6"/>
-              <w:bottom w:val="single" w:color="000000" w:sz="6"/>
-              <w:right w:val="single" w:color="000000" w:sz="6"/>
-            </w:tcBorders>
-            <w:shd w:fill="D9D9D9" w:color="auto" w:val="clear"/>
-            <w:tcMar>
-              <w:top w:type="dxa" w:w="40"/>
-              <w:left w:type="dxa" w:w="80"/>
-              <w:bottom w:type="dxa" w:w="40"/>
-              <w:right w:type="dxa" w:w="80"/>
-            </w:tcMar>
-            <w:vAlign w:val="center"/>
-          </w:tcPr>
-          <w:p>
-            <w:pPr>
-              <w:jc w:val="center"/>
-            </w:pPr>
-            <w:r>
-              <w:rPr>
-                <w:rFonts w:ascii="맑은 고딕" w:cs="맑은 고딕" w:eastAsia="맑은 고딕" w:hAnsi="맑은 고딕"/>
-                <w:b/>
-                <w:bCs/>
-                <w:sz w:val="19"/>
-                <w:szCs w:val="19"/>
-              </w:rPr>
-              <w:t xml:space="preserve">번호</w:t>
-            </w:r>
-          </w:p>
-        </w:tc>
-        <w:tc>
-          <w:tcPr>
-            <w:tcW w:type="dxa" w:w="2300"/>
-            <w:tcBorders>
-              <w:top w:val="single" w:color="000000" w:sz="6"/>
-              <w:left w:val="single" w:color="000000" w:sz="6"/>
-              <w:bottom w:val="single" w:color="000000" w:sz="6"/>
-              <w:right w:val="single" w:color="000000" w:sz="6"/>
-            </w:tcBorders>
-            <w:shd w:fill="D9D9D9" w:color="auto" w:val="clear"/>
-            <w:tcMar>
-              <w:top w:type="dxa" w:w="40"/>
-              <w:left w:type="dxa" w:w="80"/>
-              <w:bottom w:type="dxa" w:w="40"/>
-              <w:right w:type="dxa" w:w="80"/>
-            </w:tcMar>
-            <w:vAlign w:val="center"/>
-          </w:tcPr>
-          <w:p>
-            <w:pPr>
-              <w:jc w:val="center"/>
-            </w:pPr>
-            <w:r>
-              <w:rPr>
-                <w:rFonts w:ascii="맑은 고딕" w:cs="맑은 고딕" w:eastAsia="맑은 고딕" w:hAnsi="맑은 고딕"/>
-                <w:b/>
-                <w:bCs/>
-                <w:sz w:val="19"/>
-                <w:szCs w:val="19"/>
-              </w:rPr>
-              <w:t xml:space="preserve">성  명</w:t>
-            </w:r>
-          </w:p>
-        </w:tc>
-        <w:tc>
-          <w:tcPr>
-            <w:tcW w:type="dxa" w:w="1900"/>
-            <w:tcBorders>
-              <w:top w:val="single" w:color="000000" w:sz="6"/>
-              <w:left w:val="single" w:color="000000" w:sz="6"/>
-              <w:bottom w:val="single" w:color="000000" w:sz="6"/>
-              <w:right w:val="single" w:color="000000" w:sz="6"/>
-            </w:tcBorders>
-            <w:shd w:fill="D9D9D9" w:color="auto" w:val="clear"/>
-            <w:tcMar>
-              <w:top w:type="dxa" w:w="40"/>
-              <w:left w:type="dxa" w:w="80"/>
-              <w:bottom w:type="dxa" w:w="40"/>
-              <w:right w:type="dxa" w:w="80"/>
-            </w:tcMar>
-            <w:vAlign w:val="center"/>
-          </w:tcPr>
-          <w:p>
-            <w:pPr>
-              <w:jc w:val="center"/>
-            </w:pPr>
-            <w:r>
-              <w:rPr>
-                <w:rFonts w:ascii="맑은 고딕" w:cs="맑은 고딕" w:eastAsia="맑은 고딕" w:hAnsi="맑은 고딕"/>
-                <w:b/>
-                <w:bCs/>
-                <w:sz w:val="19"/>
-                <w:szCs w:val="19"/>
-              </w:rPr>
-              <w:t xml:space="preserve">생년월일</w:t>
-            </w:r>
-          </w:p>
-        </w:tc>
-        <w:tc>
-          <w:tcPr>
-            <w:tcW w:type="dxa" w:w="3600"/>
-            <w:tcBorders>
-              <w:top w:val="single" w:color="000000" w:sz="6"/>
-              <w:left w:val="single" w:color="000000" w:sz="6"/>
-              <w:bottom w:val="single" w:color="000000" w:sz="6"/>
-              <w:right w:val="single" w:color="000000" w:sz="6"/>
-            </w:tcBorders>
-            <w:shd w:fill="D9D9D9" w:color="auto" w:val="clear"/>
-            <w:tcMar>
-              <w:top w:type="dxa" w:w="40"/>
-              <w:left w:type="dxa" w:w="80"/>
-              <w:bottom w:type="dxa" w:w="40"/>
-              <w:right w:type="dxa" w:w="80"/>
-            </w:tcMar>
-            <w:vAlign w:val="center"/>
-          </w:tcPr>
-          <w:p>
-            <w:pPr>
-              <w:jc w:val="center"/>
-            </w:pPr>
-            <w:r>
-              <w:rPr>
-                <w:rFonts w:ascii="맑은 고딕" w:cs="맑은 고딕" w:eastAsia="맑은 고딕" w:hAnsi="맑은 고딕"/>
-                <w:b/>
-                <w:bCs/>
-                <w:sz w:val="19"/>
-                <w:szCs w:val="19"/>
-              </w:rPr>
-              <w:t xml:space="preserve">주소 (마을명·번지)</w:t>
-            </w:r>
-          </w:p>
-        </w:tc>
-        <w:tc>
-          <w:tcPr>
-            <w:tcW w:type="dxa" w:w="2600"/>
-            <w:tcBorders>
-              <w:top w:val="single" w:color="000000" w:sz="6"/>
-              <w:left w:val="single" w:color="000000" w:sz="6"/>
-              <w:bottom w:val="single" w:color="000000" w:sz="6"/>
-              <w:right w:val="single" w:color="000000" w:sz="6"/>
-            </w:tcBorders>
-            <w:shd w:fill="D9D9D9" w:color="auto" w:val="clear"/>
-            <w:tcMar>
-              <w:top w:type="dxa" w:w="40"/>
-              <w:left w:type="dxa" w:w="80"/>
-              <w:bottom w:type="dxa" w:w="40"/>
-              <w:right w:type="dxa" w:w="80"/>
-            </w:tcMar>
-            <w:vAlign w:val="center"/>
-          </w:tcPr>
-          <w:p>
-            <w:pPr>
-              <w:jc w:val="center"/>
-            </w:pPr>
-            <w:r>
-              <w:rPr>
-                <w:rFonts w:ascii="맑은 고딕" w:cs="맑은 고딕" w:eastAsia="맑은 고딕" w:hAnsi="맑은 고딕"/>
-                <w:b/>
-                <w:bCs/>
-                <w:sz w:val="19"/>
-                <w:szCs w:val="19"/>
-              </w:rPr>
-              <w:t xml:space="preserve">연락처</w:t>
-            </w:r>
-          </w:p>
-        </w:tc>
-        <w:tc>
-          <w:tcPr>
-            <w:tcW w:type="dxa" w:w="2200"/>
-            <w:tcBorders>
-              <w:top w:val="single" w:color="000000" w:sz="6"/>
-              <w:left w:val="single" w:color="000000" w:sz="6"/>
-              <w:bottom w:val="single" w:color="000000" w:sz="6"/>
-              <w:right w:val="single" w:color="000000" w:sz="6"/>
-            </w:tcBorders>
-            <w:shd w:fill="D9D9D9" w:color="auto" w:val="clear"/>
-            <w:tcMar>
-              <w:top w:type="dxa" w:w="40"/>
-              <w:left w:type="dxa" w:w="80"/>
-              <w:bottom w:type="dxa" w:w="40"/>
-              <w:right w:type="dxa" w:w="80"/>
-            </w:tcMar>
-            <w:vAlign w:val="center"/>
-          </w:tcPr>
-          <w:p>
-            <w:pPr>
-              <w:jc w:val="center"/>
-            </w:pPr>
-            <w:r>
-              <w:rPr>
-                <w:rFonts w:ascii="맑은 고딕" w:cs="맑은 고딕" w:eastAsia="맑은 고딕" w:hAnsi="맑은 고딕"/>
-                <w:b/>
-                <w:bCs/>
-                <w:sz w:val="19"/>
-                <w:szCs w:val="19"/>
-              </w:rPr>
-              <w:t xml:space="preserve">서  명</w:t>
-            </w:r>
-          </w:p>
-        </w:tc>
-        <w:tc>
-          <w:tcPr>
-            <w:tcW w:type="dxa" w:w="1538"/>
-            <w:tcBorders>
-              <w:top w:val="single" w:color="000000" w:sz="6"/>
-              <w:left w:val="single" w:color="000000" w:sz="6"/>
-              <w:bottom w:val="single" w:color="000000" w:sz="6"/>
-              <w:right w:val="single" w:color="000000" w:sz="6"/>
-            </w:tcBorders>
-            <w:shd w:fill="D9D9D9" w:color="auto" w:val="clear"/>
-            <w:tcMar>
-              <w:top w:type="dxa" w:w="40"/>
-              <w:left w:type="dxa" w:w="80"/>
-              <w:bottom w:type="dxa" w:w="40"/>
-              <w:right w:type="dxa" w:w="80"/>
-            </w:tcMar>
-            <w:vAlign w:val="center"/>
-          </w:tcPr>
-          <w:p>
-            <w:pPr>
-              <w:jc w:val="center"/>
-            </w:pPr>
-            <w:r>
-              <w:rPr>
-                <w:rFonts w:ascii="맑은 고딕" w:cs="맑은 고딕" w:eastAsia="맑은 고딕" w:hAnsi="맑은 고딕"/>
-                <w:b/>
-                <w:bCs/>
-                <w:sz w:val="19"/>
-                <w:szCs w:val="19"/>
-              </w:rPr>
-              <w:t xml:space="preserve">비고</w:t>
-            </w:r>
-          </w:p>
-        </w:tc>
-      </w:tr>
-      <w:tr>
-        <w:trPr>
-          <w:cantSplit/>
-          <w:trHeight w:val="560" w:hRule="atLeast"/>
-        </w:trPr>
-        <w:tc>
-          <w:tcPr>
-            <w:tcW w:type="dxa" w:w="700"/>
-            <w:tcBorders>
-              <w:top w:val="single" w:color="000000" w:sz="6"/>
-              <w:left w:val="single" w:color="000000" w:sz="6"/>
-              <w:bottom w:val="single" w:color="000000" w:sz="6"/>
-              <w:right w:val="single" w:color="000000" w:sz="6"/>
-            </w:tcBorders>
-            <w:tcMar>
-              <w:top w:type="dxa" w:w="40"/>
-              <w:left w:type="dxa" w:w="80"/>
-              <w:bottom w:type="dxa" w:w="40"/>
-              <w:right w:type="dxa" w:w="80"/>
-            </w:tcMar>
-            <w:vAlign w:val="center"/>
-          </w:tcPr>
-          <w:p>
-            <w:pPr>
-              <w:jc w:val="center"/>
-            </w:pPr>
-            <w:r>
-              <w:rPr>
-                <w:rFonts w:ascii="맑은 고딕" w:cs="맑은 고딕" w:eastAsia="맑은 고딕" w:hAnsi="맑은 고딕"/>
-                <w:b w:val="false"/>
-                <w:bCs w:val="false"/>
-                <w:sz w:val="18"/>
-                <w:szCs w:val="18"/>
-              </w:rPr>
-              <w:t xml:space="preserve">1</w:t>
-            </w:r>
-          </w:p>
-        </w:tc>
-        <w:tc>
-          <w:tcPr>
-            <w:tcW w:type="dxa" w:w="2300"/>
-            <w:tcBorders>
-              <w:top w:val="single" w:color="000000" w:sz="6"/>
-              <w:left w:val="single" w:color="000000" w:sz="6"/>
-              <w:bottom w:val="single" w:color="000000" w:sz="6"/>
-              <w:right w:val="single" w:color="000000" w:sz="6"/>
-            </w:tcBorders>
-            <w:tcMar>
-              <w:top w:type="dxa" w:w="40"/>
-              <w:left w:type="dxa" w:w="80"/>
-              <w:bottom w:type="dxa" w:w="40"/>
-              <w:right w:type="dxa" w:w="80"/>
-            </w:tcMar>
-            <w:vAlign w:val="center"/>
-          </w:tcPr>
-          <w:p>
-            <w:pPr>
-              <w:jc w:val="center"/>
-            </w:pPr>
-          </w:p>
-        </w:tc>
-        <w:tc>
-          <w:tcPr>
-            <w:tcW w:type="dxa" w:w="1900"/>
-            <w:tcBorders>
-              <w:top w:val="single" w:color="000000" w:sz="6"/>
-              <w:left w:val="single" w:color="000000" w:sz="6"/>
-              <w:bottom w:val="single" w:color="000000" w:sz="6"/>
-              <w:right w:val="single" w:color="000000" w:sz="6"/>
-            </w:tcBorders>
-            <w:tcMar>
-              <w:top w:type="dxa" w:w="40"/>
-              <w:left w:type="dxa" w:w="80"/>
-              <w:bottom w:type="dxa" w:w="40"/>
-              <w:right w:type="dxa" w:w="80"/>
-            </w:tcMar>
-            <w:vAlign w:val="center"/>
-          </w:tcPr>
-          <w:p>
-            <w:pPr>
-              <w:jc w:val="center"/>
-            </w:pPr>
-          </w:p>
-        </w:tc>
-        <w:tc>
-          <w:tcPr>
-            <w:tcW w:type="dxa" w:w="3600"/>
-            <w:tcBorders>
-              <w:top w:val="single" w:color="000000" w:sz="6"/>
-              <w:left w:val="single" w:color="000000" w:sz="6"/>
-              <w:bottom w:val="single" w:color="000000" w:sz="6"/>
-              <w:right w:val="single" w:color="000000" w:sz="6"/>
-            </w:tcBorders>
-            <w:tcMar>
-              <w:top w:type="dxa" w:w="40"/>
-              <w:left w:type="dxa" w:w="80"/>
-              <w:bottom w:type="dxa" w:w="40"/>
-              <w:right w:type="dxa" w:w="80"/>
-            </w:tcMar>
-            <w:vAlign w:val="center"/>
-          </w:tcPr>
-          <w:p>
-            <w:pPr>
-              <w:jc w:val="center"/>
-            </w:pPr>
-          </w:p>
-        </w:tc>
-        <w:tc>
-          <w:tcPr>
-            <w:tcW w:type="dxa" w:w="2600"/>
-            <w:tcBorders>
-              <w:top w:val="single" w:color="000000" w:sz="6"/>
-              <w:left w:val="single" w:color="000000" w:sz="6"/>
-              <w:bottom w:val="single" w:color="000000" w:sz="6"/>
-              <w:right w:val="single" w:color="000000" w:sz="6"/>
-            </w:tcBorders>
-            <w:tcMar>
-              <w:top w:type="dxa" w:w="40"/>
-              <w:left w:type="dxa" w:w="80"/>
-              <w:bottom w:type="dxa" w:w="40"/>
-              <w:right w:type="dxa" w:w="80"/>
-            </w:tcMar>
-            <w:vAlign w:val="center"/>
-          </w:tcPr>
-          <w:p>
-            <w:pPr>
-              <w:jc w:val="center"/>
-            </w:pPr>
-          </w:p>
-        </w:tc>
-        <w:tc>
-          <w:tcPr>
-            <w:tcW w:type="dxa" w:w="2200"/>
-            <w:tcBorders>
-              <w:top w:val="single" w:color="000000" w:sz="6"/>
-              <w:left w:val="single" w:color="000000" w:sz="6"/>
-              <w:bottom w:val="single" w:color="000000" w:sz="6"/>
-              <w:right w:val="single" w:color="000000" w:sz="6"/>
-            </w:tcBorders>
-            <w:tcMar>
-              <w:top w:type="dxa" w:w="40"/>
-              <w:left w:type="dxa" w:w="80"/>
-              <w:bottom w:type="dxa" w:w="40"/>
-              <w:right w:type="dxa" w:w="80"/>
-            </w:tcMar>
-            <w:vAlign w:val="center"/>
-          </w:tcPr>
-          <w:p>
-            <w:pPr>
-              <w:jc w:val="center"/>
-            </w:pPr>
-          </w:p>
-        </w:tc>
-        <w:tc>
-          <w:tcPr>
-            <w:tcW w:type="dxa" w:w="1538"/>
-            <w:tcBorders>
-              <w:top w:val="single" w:color="000000" w:sz="6"/>
-              <w:left w:val="single" w:color="000000" w:sz="6"/>
-              <w:bottom w:val="single" w:color="000000" w:sz="6"/>
-              <w:right w:val="single" w:color="000000" w:sz="6"/>
-            </w:tcBorders>
-            <w:tcMar>
-              <w:top w:type="dxa" w:w="40"/>
-              <w:left w:type="dxa" w:w="80"/>
-              <w:bottom w:type="dxa" w:w="40"/>
-              <w:right w:type="dxa" w:w="80"/>
-            </w:tcMar>
-            <w:vAlign w:val="center"/>
-          </w:tcPr>
-          <w:p>
-            <w:pPr>
-              <w:jc w:val="center"/>
-            </w:pPr>
-          </w:p>
-        </w:tc>
-      </w:tr>
-      <w:tr>
-        <w:trPr>
-          <w:cantSplit/>
-          <w:trHeight w:val="560" w:hRule="atLeast"/>
-        </w:trPr>
-        <w:tc>
-          <w:tcPr>
-            <w:tcW w:type="dxa" w:w="700"/>
-            <w:tcBorders>
-              <w:top w:val="single" w:color="000000" w:sz="6"/>
-              <w:left w:val="single" w:color="000000" w:sz="6"/>
-              <w:bottom w:val="single" w:color="000000" w:sz="6"/>
-              <w:right w:val="single" w:color="000000" w:sz="6"/>
-            </w:tcBorders>
-            <w:tcMar>
-              <w:top w:type="dxa" w:w="40"/>
-              <w:left w:type="dxa" w:w="80"/>
-              <w:bottom w:type="dxa" w:w="40"/>
-              <w:right w:type="dxa" w:w="80"/>
-            </w:tcMar>
-            <w:vAlign w:val="center"/>
-          </w:tcPr>
-          <w:p>
-            <w:pPr>
-              <w:jc w:val="center"/>
-            </w:pPr>
-            <w:r>
-              <w:rPr>
-                <w:rFonts w:ascii="맑은 고딕" w:cs="맑은 고딕" w:eastAsia="맑은 고딕" w:hAnsi="맑은 고딕"/>
-                <w:b w:val="false"/>
-                <w:bCs w:val="false"/>
-                <w:sz w:val="18"/>
-                <w:szCs w:val="18"/>
-              </w:rPr>
-              <w:t xml:space="preserve">2</w:t>
-            </w:r>
-          </w:p>
-        </w:tc>
-        <w:tc>
-          <w:tcPr>
-            <w:tcW w:type="dxa" w:w="2300"/>
-            <w:tcBorders>
-              <w:top w:val="single" w:color="000000" w:sz="6"/>
-              <w:left w:val="single" w:color="000000" w:sz="6"/>
-              <w:bottom w:val="single" w:color="000000" w:sz="6"/>
-              <w:right w:val="single" w:color="000000" w:sz="6"/>
-            </w:tcBorders>
-            <w:tcMar>
-              <w:top w:type="dxa" w:w="40"/>
-              <w:left w:type="dxa" w:w="80"/>
-              <w:bottom w:type="dxa" w:w="40"/>
-              <w:right w:type="dxa" w:w="80"/>
-            </w:tcMar>
-            <w:vAlign w:val="center"/>
-          </w:tcPr>
-          <w:p>
-            <w:pPr>
-              <w:jc w:val="center"/>
-            </w:pPr>
-          </w:p>
-        </w:tc>
-        <w:tc>
-          <w:tcPr>
-            <w:tcW w:type="dxa" w:w="1900"/>
-            <w:tcBorders>
-              <w:top w:val="single" w:color="000000" w:sz="6"/>
-              <w:left w:val="single" w:color="000000" w:sz="6"/>
-              <w:bottom w:val="single" w:color="000000" w:sz="6"/>
-              <w:right w:val="single" w:color="000000" w:sz="6"/>
-            </w:tcBorders>
-            <w:tcMar>
-              <w:top w:type="dxa" w:w="40"/>
-              <w:left w:type="dxa" w:w="80"/>
-              <w:bottom w:type="dxa" w:w="40"/>
-              <w:right w:type="dxa" w:w="80"/>
-            </w:tcMar>
-            <w:vAlign w:val="center"/>
-          </w:tcPr>
-          <w:p>
-            <w:pPr>
-              <w:jc w:val="center"/>
-            </w:pPr>
-          </w:p>
-        </w:tc>
-        <w:tc>
-          <w:tcPr>
-            <w:tcW w:type="dxa" w:w="3600"/>
-            <w:tcBorders>
-              <w:top w:val="single" w:color="000000" w:sz="6"/>
-              <w:left w:val="single" w:color="000000" w:sz="6"/>
-              <w:bottom w:val="single" w:color="000000" w:sz="6"/>
-              <w:right w:val="single" w:color="000000" w:sz="6"/>
-            </w:tcBorders>
-            <w:tcMar>
-              <w:top w:type="dxa" w:w="40"/>
-              <w:left w:type="dxa" w:w="80"/>
-              <w:bottom w:type="dxa" w:w="40"/>
-              <w:right w:type="dxa" w:w="80"/>
-            </w:tcMar>
-            <w:vAlign w:val="center"/>
-          </w:tcPr>
-          <w:p>
-            <w:pPr>
-              <w:jc w:val="center"/>
-            </w:pPr>
-          </w:p>
-        </w:tc>
-        <w:tc>
-          <w:tcPr>
-            <w:tcW w:type="dxa" w:w="2600"/>
-            <w:tcBorders>
-              <w:top w:val="single" w:color="000000" w:sz="6"/>
-              <w:left w:val="single" w:color="000000" w:sz="6"/>
-              <w:bottom w:val="single" w:color="000000" w:sz="6"/>
-              <w:right w:val="single" w:color="000000" w:sz="6"/>
-            </w:tcBorders>
-            <w:tcMar>
-              <w:top w:type="dxa" w:w="40"/>
-              <w:left w:type="dxa" w:w="80"/>
-              <w:bottom w:type="dxa" w:w="40"/>
-              <w:right w:type="dxa" w:w="80"/>
-            </w:tcMar>
-            <w:vAlign w:val="center"/>
-          </w:tcPr>
-          <w:p>
-            <w:pPr>
-              <w:jc w:val="center"/>
-            </w:pPr>
-          </w:p>
-        </w:tc>
-        <w:tc>
-          <w:tcPr>
-            <w:tcW w:type="dxa" w:w="2200"/>
-            <w:tcBorders>
-              <w:top w:val="single" w:color="000000" w:sz="6"/>
-              <w:left w:val="single" w:color="000000" w:sz="6"/>
-              <w:bottom w:val="single" w:color="000000" w:sz="6"/>
-              <w:right w:val="single" w:color="000000" w:sz="6"/>
-            </w:tcBorders>
-            <w:tcMar>
-              <w:top w:type="dxa" w:w="40"/>
-              <w:left w:type="dxa" w:w="80"/>
-              <w:bottom w:type="dxa" w:w="40"/>
-              <w:right w:type="dxa" w:w="80"/>
-            </w:tcMar>
-            <w:vAlign w:val="center"/>
-          </w:tcPr>
-          <w:p>
-            <w:pPr>
-              <w:jc w:val="center"/>
-            </w:pPr>
-          </w:p>
-        </w:tc>
-        <w:tc>
-          <w:tcPr>
-            <w:tcW w:type="dxa" w:w="1538"/>
-            <w:tcBorders>
-              <w:top w:val="single" w:color="000000" w:sz="6"/>
-              <w:left w:val="single" w:color="000000" w:sz="6"/>
-              <w:bottom w:val="single" w:color="000000" w:sz="6"/>
-              <w:right w:val="single" w:color="000000" w:sz="6"/>
-            </w:tcBorders>
-            <w:tcMar>
-              <w:top w:type="dxa" w:w="40"/>
-              <w:left w:type="dxa" w:w="80"/>
-              <w:bottom w:type="dxa" w:w="40"/>
-              <w:right w:type="dxa" w:w="80"/>
-            </w:tcMar>
-            <w:vAlign w:val="center"/>
-          </w:tcPr>
-          <w:p>
-            <w:pPr>
-              <w:jc w:val="center"/>
-            </w:pPr>
-          </w:p>
-        </w:tc>
-      </w:tr>
-      <w:tr>
-        <w:trPr>
-          <w:cantSplit/>
-          <w:trHeight w:val="560" w:hRule="atLeast"/>
-        </w:trPr>
-        <w:tc>
-          <w:tcPr>
-            <w:tcW w:type="dxa" w:w="700"/>
-            <w:tcBorders>
-              <w:top w:val="single" w:color="000000" w:sz="6"/>
-              <w:left w:val="single" w:color="000000" w:sz="6"/>
-              <w:bottom w:val="single" w:color="000000" w:sz="6"/>
-              <w:right w:val="single" w:color="000000" w:sz="6"/>
-            </w:tcBorders>
-            <w:tcMar>
-              <w:top w:type="dxa" w:w="40"/>
-              <w:left w:type="dxa" w:w="80"/>
-              <w:bottom w:type="dxa" w:w="40"/>
-              <w:right w:type="dxa" w:w="80"/>
-            </w:tcMar>
-            <w:vAlign w:val="center"/>
-          </w:tcPr>
-          <w:p>
-            <w:pPr>
-              <w:jc w:val="center"/>
-            </w:pPr>
-            <w:r>
-              <w:rPr>
-                <w:rFonts w:ascii="맑은 고딕" w:cs="맑은 고딕" w:eastAsia="맑은 고딕" w:hAnsi="맑은 고딕"/>
-                <w:b w:val="false"/>
-                <w:bCs w:val="false"/>
-                <w:sz w:val="18"/>
-                <w:szCs w:val="18"/>
-              </w:rPr>
-              <w:t xml:space="preserve">3</w:t>
-            </w:r>
-          </w:p>
-        </w:tc>
-        <w:tc>
-          <w:tcPr>
-            <w:tcW w:type="dxa" w:w="2300"/>
-            <w:tcBorders>
-              <w:top w:val="single" w:color="000000" w:sz="6"/>
-              <w:left w:val="single" w:color="000000" w:sz="6"/>
-              <w:bottom w:val="single" w:color="000000" w:sz="6"/>
-              <w:right w:val="single" w:color="000000" w:sz="6"/>
-            </w:tcBorders>
-            <w:tcMar>
-              <w:top w:type="dxa" w:w="40"/>
-              <w:left w:type="dxa" w:w="80"/>
-              <w:bottom w:type="dxa" w:w="40"/>
-              <w:right w:type="dxa" w:w="80"/>
-            </w:tcMar>
-            <w:vAlign w:val="center"/>
-          </w:tcPr>
-          <w:p>
-            <w:pPr>
-              <w:jc w:val="center"/>
-            </w:pPr>
-          </w:p>
-        </w:tc>
-        <w:tc>
-          <w:tcPr>
-            <w:tcW w:type="dxa" w:w="1900"/>
-            <w:tcBorders>
-              <w:top w:val="single" w:color="000000" w:sz="6"/>
-              <w:left w:val="single" w:color="000000" w:sz="6"/>
-              <w:bottom w:val="single" w:color="000000" w:sz="6"/>
-              <w:right w:val="single" w:color="000000" w:sz="6"/>
-            </w:tcBorders>
-            <w:tcMar>
-              <w:top w:type="dxa" w:w="40"/>
-              <w:left w:type="dxa" w:w="80"/>
-              <w:bottom w:type="dxa" w:w="40"/>
-              <w:right w:type="dxa" w:w="80"/>
-            </w:tcMar>
-            <w:vAlign w:val="center"/>
-          </w:tcPr>
-          <w:p>
-            <w:pPr>
-              <w:jc w:val="center"/>
-            </w:pPr>
-          </w:p>
-        </w:tc>
-        <w:tc>
-          <w:tcPr>
-            <w:tcW w:type="dxa" w:w="3600"/>
-            <w:tcBorders>
-              <w:top w:val="single" w:color="000000" w:sz="6"/>
-              <w:left w:val="single" w:color="000000" w:sz="6"/>
-              <w:bottom w:val="single" w:color="000000" w:sz="6"/>
-              <w:right w:val="single" w:color="000000" w:sz="6"/>
-            </w:tcBorders>
-            <w:tcMar>
-              <w:top w:type="dxa" w:w="40"/>
-              <w:left w:type="dxa" w:w="80"/>
-              <w:bottom w:type="dxa" w:w="40"/>
-              <w:right w:type="dxa" w:w="80"/>
-            </w:tcMar>
-            <w:vAlign w:val="center"/>
-          </w:tcPr>
-          <w:p>
-            <w:pPr>
-              <w:jc w:val="center"/>
-            </w:pPr>
-          </w:p>
-        </w:tc>
-        <w:tc>
-          <w:tcPr>
-            <w:tcW w:type="dxa" w:w="2600"/>
-            <w:tcBorders>
-              <w:top w:val="single" w:color="000000" w:sz="6"/>
-              <w:left w:val="single" w:color="000000" w:sz="6"/>
-              <w:bottom w:val="single" w:color="000000" w:sz="6"/>
-              <w:right w:val="single" w:color="000000" w:sz="6"/>
-            </w:tcBorders>
-            <w:tcMar>
-              <w:top w:type="dxa" w:w="40"/>
-              <w:left w:type="dxa" w:w="80"/>
-              <w:bottom w:type="dxa" w:w="40"/>
-              <w:right w:type="dxa" w:w="80"/>
-            </w:tcMar>
-            <w:vAlign w:val="center"/>
-          </w:tcPr>
-          <w:p>
-            <w:pPr>
-              <w:jc w:val="center"/>
-            </w:pPr>
-          </w:p>
-        </w:tc>
-        <w:tc>
-          <w:tcPr>
-            <w:tcW w:type="dxa" w:w="2200"/>
-            <w:tcBorders>
-              <w:top w:val="single" w:color="000000" w:sz="6"/>
-              <w:left w:val="single" w:color="000000" w:sz="6"/>
-              <w:bottom w:val="single" w:color="000000" w:sz="6"/>
-              <w:right w:val="single" w:color="000000" w:sz="6"/>
-            </w:tcBorders>
-            <w:tcMar>
-              <w:top w:type="dxa" w:w="40"/>
-              <w:left w:type="dxa" w:w="80"/>
-              <w:bottom w:type="dxa" w:w="40"/>
-              <w:right w:type="dxa" w:w="80"/>
-            </w:tcMar>
-            <w:vAlign w:val="center"/>
-          </w:tcPr>
-          <w:p>
-            <w:pPr>
-              <w:jc w:val="center"/>
-            </w:pPr>
-          </w:p>
-        </w:tc>
-        <w:tc>
-          <w:tcPr>
-            <w:tcW w:type="dxa" w:w="1538"/>
-            <w:tcBorders>
-              <w:top w:val="single" w:color="000000" w:sz="6"/>
-              <w:left w:val="single" w:color="000000" w:sz="6"/>
-              <w:bottom w:val="single" w:color="000000" w:sz="6"/>
-              <w:right w:val="single" w:color="000000" w:sz="6"/>
-            </w:tcBorders>
-            <w:tcMar>
-              <w:top w:type="dxa" w:w="40"/>
-              <w:left w:type="dxa" w:w="80"/>
-              <w:bottom w:type="dxa" w:w="40"/>
-              <w:right w:type="dxa" w:w="80"/>
-            </w:tcMar>
-            <w:vAlign w:val="center"/>
-          </w:tcPr>
-          <w:p>
-            <w:pPr>
-              <w:jc w:val="center"/>
-            </w:pPr>
-          </w:p>
-        </w:tc>
-      </w:tr>
-      <w:tr>
-        <w:trPr>
-          <w:cantSplit/>
-          <w:trHeight w:val="560" w:hRule="atLeast"/>
-        </w:trPr>
-        <w:tc>
-          <w:tcPr>
-            <w:tcW w:type="dxa" w:w="700"/>
-            <w:tcBorders>
-              <w:top w:val="single" w:color="000000" w:sz="6"/>
-              <w:left w:val="single" w:color="000000" w:sz="6"/>
-              <w:bottom w:val="single" w:color="000000" w:sz="6"/>
-              <w:right w:val="single" w:color="000000" w:sz="6"/>
-            </w:tcBorders>
-            <w:tcMar>
-              <w:top w:type="dxa" w:w="40"/>
-              <w:left w:type="dxa" w:w="80"/>
-              <w:bottom w:type="dxa" w:w="40"/>
-              <w:right w:type="dxa" w:w="80"/>
-            </w:tcMar>
-            <w:vAlign w:val="center"/>
-          </w:tcPr>
-          <w:p>
-            <w:pPr>
-              <w:jc w:val="center"/>
-            </w:pPr>
-            <w:r>
-              <w:rPr>
-                <w:rFonts w:ascii="맑은 고딕" w:cs="맑은 고딕" w:eastAsia="맑은 고딕" w:hAnsi="맑은 고딕"/>
-                <w:b w:val="false"/>
-                <w:bCs w:val="false"/>
-                <w:sz w:val="18"/>
-                <w:szCs w:val="18"/>
-              </w:rPr>
-              <w:t xml:space="preserve">4</w:t>
-            </w:r>
-          </w:p>
-        </w:tc>
-        <w:tc>
-          <w:tcPr>
-            <w:tcW w:type="dxa" w:w="2300"/>
-            <w:tcBorders>
-              <w:top w:val="single" w:color="000000" w:sz="6"/>
-              <w:left w:val="single" w:color="000000" w:sz="6"/>
-              <w:bottom w:val="single" w:color="000000" w:sz="6"/>
-              <w:right w:val="single" w:color="000000" w:sz="6"/>
-            </w:tcBorders>
-            <w:tcMar>
-              <w:top w:type="dxa" w:w="40"/>
-              <w:left w:type="dxa" w:w="80"/>
-              <w:bottom w:type="dxa" w:w="40"/>
-              <w:right w:type="dxa" w:w="80"/>
-            </w:tcMar>
-            <w:vAlign w:val="center"/>
-          </w:tcPr>
-          <w:p>
-            <w:pPr>
-              <w:jc w:val="center"/>
-            </w:pPr>
-          </w:p>
-        </w:tc>
-        <w:tc>
-          <w:tcPr>
-            <w:tcW w:type="dxa" w:w="1900"/>
-            <w:tcBorders>
-              <w:top w:val="single" w:color="000000" w:sz="6"/>
-              <w:left w:val="single" w:color="000000" w:sz="6"/>
-              <w:bottom w:val="single" w:color="000000" w:sz="6"/>
-              <w:right w:val="single" w:color="000000" w:sz="6"/>
-            </w:tcBorders>
-            <w:tcMar>
-              <w:top w:type="dxa" w:w="40"/>
-              <w:left w:type="dxa" w:w="80"/>
-              <w:bottom w:type="dxa" w:w="40"/>
-              <w:right w:type="dxa" w:w="80"/>
-            </w:tcMar>
-            <w:vAlign w:val="center"/>
-          </w:tcPr>
-          <w:p>
-            <w:pPr>
-              <w:jc w:val="center"/>
-            </w:pPr>
-          </w:p>
-        </w:tc>
-        <w:tc>
-          <w:tcPr>
-            <w:tcW w:type="dxa" w:w="3600"/>
-            <w:tcBorders>
-              <w:top w:val="single" w:color="000000" w:sz="6"/>
-              <w:left w:val="single" w:color="000000" w:sz="6"/>
-              <w:bottom w:val="single" w:color="000000" w:sz="6"/>
-              <w:right w:val="single" w:color="000000" w:sz="6"/>
-            </w:tcBorders>
-            <w:tcMar>
-              <w:top w:type="dxa" w:w="40"/>
-              <w:left w:type="dxa" w:w="80"/>
-              <w:bottom w:type="dxa" w:w="40"/>
-              <w:right w:type="dxa" w:w="80"/>
-            </w:tcMar>
-            <w:vAlign w:val="center"/>
-          </w:tcPr>
-          <w:p>
-            <w:pPr>
-              <w:jc w:val="center"/>
-            </w:pPr>
-          </w:p>
-        </w:tc>
-        <w:tc>
-          <w:tcPr>
-            <w:tcW w:type="dxa" w:w="2600"/>
-            <w:tcBorders>
-              <w:top w:val="single" w:color="000000" w:sz="6"/>
-              <w:left w:val="single" w:color="000000" w:sz="6"/>
-              <w:bottom w:val="single" w:color="000000" w:sz="6"/>
-              <w:right w:val="single" w:color="000000" w:sz="6"/>
-            </w:tcBorders>
-            <w:tcMar>
-              <w:top w:type="dxa" w:w="40"/>
-              <w:left w:type="dxa" w:w="80"/>
-              <w:bottom w:type="dxa" w:w="40"/>
-              <w:right w:type="dxa" w:w="80"/>
-            </w:tcMar>
-            <w:vAlign w:val="center"/>
-          </w:tcPr>
-          <w:p>
-            <w:pPr>
-              <w:jc w:val="center"/>
-            </w:pPr>
-          </w:p>
-        </w:tc>
-        <w:tc>
-          <w:tcPr>
-            <w:tcW w:type="dxa" w:w="2200"/>
-            <w:tcBorders>
-              <w:top w:val="single" w:color="000000" w:sz="6"/>
-              <w:left w:val="single" w:color="000000" w:sz="6"/>
-              <w:bottom w:val="single" w:color="000000" w:sz="6"/>
-              <w:right w:val="single" w:color="000000" w:sz="6"/>
-            </w:tcBorders>
-            <w:tcMar>
-              <w:top w:type="dxa" w:w="40"/>
-              <w:left w:type="dxa" w:w="80"/>
-              <w:bottom w:type="dxa" w:w="40"/>
-              <w:right w:type="dxa" w:w="80"/>
-            </w:tcMar>
-            <w:vAlign w:val="center"/>
-          </w:tcPr>
-          <w:p>
-            <w:pPr>
-              <w:jc w:val="center"/>
-            </w:pPr>
-          </w:p>
-        </w:tc>
-        <w:tc>
-          <w:tcPr>
-            <w:tcW w:type="dxa" w:w="1538"/>
-            <w:tcBorders>
-              <w:top w:val="single" w:color="000000" w:sz="6"/>
-              <w:left w:val="single" w:color="000000" w:sz="6"/>
-              <w:bottom w:val="single" w:color="000000" w:sz="6"/>
-              <w:right w:val="single" w:color="000000" w:sz="6"/>
-            </w:tcBorders>
-            <w:tcMar>
-              <w:top w:type="dxa" w:w="40"/>
-              <w:left w:type="dxa" w:w="80"/>
-              <w:bottom w:type="dxa" w:w="40"/>
-              <w:right w:type="dxa" w:w="80"/>
-            </w:tcMar>
-            <w:vAlign w:val="center"/>
-          </w:tcPr>
-          <w:p>
-            <w:pPr>
-              <w:jc w:val="center"/>
-            </w:pPr>
-          </w:p>
-        </w:tc>
-      </w:tr>
-      <w:tr>
-        <w:trPr>
-          <w:cantSplit/>
-          <w:trHeight w:val="560" w:hRule="atLeast"/>
-        </w:trPr>
-        <w:tc>
-          <w:tcPr>
-            <w:tcW w:type="dxa" w:w="700"/>
-            <w:tcBorders>
-              <w:top w:val="single" w:color="000000" w:sz="6"/>
-              <w:left w:val="single" w:color="000000" w:sz="6"/>
-              <w:bottom w:val="single" w:color="000000" w:sz="6"/>
-              <w:right w:val="single" w:color="000000" w:sz="6"/>
-            </w:tcBorders>
-            <w:tcMar>
-              <w:top w:type="dxa" w:w="40"/>
-              <w:left w:type="dxa" w:w="80"/>
-              <w:bottom w:type="dxa" w:w="40"/>
-              <w:right w:type="dxa" w:w="80"/>
-            </w:tcMar>
-            <w:vAlign w:val="center"/>
-          </w:tcPr>
-          <w:p>
-            <w:pPr>
-              <w:jc w:val="center"/>
-            </w:pPr>
-            <w:r>
-              <w:rPr>
-                <w:rFonts w:ascii="맑은 고딕" w:cs="맑은 고딕" w:eastAsia="맑은 고딕" w:hAnsi="맑은 고딕"/>
-                <w:b w:val="false"/>
-                <w:bCs w:val="false"/>
-                <w:sz w:val="18"/>
-                <w:szCs w:val="18"/>
-              </w:rPr>
-              <w:t xml:space="preserve">5</w:t>
-            </w:r>
-          </w:p>
-        </w:tc>
-        <w:tc>
-          <w:tcPr>
-            <w:tcW w:type="dxa" w:w="2300"/>
-            <w:tcBorders>
-              <w:top w:val="single" w:color="000000" w:sz="6"/>
-              <w:left w:val="single" w:color="000000" w:sz="6"/>
-              <w:bottom w:val="single" w:color="000000" w:sz="6"/>
-              <w:right w:val="single" w:color="000000" w:sz="6"/>
-            </w:tcBorders>
-            <w:tcMar>
-              <w:top w:type="dxa" w:w="40"/>
-              <w:left w:type="dxa" w:w="80"/>
-              <w:bottom w:type="dxa" w:w="40"/>
-              <w:right w:type="dxa" w:w="80"/>
-            </w:tcMar>
-            <w:vAlign w:val="center"/>
-          </w:tcPr>
-          <w:p>
-            <w:pPr>
-              <w:jc w:val="center"/>
-            </w:pPr>
-          </w:p>
-        </w:tc>
-        <w:tc>
-          <w:tcPr>
-            <w:tcW w:type="dxa" w:w="1900"/>
-            <w:tcBorders>
-              <w:top w:val="single" w:color="000000" w:sz="6"/>
-              <w:left w:val="single" w:color="000000" w:sz="6"/>
-              <w:bottom w:val="single" w:color="000000" w:sz="6"/>
-              <w:right w:val="single" w:color="000000" w:sz="6"/>
-            </w:tcBorders>
-            <w:tcMar>
-              <w:top w:type="dxa" w:w="40"/>
-              <w:left w:type="dxa" w:w="80"/>
-              <w:bottom w:type="dxa" w:w="40"/>
-              <w:right w:type="dxa" w:w="80"/>
-            </w:tcMar>
-            <w:vAlign w:val="center"/>
-          </w:tcPr>
-          <w:p>
-            <w:pPr>
-              <w:jc w:val="center"/>
-            </w:pPr>
-          </w:p>
-        </w:tc>
-        <w:tc>
-          <w:tcPr>
-            <w:tcW w:type="dxa" w:w="3600"/>
-            <w:tcBorders>
-              <w:top w:val="single" w:color="000000" w:sz="6"/>
-              <w:left w:val="single" w:color="000000" w:sz="6"/>
-              <w:bottom w:val="single" w:color="000000" w:sz="6"/>
-              <w:right w:val="single" w:color="000000" w:sz="6"/>
-            </w:tcBorders>
-            <w:tcMar>
-              <w:top w:type="dxa" w:w="40"/>
-              <w:left w:type="dxa" w:w="80"/>
-              <w:bottom w:type="dxa" w:w="40"/>
-              <w:right w:type="dxa" w:w="80"/>
-            </w:tcMar>
-            <w:vAlign w:val="center"/>
-          </w:tcPr>
-          <w:p>
-            <w:pPr>
-              <w:jc w:val="center"/>
-            </w:pPr>
-          </w:p>
-        </w:tc>
-        <w:tc>
-          <w:tcPr>
-            <w:tcW w:type="dxa" w:w="2600"/>
-            <w:tcBorders>
-              <w:top w:val="single" w:color="000000" w:sz="6"/>
-              <w:left w:val="single" w:color="000000" w:sz="6"/>
-              <w:bottom w:val="single" w:color="000000" w:sz="6"/>
-              <w:right w:val="single" w:color="000000" w:sz="6"/>
-            </w:tcBorders>
-            <w:tcMar>
-              <w:top w:type="dxa" w:w="40"/>
-              <w:left w:type="dxa" w:w="80"/>
-              <w:bottom w:type="dxa" w:w="40"/>
-              <w:right w:type="dxa" w:w="80"/>
-            </w:tcMar>
-            <w:vAlign w:val="center"/>
-          </w:tcPr>
-          <w:p>
-            <w:pPr>
-              <w:jc w:val="center"/>
-            </w:pPr>
-          </w:p>
-        </w:tc>
-        <w:tc>
-          <w:tcPr>
-            <w:tcW w:type="dxa" w:w="2200"/>
-            <w:tcBorders>
-              <w:top w:val="single" w:color="000000" w:sz="6"/>
-              <w:left w:val="single" w:color="000000" w:sz="6"/>
-              <w:bottom w:val="single" w:color="000000" w:sz="6"/>
-              <w:right w:val="single" w:color="000000" w:sz="6"/>
-            </w:tcBorders>
-            <w:tcMar>
-              <w:top w:type="dxa" w:w="40"/>
-              <w:left w:type="dxa" w:w="80"/>
-              <w:bottom w:type="dxa" w:w="40"/>
-              <w:right w:type="dxa" w:w="80"/>
-            </w:tcMar>
-            <w:vAlign w:val="center"/>
-          </w:tcPr>
-          <w:p>
-            <w:pPr>
-              <w:jc w:val="center"/>
-            </w:pPr>
-          </w:p>
-        </w:tc>
-        <w:tc>
-          <w:tcPr>
-            <w:tcW w:type="dxa" w:w="1538"/>
-            <w:tcBorders>
-              <w:top w:val="single" w:color="000000" w:sz="6"/>
-              <w:left w:val="single" w:color="000000" w:sz="6"/>
-              <w:bottom w:val="single" w:color="000000" w:sz="6"/>
-              <w:right w:val="single" w:color="000000" w:sz="6"/>
-            </w:tcBorders>
-            <w:tcMar>
-              <w:top w:type="dxa" w:w="40"/>
-              <w:left w:type="dxa" w:w="80"/>
-              <w:bottom w:type="dxa" w:w="40"/>
-              <w:right w:type="dxa" w:w="80"/>
-            </w:tcMar>
-            <w:vAlign w:val="center"/>
-          </w:tcPr>
-          <w:p>
-            <w:pPr>
-              <w:jc w:val="center"/>
-            </w:pPr>
-          </w:p>
-        </w:tc>
-      </w:tr>
-      <w:tr>
-        <w:trPr>
-          <w:cantSplit/>
-          <w:trHeight w:val="560" w:hRule="atLeast"/>
-        </w:trPr>
-        <w:tc>
-          <w:tcPr>
-            <w:tcW w:type="dxa" w:w="700"/>
-            <w:tcBorders>
-              <w:top w:val="single" w:color="000000" w:sz="6"/>
-              <w:left w:val="single" w:color="000000" w:sz="6"/>
-              <w:bottom w:val="single" w:color="000000" w:sz="6"/>
-              <w:right w:val="single" w:color="000000" w:sz="6"/>
-            </w:tcBorders>
-            <w:tcMar>
-              <w:top w:type="dxa" w:w="40"/>
-              <w:left w:type="dxa" w:w="80"/>
-              <w:bottom w:type="dxa" w:w="40"/>
-              <w:right w:type="dxa" w:w="80"/>
-            </w:tcMar>
-            <w:vAlign w:val="center"/>
-          </w:tcPr>
-          <w:p>
-            <w:pPr>
-              <w:jc w:val="center"/>
-            </w:pPr>
-            <w:r>
-              <w:rPr>
-                <w:rFonts w:ascii="맑은 고딕" w:cs="맑은 고딕" w:eastAsia="맑은 고딕" w:hAnsi="맑은 고딕"/>
-                <w:b w:val="false"/>
-                <w:bCs w:val="false"/>
-                <w:sz w:val="18"/>
-                <w:szCs w:val="18"/>
-              </w:rPr>
-              <w:t xml:space="preserve">6</w:t>
-            </w:r>
-          </w:p>
-        </w:tc>
-        <w:tc>
-          <w:tcPr>
-            <w:tcW w:type="dxa" w:w="2300"/>
-            <w:tcBorders>
-              <w:top w:val="single" w:color="000000" w:sz="6"/>
-              <w:left w:val="single" w:color="000000" w:sz="6"/>
-              <w:bottom w:val="single" w:color="000000" w:sz="6"/>
-              <w:right w:val="single" w:color="000000" w:sz="6"/>
-            </w:tcBorders>
-            <w:tcMar>
-              <w:top w:type="dxa" w:w="40"/>
-              <w:left w:type="dxa" w:w="80"/>
-              <w:bottom w:type="dxa" w:w="40"/>
-              <w:right w:type="dxa" w:w="80"/>
-            </w:tcMar>
-            <w:vAlign w:val="center"/>
-          </w:tcPr>
-          <w:p>
-            <w:pPr>
-              <w:jc w:val="center"/>
-            </w:pPr>
-          </w:p>
-        </w:tc>
-        <w:tc>
-          <w:tcPr>
-            <w:tcW w:type="dxa" w:w="1900"/>
-            <w:tcBorders>
-              <w:top w:val="single" w:color="000000" w:sz="6"/>
-              <w:left w:val="single" w:color="000000" w:sz="6"/>
-              <w:bottom w:val="single" w:color="000000" w:sz="6"/>
-              <w:right w:val="single" w:color="000000" w:sz="6"/>
-            </w:tcBorders>
-            <w:tcMar>
-              <w:top w:type="dxa" w:w="40"/>
-              <w:left w:type="dxa" w:w="80"/>
-              <w:bottom w:type="dxa" w:w="40"/>
-              <w:right w:type="dxa" w:w="80"/>
-            </w:tcMar>
-            <w:vAlign w:val="center"/>
-          </w:tcPr>
-          <w:p>
-            <w:pPr>
-              <w:jc w:val="center"/>
-            </w:pPr>
-          </w:p>
-        </w:tc>
-        <w:tc>
-          <w:tcPr>
-            <w:tcW w:type="dxa" w:w="3600"/>
-            <w:tcBorders>
-              <w:top w:val="single" w:color="000000" w:sz="6"/>
-              <w:left w:val="single" w:color="000000" w:sz="6"/>
-              <w:bottom w:val="single" w:color="000000" w:sz="6"/>
-              <w:right w:val="single" w:color="000000" w:sz="6"/>
-            </w:tcBorders>
-            <w:tcMar>
-              <w:top w:type="dxa" w:w="40"/>
-              <w:left w:type="dxa" w:w="80"/>
-              <w:bottom w:type="dxa" w:w="40"/>
-              <w:right w:type="dxa" w:w="80"/>
-            </w:tcMar>
-            <w:vAlign w:val="center"/>
-          </w:tcPr>
-          <w:p>
-            <w:pPr>
-              <w:jc w:val="center"/>
-            </w:pPr>
-          </w:p>
-        </w:tc>
-        <w:tc>
-          <w:tcPr>
-            <w:tcW w:type="dxa" w:w="2600"/>
-            <w:tcBorders>
-              <w:top w:val="single" w:color="000000" w:sz="6"/>
-              <w:left w:val="single" w:color="000000" w:sz="6"/>
-              <w:bottom w:val="single" w:color="000000" w:sz="6"/>
-              <w:right w:val="single" w:color="000000" w:sz="6"/>
-            </w:tcBorders>
-            <w:tcMar>
-              <w:top w:type="dxa" w:w="40"/>
-              <w:left w:type="dxa" w:w="80"/>
-              <w:bottom w:type="dxa" w:w="40"/>
-              <w:right w:type="dxa" w:w="80"/>
-            </w:tcMar>
-            <w:vAlign w:val="center"/>
-          </w:tcPr>
-          <w:p>
-            <w:pPr>
-              <w:jc w:val="center"/>
-            </w:pPr>
-          </w:p>
-        </w:tc>
-        <w:tc>
-          <w:tcPr>
-            <w:tcW w:type="dxa" w:w="2200"/>
-            <w:tcBorders>
-              <w:top w:val="single" w:color="000000" w:sz="6"/>
-              <w:left w:val="single" w:color="000000" w:sz="6"/>
-              <w:bottom w:val="single" w:color="000000" w:sz="6"/>
-              <w:right w:val="single" w:color="000000" w:sz="6"/>
-            </w:tcBorders>
-            <w:tcMar>
-              <w:top w:type="dxa" w:w="40"/>
-              <w:left w:type="dxa" w:w="80"/>
-              <w:bottom w:type="dxa" w:w="40"/>
-              <w:right w:type="dxa" w:w="80"/>
-            </w:tcMar>
-            <w:vAlign w:val="center"/>
-          </w:tcPr>
-          <w:p>
-            <w:pPr>
-              <w:jc w:val="center"/>
-            </w:pPr>
-          </w:p>
-        </w:tc>
-        <w:tc>
-          <w:tcPr>
-            <w:tcW w:type="dxa" w:w="1538"/>
-            <w:tcBorders>
-              <w:top w:val="single" w:color="000000" w:sz="6"/>
-              <w:left w:val="single" w:color="000000" w:sz="6"/>
-              <w:bottom w:val="single" w:color="000000" w:sz="6"/>
-              <w:right w:val="single" w:color="000000" w:sz="6"/>
-            </w:tcBorders>
-            <w:tcMar>
-              <w:top w:type="dxa" w:w="40"/>
-              <w:left w:type="dxa" w:w="80"/>
-              <w:bottom w:type="dxa" w:w="40"/>
-              <w:right w:type="dxa" w:w="80"/>
-            </w:tcMar>
-            <w:vAlign w:val="center"/>
-          </w:tcPr>
-          <w:p>
-            <w:pPr>
-              <w:jc w:val="center"/>
-            </w:pPr>
-          </w:p>
-        </w:tc>
-      </w:tr>
-      <w:tr>
-        <w:trPr>
-          <w:cantSplit/>
-          <w:trHeight w:val="560" w:hRule="atLeast"/>
-        </w:trPr>
-        <w:tc>
-          <w:tcPr>
-            <w:tcW w:type="dxa" w:w="700"/>
-            <w:tcBorders>
-              <w:top w:val="single" w:color="000000" w:sz="6"/>
-              <w:left w:val="single" w:color="000000" w:sz="6"/>
-              <w:bottom w:val="single" w:color="000000" w:sz="6"/>
-              <w:right w:val="single" w:color="000000" w:sz="6"/>
-            </w:tcBorders>
-            <w:tcMar>
-              <w:top w:type="dxa" w:w="40"/>
-              <w:left w:type="dxa" w:w="80"/>
-              <w:bottom w:type="dxa" w:w="40"/>
-              <w:right w:type="dxa" w:w="80"/>
-            </w:tcMar>
-            <w:vAlign w:val="center"/>
-          </w:tcPr>
-          <w:p>
-            <w:pPr>
-              <w:jc w:val="center"/>
-            </w:pPr>
-            <w:r>
-              <w:rPr>
-                <w:rFonts w:ascii="맑은 고딕" w:cs="맑은 고딕" w:eastAsia="맑은 고딕" w:hAnsi="맑은 고딕"/>
-                <w:b w:val="false"/>
-                <w:bCs w:val="false"/>
-                <w:sz w:val="18"/>
-                <w:szCs w:val="18"/>
-              </w:rPr>
-              <w:t xml:space="preserve">7</w:t>
-            </w:r>
-          </w:p>
-        </w:tc>
-        <w:tc>
-          <w:tcPr>
-            <w:tcW w:type="dxa" w:w="2300"/>
-            <w:tcBorders>
-              <w:top w:val="single" w:color="000000" w:sz="6"/>
-              <w:left w:val="single" w:color="000000" w:sz="6"/>
-              <w:bottom w:val="single" w:color="000000" w:sz="6"/>
-              <w:right w:val="single" w:color="000000" w:sz="6"/>
-            </w:tcBorders>
-            <w:tcMar>
-              <w:top w:type="dxa" w:w="40"/>
-              <w:left w:type="dxa" w:w="80"/>
-              <w:bottom w:type="dxa" w:w="40"/>
-              <w:right w:type="dxa" w:w="80"/>
-            </w:tcMar>
-            <w:vAlign w:val="center"/>
-          </w:tcPr>
-          <w:p>
-            <w:pPr>
-              <w:jc w:val="center"/>
-            </w:pPr>
-          </w:p>
-        </w:tc>
-        <w:tc>
-          <w:tcPr>
-            <w:tcW w:type="dxa" w:w="1900"/>
-            <w:tcBorders>
-              <w:top w:val="single" w:color="000000" w:sz="6"/>
-              <w:left w:val="single" w:color="000000" w:sz="6"/>
-              <w:bottom w:val="single" w:color="000000" w:sz="6"/>
-              <w:right w:val="single" w:color="000000" w:sz="6"/>
-            </w:tcBorders>
-            <w:tcMar>
-              <w:top w:type="dxa" w:w="40"/>
-              <w:left w:type="dxa" w:w="80"/>
-              <w:bottom w:type="dxa" w:w="40"/>
-              <w:right w:type="dxa" w:w="80"/>
-            </w:tcMar>
-            <w:vAlign w:val="center"/>
-          </w:tcPr>
-          <w:p>
-            <w:pPr>
-              <w:jc w:val="center"/>
-            </w:pPr>
-          </w:p>
-        </w:tc>
-        <w:tc>
-          <w:tcPr>
-            <w:tcW w:type="dxa" w:w="3600"/>
-            <w:tcBorders>
-              <w:top w:val="single" w:color="000000" w:sz="6"/>
-              <w:left w:val="single" w:color="000000" w:sz="6"/>
-              <w:bottom w:val="single" w:color="000000" w:sz="6"/>
-              <w:right w:val="single" w:color="000000" w:sz="6"/>
-            </w:tcBorders>
-            <w:tcMar>
-              <w:top w:type="dxa" w:w="40"/>
-              <w:left w:type="dxa" w:w="80"/>
-              <w:bottom w:type="dxa" w:w="40"/>
-              <w:right w:type="dxa" w:w="80"/>
-            </w:tcMar>
-            <w:vAlign w:val="center"/>
-          </w:tcPr>
-          <w:p>
-            <w:pPr>
-              <w:jc w:val="center"/>
-            </w:pPr>
-          </w:p>
-        </w:tc>
-        <w:tc>
-          <w:tcPr>
-            <w:tcW w:type="dxa" w:w="2600"/>
-            <w:tcBorders>
-              <w:top w:val="single" w:color="000000" w:sz="6"/>
-              <w:left w:val="single" w:color="000000" w:sz="6"/>
-              <w:bottom w:val="single" w:color="000000" w:sz="6"/>
-              <w:right w:val="single" w:color="000000" w:sz="6"/>
-            </w:tcBorders>
-            <w:tcMar>
-              <w:top w:type="dxa" w:w="40"/>
-              <w:left w:type="dxa" w:w="80"/>
-              <w:bottom w:type="dxa" w:w="40"/>
-              <w:right w:type="dxa" w:w="80"/>
-            </w:tcMar>
-            <w:vAlign w:val="center"/>
-          </w:tcPr>
-          <w:p>
-            <w:pPr>
-              <w:jc w:val="center"/>
-            </w:pPr>
-          </w:p>
-        </w:tc>
-        <w:tc>
-          <w:tcPr>
-            <w:tcW w:type="dxa" w:w="2200"/>
-            <w:tcBorders>
-              <w:top w:val="single" w:color="000000" w:sz="6"/>
-              <w:left w:val="single" w:color="000000" w:sz="6"/>
-              <w:bottom w:val="single" w:color="000000" w:sz="6"/>
-              <w:right w:val="single" w:color="000000" w:sz="6"/>
-            </w:tcBorders>
-            <w:tcMar>
-              <w:top w:type="dxa" w:w="40"/>
-              <w:left w:type="dxa" w:w="80"/>
-              <w:bottom w:type="dxa" w:w="40"/>
-              <w:right w:type="dxa" w:w="80"/>
-            </w:tcMar>
-            <w:vAlign w:val="center"/>
-          </w:tcPr>
-          <w:p>
-            <w:pPr>
-              <w:jc w:val="center"/>
-            </w:pPr>
-          </w:p>
-        </w:tc>
-        <w:tc>
-          <w:tcPr>
-            <w:tcW w:type="dxa" w:w="1538"/>
-            <w:tcBorders>
-              <w:top w:val="single" w:color="000000" w:sz="6"/>
-              <w:left w:val="single" w:color="000000" w:sz="6"/>
-              <w:bottom w:val="single" w:color="000000" w:sz="6"/>
-              <w:right w:val="single" w:color="000000" w:sz="6"/>
-            </w:tcBorders>
-            <w:tcMar>
-              <w:top w:type="dxa" w:w="40"/>
-              <w:left w:type="dxa" w:w="80"/>
-              <w:bottom w:type="dxa" w:w="40"/>
-              <w:right w:type="dxa" w:w="80"/>
-            </w:tcMar>
-            <w:vAlign w:val="center"/>
-          </w:tcPr>
-          <w:p>
-            <w:pPr>
-              <w:jc w:val="center"/>
-            </w:pPr>
-          </w:p>
-        </w:tc>
-      </w:tr>
-      <w:tr>
-        <w:trPr>
-          <w:cantSplit/>
-          <w:trHeight w:val="560" w:hRule="atLeast"/>
-        </w:trPr>
-        <w:tc>
-          <w:tcPr>
-            <w:tcW w:type="dxa" w:w="700"/>
-            <w:tcBorders>
-              <w:top w:val="single" w:color="000000" w:sz="6"/>
-              <w:left w:val="single" w:color="000000" w:sz="6"/>
-              <w:bottom w:val="single" w:color="000000" w:sz="6"/>
-              <w:right w:val="single" w:color="000000" w:sz="6"/>
-            </w:tcBorders>
-            <w:tcMar>
-              <w:top w:type="dxa" w:w="40"/>
-              <w:left w:type="dxa" w:w="80"/>
-              <w:bottom w:type="dxa" w:w="40"/>
-              <w:right w:type="dxa" w:w="80"/>
-            </w:tcMar>
-            <w:vAlign w:val="center"/>
-          </w:tcPr>
-          <w:p>
-            <w:pPr>
-              <w:jc w:val="center"/>
-            </w:pPr>
-            <w:r>
-              <w:rPr>
-                <w:rFonts w:ascii="맑은 고딕" w:cs="맑은 고딕" w:eastAsia="맑은 고딕" w:hAnsi="맑은 고딕"/>
-                <w:b w:val="false"/>
-                <w:bCs w:val="false"/>
-                <w:sz w:val="18"/>
-                <w:szCs w:val="18"/>
-              </w:rPr>
-              <w:t xml:space="preserve">8</w:t>
-            </w:r>
-          </w:p>
-        </w:tc>
-        <w:tc>
-          <w:tcPr>
-            <w:tcW w:type="dxa" w:w="2300"/>
-            <w:tcBorders>
-              <w:top w:val="single" w:color="000000" w:sz="6"/>
-              <w:left w:val="single" w:color="000000" w:sz="6"/>
-              <w:bottom w:val="single" w:color="000000" w:sz="6"/>
-              <w:right w:val="single" w:color="000000" w:sz="6"/>
-            </w:tcBorders>
-            <w:tcMar>
-              <w:top w:type="dxa" w:w="40"/>
-              <w:left w:type="dxa" w:w="80"/>
-              <w:bottom w:type="dxa" w:w="40"/>
-              <w:right w:type="dxa" w:w="80"/>
-            </w:tcMar>
-            <w:vAlign w:val="center"/>
-          </w:tcPr>
-          <w:p>
-            <w:pPr>
-              <w:jc w:val="center"/>
-            </w:pPr>
-          </w:p>
-        </w:tc>
-        <w:tc>
-          <w:tcPr>
-            <w:tcW w:type="dxa" w:w="1900"/>
-            <w:tcBorders>
-              <w:top w:val="single" w:color="000000" w:sz="6"/>
-              <w:left w:val="single" w:color="000000" w:sz="6"/>
-              <w:bottom w:val="single" w:color="000000" w:sz="6"/>
-              <w:right w:val="single" w:color="000000" w:sz="6"/>
-            </w:tcBorders>
-            <w:tcMar>
-              <w:top w:type="dxa" w:w="40"/>
-              <w:left w:type="dxa" w:w="80"/>
-              <w:bottom w:type="dxa" w:w="40"/>
-              <w:right w:type="dxa" w:w="80"/>
-            </w:tcMar>
-            <w:vAlign w:val="center"/>
-          </w:tcPr>
-          <w:p>
-            <w:pPr>
-              <w:jc w:val="center"/>
-            </w:pPr>
-          </w:p>
-        </w:tc>
-        <w:tc>
-          <w:tcPr>
-            <w:tcW w:type="dxa" w:w="3600"/>
-            <w:tcBorders>
-              <w:top w:val="single" w:color="000000" w:sz="6"/>
-              <w:left w:val="single" w:color="000000" w:sz="6"/>
-              <w:bottom w:val="single" w:color="000000" w:sz="6"/>
-              <w:right w:val="single" w:color="000000" w:sz="6"/>
-            </w:tcBorders>
-            <w:tcMar>
-              <w:top w:type="dxa" w:w="40"/>
-              <w:left w:type="dxa" w:w="80"/>
-              <w:bottom w:type="dxa" w:w="40"/>
-              <w:right w:type="dxa" w:w="80"/>
-            </w:tcMar>
-            <w:vAlign w:val="center"/>
-          </w:tcPr>
-          <w:p>
-            <w:pPr>
-              <w:jc w:val="center"/>
-            </w:pPr>
-          </w:p>
-        </w:tc>
-        <w:tc>
-          <w:tcPr>
-            <w:tcW w:type="dxa" w:w="2600"/>
-            <w:tcBorders>
-              <w:top w:val="single" w:color="000000" w:sz="6"/>
-              <w:left w:val="single" w:color="000000" w:sz="6"/>
-              <w:bottom w:val="single" w:color="000000" w:sz="6"/>
-              <w:right w:val="single" w:color="000000" w:sz="6"/>
-            </w:tcBorders>
-            <w:tcMar>
-              <w:top w:type="dxa" w:w="40"/>
-              <w:left w:type="dxa" w:w="80"/>
-              <w:bottom w:type="dxa" w:w="40"/>
-              <w:right w:type="dxa" w:w="80"/>
-            </w:tcMar>
-            <w:vAlign w:val="center"/>
-          </w:tcPr>
-          <w:p>
-            <w:pPr>
-              <w:jc w:val="center"/>
-            </w:pPr>
-          </w:p>
-        </w:tc>
-        <w:tc>
-          <w:tcPr>
-            <w:tcW w:type="dxa" w:w="2200"/>
-            <w:tcBorders>
-              <w:top w:val="single" w:color="000000" w:sz="6"/>
-              <w:left w:val="single" w:color="000000" w:sz="6"/>
-              <w:bottom w:val="single" w:color="000000" w:sz="6"/>
-              <w:right w:val="single" w:color="000000" w:sz="6"/>
-            </w:tcBorders>
-            <w:tcMar>
-              <w:top w:type="dxa" w:w="40"/>
-              <w:left w:type="dxa" w:w="80"/>
-              <w:bottom w:type="dxa" w:w="40"/>
-              <w:right w:type="dxa" w:w="80"/>
-            </w:tcMar>
-            <w:vAlign w:val="center"/>
-          </w:tcPr>
-          <w:p>
-            <w:pPr>
-              <w:jc w:val="center"/>
-            </w:pPr>
-          </w:p>
-        </w:tc>
-        <w:tc>
-          <w:tcPr>
-            <w:tcW w:type="dxa" w:w="1538"/>
-            <w:tcBorders>
-              <w:top w:val="single" w:color="000000" w:sz="6"/>
-              <w:left w:val="single" w:color="000000" w:sz="6"/>
-              <w:bottom w:val="single" w:color="000000" w:sz="6"/>
-              <w:right w:val="single" w:color="000000" w:sz="6"/>
-            </w:tcBorders>
-            <w:tcMar>
-              <w:top w:type="dxa" w:w="40"/>
-              <w:left w:type="dxa" w:w="80"/>
-              <w:bottom w:type="dxa" w:w="40"/>
-              <w:right w:type="dxa" w:w="80"/>
-            </w:tcMar>
-            <w:vAlign w:val="center"/>
-          </w:tcPr>
-          <w:p>
-            <w:pPr>
-              <w:jc w:val="center"/>
-            </w:pPr>
-          </w:p>
-        </w:tc>
-      </w:tr>
-      <w:tr>
-        <w:trPr>
-          <w:cantSplit/>
-          <w:trHeight w:val="560" w:hRule="atLeast"/>
-        </w:trPr>
-        <w:tc>
-          <w:tcPr>
-            <w:tcW w:type="dxa" w:w="700"/>
-            <w:tcBorders>
-              <w:top w:val="single" w:color="000000" w:sz="6"/>
-              <w:left w:val="single" w:color="000000" w:sz="6"/>
-              <w:bottom w:val="single" w:color="000000" w:sz="6"/>
-              <w:right w:val="single" w:color="000000" w:sz="6"/>
-            </w:tcBorders>
-            <w:tcMar>
-              <w:top w:type="dxa" w:w="40"/>
-              <w:left w:type="dxa" w:w="80"/>
-              <w:bottom w:type="dxa" w:w="40"/>
-              <w:right w:type="dxa" w:w="80"/>
-            </w:tcMar>
-            <w:vAlign w:val="center"/>
-          </w:tcPr>
-          <w:p>
-            <w:pPr>
-              <w:jc w:val="center"/>
-            </w:pPr>
-            <w:r>
-              <w:rPr>
-                <w:rFonts w:ascii="맑은 고딕" w:cs="맑은 고딕" w:eastAsia="맑은 고딕" w:hAnsi="맑은 고딕"/>
-                <w:b w:val="false"/>
-                <w:bCs w:val="false"/>
-                <w:sz w:val="18"/>
-                <w:szCs w:val="18"/>
-              </w:rPr>
-              <w:t xml:space="preserve">9</w:t>
-            </w:r>
-          </w:p>
-        </w:tc>
-        <w:tc>
-          <w:tcPr>
-            <w:tcW w:type="dxa" w:w="2300"/>
-            <w:tcBorders>
-              <w:top w:val="single" w:color="000000" w:sz="6"/>
-              <w:left w:val="single" w:color="000000" w:sz="6"/>
-              <w:bottom w:val="single" w:color="000000" w:sz="6"/>
-              <w:right w:val="single" w:color="000000" w:sz="6"/>
-            </w:tcBorders>
-            <w:tcMar>
-              <w:top w:type="dxa" w:w="40"/>
-              <w:left w:type="dxa" w:w="80"/>
-              <w:bottom w:type="dxa" w:w="40"/>
-              <w:right w:type="dxa" w:w="80"/>
-            </w:tcMar>
-            <w:vAlign w:val="center"/>
-          </w:tcPr>
-          <w:p>
-            <w:pPr>
-              <w:jc w:val="center"/>
-            </w:pPr>
-          </w:p>
-        </w:tc>
-        <w:tc>
-          <w:tcPr>
-            <w:tcW w:type="dxa" w:w="1900"/>
-            <w:tcBorders>
-              <w:top w:val="single" w:color="000000" w:sz="6"/>
-              <w:left w:val="single" w:color="000000" w:sz="6"/>
-              <w:bottom w:val="single" w:color="000000" w:sz="6"/>
-              <w:right w:val="single" w:color="000000" w:sz="6"/>
-            </w:tcBorders>
-            <w:tcMar>
-              <w:top w:type="dxa" w:w="40"/>
-              <w:left w:type="dxa" w:w="80"/>
-              <w:bottom w:type="dxa" w:w="40"/>
-              <w:right w:type="dxa" w:w="80"/>
-            </w:tcMar>
-            <w:vAlign w:val="center"/>
-          </w:tcPr>
-          <w:p>
-            <w:pPr>
-              <w:jc w:val="center"/>
-            </w:pPr>
-          </w:p>
-        </w:tc>
-        <w:tc>
-          <w:tcPr>
-            <w:tcW w:type="dxa" w:w="3600"/>
-            <w:tcBorders>
-              <w:top w:val="single" w:color="000000" w:sz="6"/>
-              <w:left w:val="single" w:color="000000" w:sz="6"/>
-              <w:bottom w:val="single" w:color="000000" w:sz="6"/>
-              <w:right w:val="single" w:color="000000" w:sz="6"/>
-            </w:tcBorders>
-            <w:tcMar>
-              <w:top w:type="dxa" w:w="40"/>
-              <w:left w:type="dxa" w:w="80"/>
-              <w:bottom w:type="dxa" w:w="40"/>
-              <w:right w:type="dxa" w:w="80"/>
-            </w:tcMar>
-            <w:vAlign w:val="center"/>
-          </w:tcPr>
-          <w:p>
-            <w:pPr>
-              <w:jc w:val="center"/>
-            </w:pPr>
-          </w:p>
-        </w:tc>
-        <w:tc>
-          <w:tcPr>
-            <w:tcW w:type="dxa" w:w="2600"/>
-            <w:tcBorders>
-              <w:top w:val="single" w:color="000000" w:sz="6"/>
-              <w:left w:val="single" w:color="000000" w:sz="6"/>
-              <w:bottom w:val="single" w:color="000000" w:sz="6"/>
-              <w:right w:val="single" w:color="000000" w:sz="6"/>
-            </w:tcBorders>
-            <w:tcMar>
-              <w:top w:type="dxa" w:w="40"/>
-              <w:left w:type="dxa" w:w="80"/>
-              <w:bottom w:type="dxa" w:w="40"/>
-              <w:right w:type="dxa" w:w="80"/>
-            </w:tcMar>
-            <w:vAlign w:val="center"/>
-          </w:tcPr>
-          <w:p>
-            <w:pPr>
-              <w:jc w:val="center"/>
-            </w:pPr>
-          </w:p>
-        </w:tc>
-        <w:tc>
-          <w:tcPr>
-            <w:tcW w:type="dxa" w:w="2200"/>
-            <w:tcBorders>
-              <w:top w:val="single" w:color="000000" w:sz="6"/>
-              <w:left w:val="single" w:color="000000" w:sz="6"/>
-              <w:bottom w:val="single" w:color="000000" w:sz="6"/>
-              <w:right w:val="single" w:color="000000" w:sz="6"/>
-            </w:tcBorders>
-            <w:tcMar>
-              <w:top w:type="dxa" w:w="40"/>
-              <w:left w:type="dxa" w:w="80"/>
-              <w:bottom w:type="dxa" w:w="40"/>
-              <w:right w:type="dxa" w:w="80"/>
-            </w:tcMar>
-            <w:vAlign w:val="center"/>
-          </w:tcPr>
-          <w:p>
-            <w:pPr>
-              <w:jc w:val="center"/>
-            </w:pPr>
-          </w:p>
-        </w:tc>
-        <w:tc>
-          <w:tcPr>
-            <w:tcW w:type="dxa" w:w="1538"/>
-            <w:tcBorders>
-              <w:top w:val="single" w:color="000000" w:sz="6"/>
-              <w:left w:val="single" w:color="000000" w:sz="6"/>
-              <w:bottom w:val="single" w:color="000000" w:sz="6"/>
-              <w:right w:val="single" w:color="000000" w:sz="6"/>
-            </w:tcBorders>
-            <w:tcMar>
-              <w:top w:type="dxa" w:w="40"/>
-              <w:left w:type="dxa" w:w="80"/>
-              <w:bottom w:type="dxa" w:w="40"/>
-              <w:right w:type="dxa" w:w="80"/>
-            </w:tcMar>
-            <w:vAlign w:val="center"/>
-          </w:tcPr>
-          <w:p>
-            <w:pPr>
-              <w:jc w:val="center"/>
-            </w:pPr>
-          </w:p>
-        </w:tc>
-      </w:tr>
-      <w:tr>
-        <w:trPr>
-          <w:cantSplit/>
-          <w:trHeight w:val="560" w:hRule="atLeast"/>
-        </w:trPr>
-        <w:tc>
-          <w:tcPr>
-            <w:tcW w:type="dxa" w:w="700"/>
-            <w:tcBorders>
-              <w:top w:val="single" w:color="000000" w:sz="6"/>
-              <w:left w:val="single" w:color="000000" w:sz="6"/>
-              <w:bottom w:val="single" w:color="000000" w:sz="6"/>
-              <w:right w:val="single" w:color="000000" w:sz="6"/>
-            </w:tcBorders>
-            <w:tcMar>
-              <w:top w:type="dxa" w:w="40"/>
-              <w:left w:type="dxa" w:w="80"/>
-              <w:bottom w:type="dxa" w:w="40"/>
-              <w:right w:type="dxa" w:w="80"/>
-            </w:tcMar>
-            <w:vAlign w:val="center"/>
-          </w:tcPr>
-          <w:p>
-            <w:pPr>
-              <w:jc w:val="center"/>
-            </w:pPr>
-            <w:r>
-              <w:rPr>
-                <w:rFonts w:ascii="맑은 고딕" w:cs="맑은 고딕" w:eastAsia="맑은 고딕" w:hAnsi="맑은 고딕"/>
-                <w:b w:val="false"/>
-                <w:bCs w:val="false"/>
-                <w:sz w:val="18"/>
-                <w:szCs w:val="18"/>
-              </w:rPr>
-              <w:t xml:space="preserve">10</w:t>
-            </w:r>
-          </w:p>
-        </w:tc>
-        <w:tc>
-          <w:tcPr>
-            <w:tcW w:type="dxa" w:w="2300"/>
-            <w:tcBorders>
-              <w:top w:val="single" w:color="000000" w:sz="6"/>
-              <w:left w:val="single" w:color="000000" w:sz="6"/>
-              <w:bottom w:val="single" w:color="000000" w:sz="6"/>
-              <w:right w:val="single" w:color="000000" w:sz="6"/>
-            </w:tcBorders>
-            <w:tcMar>
-              <w:top w:type="dxa" w:w="40"/>
-              <w:left w:type="dxa" w:w="80"/>
-              <w:bottom w:type="dxa" w:w="40"/>
-              <w:right w:type="dxa" w:w="80"/>
-            </w:tcMar>
-            <w:vAlign w:val="center"/>
-          </w:tcPr>
-          <w:p>
-            <w:pPr>
-              <w:jc w:val="center"/>
-            </w:pPr>
-          </w:p>
-        </w:tc>
-        <w:tc>
-          <w:tcPr>
-            <w:tcW w:type="dxa" w:w="1900"/>
-            <w:tcBorders>
-              <w:top w:val="single" w:color="000000" w:sz="6"/>
-              <w:left w:val="single" w:color="000000" w:sz="6"/>
-              <w:bottom w:val="single" w:color="000000" w:sz="6"/>
-              <w:right w:val="single" w:color="000000" w:sz="6"/>
-            </w:tcBorders>
-            <w:tcMar>
-              <w:top w:type="dxa" w:w="40"/>
-              <w:left w:type="dxa" w:w="80"/>
-              <w:bottom w:type="dxa" w:w="40"/>
-              <w:right w:type="dxa" w:w="80"/>
-            </w:tcMar>
-            <w:vAlign w:val="center"/>
-          </w:tcPr>
-          <w:p>
-            <w:pPr>
-              <w:jc w:val="center"/>
-            </w:pPr>
-          </w:p>
-        </w:tc>
-        <w:tc>
-          <w:tcPr>
-            <w:tcW w:type="dxa" w:w="3600"/>
-            <w:tcBorders>
-              <w:top w:val="single" w:color="000000" w:sz="6"/>
-              <w:left w:val="single" w:color="000000" w:sz="6"/>
-              <w:bottom w:val="single" w:color="000000" w:sz="6"/>
-              <w:right w:val="single" w:color="000000" w:sz="6"/>
-            </w:tcBorders>
-            <w:tcMar>
-              <w:top w:type="dxa" w:w="40"/>
-              <w:left w:type="dxa" w:w="80"/>
-              <w:bottom w:type="dxa" w:w="40"/>
-              <w:right w:type="dxa" w:w="80"/>
-            </w:tcMar>
-            <w:vAlign w:val="center"/>
-          </w:tcPr>
-          <w:p>
-            <w:pPr>
-              <w:jc w:val="center"/>
-            </w:pPr>
-          </w:p>
-        </w:tc>
-        <w:tc>
-          <w:tcPr>
-            <w:tcW w:type="dxa" w:w="2600"/>
-            <w:tcBorders>
-              <w:top w:val="single" w:color="000000" w:sz="6"/>
-              <w:left w:val="single" w:color="000000" w:sz="6"/>
-              <w:bottom w:val="single" w:color="000000" w:sz="6"/>
-              <w:right w:val="single" w:color="000000" w:sz="6"/>
-            </w:tcBorders>
-            <w:tcMar>
-              <w:top w:type="dxa" w:w="40"/>
-              <w:left w:type="dxa" w:w="80"/>
-              <w:bottom w:type="dxa" w:w="40"/>
-              <w:right w:type="dxa" w:w="80"/>
-            </w:tcMar>
-            <w:vAlign w:val="center"/>
-          </w:tcPr>
-          <w:p>
-            <w:pPr>
-              <w:jc w:val="center"/>
-            </w:pPr>
-          </w:p>
-        </w:tc>
-        <w:tc>
-          <w:tcPr>
-            <w:tcW w:type="dxa" w:w="2200"/>
-            <w:tcBorders>
-              <w:top w:val="single" w:color="000000" w:sz="6"/>
-              <w:left w:val="single" w:color="000000" w:sz="6"/>
-              <w:bottom w:val="single" w:color="000000" w:sz="6"/>
-              <w:right w:val="single" w:color="000000" w:sz="6"/>
-            </w:tcBorders>
-            <w:tcMar>
-              <w:top w:type="dxa" w:w="40"/>
-              <w:left w:type="dxa" w:w="80"/>
-              <w:bottom w:type="dxa" w:w="40"/>
-              <w:right w:type="dxa" w:w="80"/>
-            </w:tcMar>
-            <w:vAlign w:val="center"/>
-          </w:tcPr>
-          <w:p>
-            <w:pPr>
-              <w:jc w:val="center"/>
-            </w:pPr>
-          </w:p>
-        </w:tc>
-        <w:tc>
-          <w:tcPr>
-            <w:tcW w:type="dxa" w:w="1538"/>
-            <w:tcBorders>
-              <w:top w:val="single" w:color="000000" w:sz="6"/>
-              <w:left w:val="single" w:color="000000" w:sz="6"/>
-              <w:bottom w:val="single" w:color="000000" w:sz="6"/>
-              <w:right w:val="single" w:color="000000" w:sz="6"/>
-            </w:tcBorders>
-            <w:tcMar>
-              <w:top w:type="dxa" w:w="40"/>
-              <w:left w:type="dxa" w:w="80"/>
-              <w:bottom w:type="dxa" w:w="40"/>
-              <w:right w:type="dxa" w:w="80"/>
-            </w:tcMar>
-            <w:vAlign w:val="center"/>
-          </w:tcPr>
-          <w:p>
-            <w:pPr>
-              <w:jc w:val="center"/>
-            </w:pPr>
-          </w:p>
-        </w:tc>
-      </w:tr>
-      <w:tr>
-        <w:trPr>
-          <w:cantSplit/>
-          <w:trHeight w:val="560" w:hRule="atLeast"/>
-        </w:trPr>
-        <w:tc>
-          <w:tcPr>
-            <w:tcW w:type="dxa" w:w="700"/>
-            <w:tcBorders>
-              <w:top w:val="single" w:color="000000" w:sz="6"/>
-              <w:left w:val="single" w:color="000000" w:sz="6"/>
-              <w:bottom w:val="single" w:color="000000" w:sz="6"/>
-              <w:right w:val="single" w:color="000000" w:sz="6"/>
-            </w:tcBorders>
-            <w:tcMar>
-              <w:top w:type="dxa" w:w="40"/>
-              <w:left w:type="dxa" w:w="80"/>
-              <w:bottom w:type="dxa" w:w="40"/>
-              <w:right w:type="dxa" w:w="80"/>
-            </w:tcMar>
-            <w:vAlign w:val="center"/>
-          </w:tcPr>
-          <w:p>
-            <w:pPr>
-              <w:jc w:val="center"/>
-            </w:pPr>
-            <w:r>
-              <w:rPr>
-                <w:rFonts w:ascii="맑은 고딕" w:cs="맑은 고딕" w:eastAsia="맑은 고딕" w:hAnsi="맑은 고딕"/>
-                <w:b w:val="false"/>
-                <w:bCs w:val="false"/>
-                <w:sz w:val="18"/>
-                <w:szCs w:val="18"/>
-              </w:rPr>
-              <w:t xml:space="preserve">11</w:t>
-            </w:r>
-          </w:p>
-        </w:tc>
-        <w:tc>
-          <w:tcPr>
-            <w:tcW w:type="dxa" w:w="2300"/>
-            <w:tcBorders>
-              <w:top w:val="single" w:color="000000" w:sz="6"/>
-              <w:left w:val="single" w:color="000000" w:sz="6"/>
-              <w:bottom w:val="single" w:color="000000" w:sz="6"/>
-              <w:right w:val="single" w:color="000000" w:sz="6"/>
-            </w:tcBorders>
-            <w:tcMar>
-              <w:top w:type="dxa" w:w="40"/>
-              <w:left w:type="dxa" w:w="80"/>
-              <w:bottom w:type="dxa" w:w="40"/>
-              <w:right w:type="dxa" w:w="80"/>
-            </w:tcMar>
-            <w:vAlign w:val="center"/>
-          </w:tcPr>
-          <w:p>
-            <w:pPr>
-              <w:jc w:val="center"/>
-            </w:pPr>
-          </w:p>
-        </w:tc>
-        <w:tc>
-          <w:tcPr>
-            <w:tcW w:type="dxa" w:w="1900"/>
-            <w:tcBorders>
-              <w:top w:val="single" w:color="000000" w:sz="6"/>
-              <w:left w:val="single" w:color="000000" w:sz="6"/>
-              <w:bottom w:val="single" w:color="000000" w:sz="6"/>
-              <w:right w:val="single" w:color="000000" w:sz="6"/>
-            </w:tcBorders>
-            <w:tcMar>
-              <w:top w:type="dxa" w:w="40"/>
-              <w:left w:type="dxa" w:w="80"/>
-              <w:bottom w:type="dxa" w:w="40"/>
-              <w:right w:type="dxa" w:w="80"/>
-            </w:tcMar>
-            <w:vAlign w:val="center"/>
-          </w:tcPr>
-          <w:p>
-            <w:pPr>
-              <w:jc w:val="center"/>
-            </w:pPr>
-          </w:p>
-        </w:tc>
-        <w:tc>
-          <w:tcPr>
-            <w:tcW w:type="dxa" w:w="3600"/>
-            <w:tcBorders>
-              <w:top w:val="single" w:color="000000" w:sz="6"/>
-              <w:left w:val="single" w:color="000000" w:sz="6"/>
-              <w:bottom w:val="single" w:color="000000" w:sz="6"/>
-              <w:right w:val="single" w:color="000000" w:sz="6"/>
-            </w:tcBorders>
-            <w:tcMar>
-              <w:top w:type="dxa" w:w="40"/>
-              <w:left w:type="dxa" w:w="80"/>
-              <w:bottom w:type="dxa" w:w="40"/>
-              <w:right w:type="dxa" w:w="80"/>
-            </w:tcMar>
-            <w:vAlign w:val="center"/>
-          </w:tcPr>
-          <w:p>
-            <w:pPr>
-              <w:jc w:val="center"/>
-            </w:pPr>
-          </w:p>
-        </w:tc>
-        <w:tc>
-          <w:tcPr>
-            <w:tcW w:type="dxa" w:w="2600"/>
-            <w:tcBorders>
-              <w:top w:val="single" w:color="000000" w:sz="6"/>
-              <w:left w:val="single" w:color="000000" w:sz="6"/>
-              <w:bottom w:val="single" w:color="000000" w:sz="6"/>
-              <w:right w:val="single" w:color="000000" w:sz="6"/>
-            </w:tcBorders>
-            <w:tcMar>
-              <w:top w:type="dxa" w:w="40"/>
-              <w:left w:type="dxa" w:w="80"/>
-              <w:bottom w:type="dxa" w:w="40"/>
-              <w:right w:type="dxa" w:w="80"/>
-            </w:tcMar>
-            <w:vAlign w:val="center"/>
-          </w:tcPr>
-          <w:p>
-            <w:pPr>
-              <w:jc w:val="center"/>
-            </w:pPr>
-          </w:p>
-        </w:tc>
-        <w:tc>
-          <w:tcPr>
-            <w:tcW w:type="dxa" w:w="2200"/>
-            <w:tcBorders>
-              <w:top w:val="single" w:color="000000" w:sz="6"/>
-              <w:left w:val="single" w:color="000000" w:sz="6"/>
-              <w:bottom w:val="single" w:color="000000" w:sz="6"/>
-              <w:right w:val="single" w:color="000000" w:sz="6"/>
-            </w:tcBorders>
-            <w:tcMar>
-              <w:top w:type="dxa" w:w="40"/>
-              <w:left w:type="dxa" w:w="80"/>
-              <w:bottom w:type="dxa" w:w="40"/>
-              <w:right w:type="dxa" w:w="80"/>
-            </w:tcMar>
-            <w:vAlign w:val="center"/>
-          </w:tcPr>
-          <w:p>
-            <w:pPr>
-              <w:jc w:val="center"/>
-            </w:pPr>
-          </w:p>
-        </w:tc>
-        <w:tc>
-          <w:tcPr>
-            <w:tcW w:type="dxa" w:w="1538"/>
-            <w:tcBorders>
-              <w:top w:val="single" w:color="000000" w:sz="6"/>
-              <w:left w:val="single" w:color="000000" w:sz="6"/>
-              <w:bottom w:val="single" w:color="000000" w:sz="6"/>
-              <w:right w:val="single" w:color="000000" w:sz="6"/>
-            </w:tcBorders>
-            <w:tcMar>
-              <w:top w:type="dxa" w:w="40"/>
-              <w:left w:type="dxa" w:w="80"/>
-              <w:bottom w:type="dxa" w:w="40"/>
-              <w:right w:type="dxa" w:w="80"/>
-            </w:tcMar>
-            <w:vAlign w:val="center"/>
-          </w:tcPr>
-          <w:p>
-            <w:pPr>
-              <w:jc w:val="center"/>
-            </w:pPr>
-          </w:p>
-        </w:tc>
-      </w:tr>
-      <w:tr>
-        <w:trPr>
-          <w:cantSplit/>
-          <w:trHeight w:val="560" w:hRule="atLeast"/>
-        </w:trPr>
-        <w:tc>
-          <w:tcPr>
-            <w:tcW w:type="dxa" w:w="700"/>
-            <w:tcBorders>
-              <w:top w:val="single" w:color="000000" w:sz="6"/>
-              <w:left w:val="single" w:color="000000" w:sz="6"/>
-              <w:bottom w:val="single" w:color="000000" w:sz="6"/>
-              <w:right w:val="single" w:color="000000" w:sz="6"/>
-            </w:tcBorders>
-            <w:tcMar>
-              <w:top w:type="dxa" w:w="40"/>
-              <w:left w:type="dxa" w:w="80"/>
-              <w:bottom w:type="dxa" w:w="40"/>
-              <w:right w:type="dxa" w:w="80"/>
-            </w:tcMar>
-            <w:vAlign w:val="center"/>
-          </w:tcPr>
-          <w:p>
-            <w:pPr>
-              <w:jc w:val="center"/>
-            </w:pPr>
-            <w:r>
-              <w:rPr>
-                <w:rFonts w:ascii="맑은 고딕" w:cs="맑은 고딕" w:eastAsia="맑은 고딕" w:hAnsi="맑은 고딕"/>
-                <w:b w:val="false"/>
-                <w:bCs w:val="false"/>
-                <w:sz w:val="18"/>
-                <w:szCs w:val="18"/>
-              </w:rPr>
-              <w:t xml:space="preserve">12</w:t>
-            </w:r>
-          </w:p>
-        </w:tc>
-        <w:tc>
-          <w:tcPr>
-            <w:tcW w:type="dxa" w:w="2300"/>
-            <w:tcBorders>
-              <w:top w:val="single" w:color="000000" w:sz="6"/>
-              <w:left w:val="single" w:color="000000" w:sz="6"/>
-              <w:bottom w:val="single" w:color="000000" w:sz="6"/>
-              <w:right w:val="single" w:color="000000" w:sz="6"/>
-            </w:tcBorders>
-            <w:tcMar>
-              <w:top w:type="dxa" w:w="40"/>
-              <w:left w:type="dxa" w:w="80"/>
-              <w:bottom w:type="dxa" w:w="40"/>
-              <w:right w:type="dxa" w:w="80"/>
-            </w:tcMar>
-            <w:vAlign w:val="center"/>
-          </w:tcPr>
-          <w:p>
-            <w:pPr>
-              <w:jc w:val="center"/>
-            </w:pPr>
-          </w:p>
-        </w:tc>
-        <w:tc>
-          <w:tcPr>
-            <w:tcW w:type="dxa" w:w="1900"/>
-            <w:tcBorders>
-              <w:top w:val="single" w:color="000000" w:sz="6"/>
-              <w:left w:val="single" w:color="000000" w:sz="6"/>
-              <w:bottom w:val="single" w:color="000000" w:sz="6"/>
-              <w:right w:val="single" w:color="000000" w:sz="6"/>
-            </w:tcBorders>
-            <w:tcMar>
-              <w:top w:type="dxa" w:w="40"/>
-              <w:left w:type="dxa" w:w="80"/>
-              <w:bottom w:type="dxa" w:w="40"/>
-              <w:right w:type="dxa" w:w="80"/>
-            </w:tcMar>
-            <w:vAlign w:val="center"/>
-          </w:tcPr>
-          <w:p>
-            <w:pPr>
-              <w:jc w:val="center"/>
-            </w:pPr>
-          </w:p>
-        </w:tc>
-        <w:tc>
-          <w:tcPr>
-            <w:tcW w:type="dxa" w:w="3600"/>
-            <w:tcBorders>
-              <w:top w:val="single" w:color="000000" w:sz="6"/>
-              <w:left w:val="single" w:color="000000" w:sz="6"/>
-              <w:bottom w:val="single" w:color="000000" w:sz="6"/>
-              <w:right w:val="single" w:color="000000" w:sz="6"/>
-            </w:tcBorders>
-            <w:tcMar>
-              <w:top w:type="dxa" w:w="40"/>
-              <w:left w:type="dxa" w:w="80"/>
-              <w:bottom w:type="dxa" w:w="40"/>
-              <w:right w:type="dxa" w:w="80"/>
-            </w:tcMar>
-            <w:vAlign w:val="center"/>
-          </w:tcPr>
-          <w:p>
-            <w:pPr>
-              <w:jc w:val="center"/>
-            </w:pPr>
-          </w:p>
-        </w:tc>
-        <w:tc>
-          <w:tcPr>
-            <w:tcW w:type="dxa" w:w="2600"/>
-            <w:tcBorders>
-              <w:top w:val="single" w:color="000000" w:sz="6"/>
-              <w:left w:val="single" w:color="000000" w:sz="6"/>
-              <w:bottom w:val="single" w:color="000000" w:sz="6"/>
-              <w:right w:val="single" w:color="000000" w:sz="6"/>
-            </w:tcBorders>
-            <w:tcMar>
-              <w:top w:type="dxa" w:w="40"/>
-              <w:left w:type="dxa" w:w="80"/>
-              <w:bottom w:type="dxa" w:w="40"/>
-              <w:right w:type="dxa" w:w="80"/>
-            </w:tcMar>
-            <w:vAlign w:val="center"/>
-          </w:tcPr>
-          <w:p>
-            <w:pPr>
-              <w:jc w:val="center"/>
-            </w:pPr>
-          </w:p>
-        </w:tc>
-        <w:tc>
-          <w:tcPr>
-            <w:tcW w:type="dxa" w:w="2200"/>
-            <w:tcBorders>
-              <w:top w:val="single" w:color="000000" w:sz="6"/>
-              <w:left w:val="single" w:color="000000" w:sz="6"/>
-              <w:bottom w:val="single" w:color="000000" w:sz="6"/>
-              <w:right w:val="single" w:color="000000" w:sz="6"/>
-            </w:tcBorders>
-            <w:tcMar>
-              <w:top w:type="dxa" w:w="40"/>
-              <w:left w:type="dxa" w:w="80"/>
-              <w:bottom w:type="dxa" w:w="40"/>
-              <w:right w:type="dxa" w:w="80"/>
-            </w:tcMar>
-            <w:vAlign w:val="center"/>
-          </w:tcPr>
-          <w:p>
-            <w:pPr>
-              <w:jc w:val="center"/>
-            </w:pPr>
-          </w:p>
-        </w:tc>
-        <w:tc>
-          <w:tcPr>
-            <w:tcW w:type="dxa" w:w="1538"/>
-            <w:tcBorders>
-              <w:top w:val="single" w:color="000000" w:sz="6"/>
-              <w:left w:val="single" w:color="000000" w:sz="6"/>
-              <w:bottom w:val="single" w:color="000000" w:sz="6"/>
-              <w:right w:val="single" w:color="000000" w:sz="6"/>
-            </w:tcBorders>
-            <w:tcMar>
-              <w:top w:type="dxa" w:w="40"/>
-              <w:left w:type="dxa" w:w="80"/>
-              <w:bottom w:type="dxa" w:w="40"/>
-              <w:right w:type="dxa" w:w="80"/>
-            </w:tcMar>
-            <w:vAlign w:val="center"/>
-          </w:tcPr>
-          <w:p>
-            <w:pPr>
-              <w:jc w:val="center"/>
-            </w:pPr>
-          </w:p>
-        </w:tc>
-      </w:tr>
-    </w:tbl>
-    <w:p>
-      <w:pPr>
-        <w:spacing w:before="120"/>
-        <w:jc w:val="right"/>
-      </w:pPr>
-      <w:r>
-        <w:rPr>
-          <w:rFonts w:ascii="맑은 고딕" w:cs="맑은 고딕" w:eastAsia="맑은 고딕" w:hAnsi="맑은 고딕"/>
-          <w:sz w:val="18"/>
-          <w:szCs w:val="18"/>
-        </w:rPr>
-        <w:t xml:space="preserve">서명일: 2026년 ____월 ____일          확인자(수합 책임자): ______________ (서명)</w:t>
-      </w:r>
-    </w:p>
-    <w:p>
-      <w:r>
-        <w:br w:type="page"/>
-      </w:r>
-    </w:p>
-    <w:p>
-      <w:pPr>
-        <w:spacing w:after="60"/>
-        <w:jc w:val="center"/>
-      </w:pPr>
-      <w:r>
-        <w:rPr>
-          <w:rFonts w:ascii="맑은 고딕" w:cs="맑은 고딕" w:eastAsia="맑은 고딕" w:hAnsi="맑은 고딕"/>
-          <w:b/>
-          <w:bCs/>
-          <w:sz w:val="30"/>
-          <w:szCs w:val="30"/>
-        </w:rPr>
-        <w:t xml:space="preserve">주민 서명부 — 석점마을</w:t>
       </w:r>
     </w:p>
     <w:tbl>

</xml_diff>

<commit_message>
Signature sheet: remove spare village page
Co-Authored-By: Claude Opus 5.5 <noreply@anthropic.com>
Claude-Session: https://claude.ai/code/session_01H9b7FFp3sXnkbpWqGcr2Bw
</commit_message>
<xml_diff>
--- a/주민서명부_수사의뢰동참.docx
+++ b/주민서명부_수사의뢰동참.docx
@@ -8066,2532 +8066,6 @@
           <w:szCs w:val="30"/>
         </w:rPr>
         <w:t xml:space="preserve">주민 서명부 — 원삼마을</w:t>
-      </w:r>
-    </w:p>
-    <w:tbl>
-      <w:tblPr>
-        <w:tblW w:type="dxa" w:w="14838"/>
-        <w:tblBorders>
-          <w:top w:val="single" w:color="auto" w:sz="4"/>
-          <w:left w:val="single" w:color="auto" w:sz="4"/>
-          <w:bottom w:val="single" w:color="auto" w:sz="4"/>
-          <w:right w:val="single" w:color="auto" w:sz="4"/>
-          <w:insideH w:val="single" w:color="auto" w:sz="4"/>
-          <w:insideV w:val="single" w:color="auto" w:sz="4"/>
-        </w:tblBorders>
-      </w:tblPr>
-      <w:tblGrid>
-        <w:gridCol w:w="14838"/>
-      </w:tblGrid>
-      <w:tr>
-        <w:tc>
-          <w:tcPr>
-            <w:tcW w:type="dxa" w:w="14838"/>
-            <w:tcBorders>
-              <w:top w:val="single" w:color="000000" w:sz="6"/>
-              <w:left w:val="single" w:color="000000" w:sz="6"/>
-              <w:bottom w:val="single" w:color="000000" w:sz="6"/>
-              <w:right w:val="single" w:color="000000" w:sz="6"/>
-            </w:tcBorders>
-            <w:shd w:fill="F2F2F2" w:color="auto" w:val="clear"/>
-            <w:tcMar>
-              <w:top w:type="dxa" w:w="100"/>
-              <w:left w:type="dxa" w:w="160"/>
-              <w:bottom w:type="dxa" w:w="100"/>
-              <w:right w:type="dxa" w:w="160"/>
-            </w:tcMar>
-          </w:tcPr>
-          <w:p>
-            <w:pPr>
-              <w:spacing w:after="0" w:before="0" w:line="270"/>
-              <w:jc w:val="both"/>
-            </w:pPr>
-            <w:r>
-              <w:rPr>
-                <w:rFonts w:ascii="맑은 고딕" w:cs="맑은 고딕" w:eastAsia="맑은 고딕" w:hAnsi="맑은 고딕"/>
-                <w:b/>
-                <w:bCs/>
-                <w:sz w:val="18"/>
-                <w:szCs w:val="18"/>
-              </w:rPr>
-              <w:t xml:space="preserve">[결의 요약]</w:t>
-            </w:r>
-            <w:r>
-              <w:rPr>
-                <w:rFonts w:ascii="맑은 고딕" w:cs="맑은 고딕" w:eastAsia="맑은 고딕" w:hAnsi="맑은 고딕"/>
-                <w:sz w:val="18"/>
-                <w:szCs w:val="18"/>
-              </w:rPr>
-              <w:t xml:space="preserve"> ① 2023. 1. 30. 순정축협 공동협약에 우리 마을 이장이 서명할 때 주민총회 결의나 본인의 위임을 알지 못하고 참여·통지받은 사실이 없음 ② 이장 또는 환경개선위원회가 우리 마을 주민을 대표하여 한 협약 체결·금원 수령과 사용·퇴비사 신축 "반대 의견 없음" 의견 제출 등을 </w:t>
-            </w:r>
-            <w:r>
-              <w:rPr>
-                <w:rFonts w:ascii="맑은 고딕" w:cs="맑은 고딕" w:eastAsia="맑은 고딕" w:hAnsi="맑은 고딕"/>
-                <w:b/>
-                <w:bCs/>
-                <w:sz w:val="18"/>
-                <w:szCs w:val="18"/>
-              </w:rPr>
-              <w:t xml:space="preserve">추인하지 않음</w:t>
-            </w:r>
-            <w:r>
-              <w:rPr>
-                <w:rFonts w:ascii="맑은 고딕" w:cs="맑은 고딕" w:eastAsia="맑은 고딕" w:hAnsi="맑은 고딕"/>
-                <w:sz w:val="18"/>
-                <w:szCs w:val="18"/>
-              </w:rPr>
-              <w:t xml:space="preserve"> ③ 1억 원의 지급·사용 경위를 밝히기 위한 </w:t>
-            </w:r>
-            <w:r>
-              <w:rPr>
-                <w:rFonts w:ascii="맑은 고딕" w:cs="맑은 고딕" w:eastAsia="맑은 고딕" w:hAnsi="맑은 고딕"/>
-                <w:b/>
-                <w:bCs/>
-                <w:sz w:val="18"/>
-                <w:szCs w:val="18"/>
-              </w:rPr>
-              <w:t xml:space="preserve">수사의뢰 진정에 동참</w:t>
-            </w:r>
-            <w:r>
-              <w:rPr>
-                <w:rFonts w:ascii="맑은 고딕" w:cs="맑은 고딕" w:eastAsia="맑은 고딕" w:hAnsi="맑은 고딕"/>
-                <w:sz w:val="18"/>
-                <w:szCs w:val="18"/>
-              </w:rPr>
-              <w:t xml:space="preserve">하고 이 서명부의 수사기관 제출 및 개인정보 수집·이용(1쪽)에 동의함</w:t>
-            </w:r>
-          </w:p>
-        </w:tc>
-      </w:tr>
-    </w:tbl>
-    <w:p>
-      <w:pPr>
-        <w:spacing w:after="80"/>
-      </w:pPr>
-    </w:p>
-    <w:tbl>
-      <w:tblPr>
-        <w:tblW w:type="dxa" w:w="14838"/>
-        <w:tblBorders>
-          <w:top w:val="single" w:color="auto" w:sz="4"/>
-          <w:left w:val="single" w:color="auto" w:sz="4"/>
-          <w:bottom w:val="single" w:color="auto" w:sz="4"/>
-          <w:right w:val="single" w:color="auto" w:sz="4"/>
-          <w:insideH w:val="single" w:color="auto" w:sz="4"/>
-          <w:insideV w:val="single" w:color="auto" w:sz="4"/>
-        </w:tblBorders>
-      </w:tblPr>
-      <w:tblGrid>
-        <w:gridCol w:w="700"/>
-        <w:gridCol w:w="2300"/>
-        <w:gridCol w:w="1900"/>
-        <w:gridCol w:w="3600"/>
-        <w:gridCol w:w="2600"/>
-        <w:gridCol w:w="2200"/>
-        <w:gridCol w:w="1538"/>
-      </w:tblGrid>
-      <w:tr>
-        <w:trPr>
-          <w:tblHeader/>
-          <w:trHeight w:val="420" w:hRule="atLeast"/>
-        </w:trPr>
-        <w:tc>
-          <w:tcPr>
-            <w:tcW w:type="dxa" w:w="700"/>
-            <w:tcBorders>
-              <w:top w:val="single" w:color="000000" w:sz="6"/>
-              <w:left w:val="single" w:color="000000" w:sz="6"/>
-              <w:bottom w:val="single" w:color="000000" w:sz="6"/>
-              <w:right w:val="single" w:color="000000" w:sz="6"/>
-            </w:tcBorders>
-            <w:shd w:fill="D9D9D9" w:color="auto" w:val="clear"/>
-            <w:tcMar>
-              <w:top w:type="dxa" w:w="40"/>
-              <w:left w:type="dxa" w:w="80"/>
-              <w:bottom w:type="dxa" w:w="40"/>
-              <w:right w:type="dxa" w:w="80"/>
-            </w:tcMar>
-            <w:vAlign w:val="center"/>
-          </w:tcPr>
-          <w:p>
-            <w:pPr>
-              <w:jc w:val="center"/>
-            </w:pPr>
-            <w:r>
-              <w:rPr>
-                <w:rFonts w:ascii="맑은 고딕" w:cs="맑은 고딕" w:eastAsia="맑은 고딕" w:hAnsi="맑은 고딕"/>
-                <w:b/>
-                <w:bCs/>
-                <w:sz w:val="19"/>
-                <w:szCs w:val="19"/>
-              </w:rPr>
-              <w:t xml:space="preserve">번호</w:t>
-            </w:r>
-          </w:p>
-        </w:tc>
-        <w:tc>
-          <w:tcPr>
-            <w:tcW w:type="dxa" w:w="2300"/>
-            <w:tcBorders>
-              <w:top w:val="single" w:color="000000" w:sz="6"/>
-              <w:left w:val="single" w:color="000000" w:sz="6"/>
-              <w:bottom w:val="single" w:color="000000" w:sz="6"/>
-              <w:right w:val="single" w:color="000000" w:sz="6"/>
-            </w:tcBorders>
-            <w:shd w:fill="D9D9D9" w:color="auto" w:val="clear"/>
-            <w:tcMar>
-              <w:top w:type="dxa" w:w="40"/>
-              <w:left w:type="dxa" w:w="80"/>
-              <w:bottom w:type="dxa" w:w="40"/>
-              <w:right w:type="dxa" w:w="80"/>
-            </w:tcMar>
-            <w:vAlign w:val="center"/>
-          </w:tcPr>
-          <w:p>
-            <w:pPr>
-              <w:jc w:val="center"/>
-            </w:pPr>
-            <w:r>
-              <w:rPr>
-                <w:rFonts w:ascii="맑은 고딕" w:cs="맑은 고딕" w:eastAsia="맑은 고딕" w:hAnsi="맑은 고딕"/>
-                <w:b/>
-                <w:bCs/>
-                <w:sz w:val="19"/>
-                <w:szCs w:val="19"/>
-              </w:rPr>
-              <w:t xml:space="preserve">성  명</w:t>
-            </w:r>
-          </w:p>
-        </w:tc>
-        <w:tc>
-          <w:tcPr>
-            <w:tcW w:type="dxa" w:w="1900"/>
-            <w:tcBorders>
-              <w:top w:val="single" w:color="000000" w:sz="6"/>
-              <w:left w:val="single" w:color="000000" w:sz="6"/>
-              <w:bottom w:val="single" w:color="000000" w:sz="6"/>
-              <w:right w:val="single" w:color="000000" w:sz="6"/>
-            </w:tcBorders>
-            <w:shd w:fill="D9D9D9" w:color="auto" w:val="clear"/>
-            <w:tcMar>
-              <w:top w:type="dxa" w:w="40"/>
-              <w:left w:type="dxa" w:w="80"/>
-              <w:bottom w:type="dxa" w:w="40"/>
-              <w:right w:type="dxa" w:w="80"/>
-            </w:tcMar>
-            <w:vAlign w:val="center"/>
-          </w:tcPr>
-          <w:p>
-            <w:pPr>
-              <w:jc w:val="center"/>
-            </w:pPr>
-            <w:r>
-              <w:rPr>
-                <w:rFonts w:ascii="맑은 고딕" w:cs="맑은 고딕" w:eastAsia="맑은 고딕" w:hAnsi="맑은 고딕"/>
-                <w:b/>
-                <w:bCs/>
-                <w:sz w:val="19"/>
-                <w:szCs w:val="19"/>
-              </w:rPr>
-              <w:t xml:space="preserve">생년월일</w:t>
-            </w:r>
-          </w:p>
-        </w:tc>
-        <w:tc>
-          <w:tcPr>
-            <w:tcW w:type="dxa" w:w="3600"/>
-            <w:tcBorders>
-              <w:top w:val="single" w:color="000000" w:sz="6"/>
-              <w:left w:val="single" w:color="000000" w:sz="6"/>
-              <w:bottom w:val="single" w:color="000000" w:sz="6"/>
-              <w:right w:val="single" w:color="000000" w:sz="6"/>
-            </w:tcBorders>
-            <w:shd w:fill="D9D9D9" w:color="auto" w:val="clear"/>
-            <w:tcMar>
-              <w:top w:type="dxa" w:w="40"/>
-              <w:left w:type="dxa" w:w="80"/>
-              <w:bottom w:type="dxa" w:w="40"/>
-              <w:right w:type="dxa" w:w="80"/>
-            </w:tcMar>
-            <w:vAlign w:val="center"/>
-          </w:tcPr>
-          <w:p>
-            <w:pPr>
-              <w:jc w:val="center"/>
-            </w:pPr>
-            <w:r>
-              <w:rPr>
-                <w:rFonts w:ascii="맑은 고딕" w:cs="맑은 고딕" w:eastAsia="맑은 고딕" w:hAnsi="맑은 고딕"/>
-                <w:b/>
-                <w:bCs/>
-                <w:sz w:val="19"/>
-                <w:szCs w:val="19"/>
-              </w:rPr>
-              <w:t xml:space="preserve">주소 (마을명·번지)</w:t>
-            </w:r>
-          </w:p>
-        </w:tc>
-        <w:tc>
-          <w:tcPr>
-            <w:tcW w:type="dxa" w:w="2600"/>
-            <w:tcBorders>
-              <w:top w:val="single" w:color="000000" w:sz="6"/>
-              <w:left w:val="single" w:color="000000" w:sz="6"/>
-              <w:bottom w:val="single" w:color="000000" w:sz="6"/>
-              <w:right w:val="single" w:color="000000" w:sz="6"/>
-            </w:tcBorders>
-            <w:shd w:fill="D9D9D9" w:color="auto" w:val="clear"/>
-            <w:tcMar>
-              <w:top w:type="dxa" w:w="40"/>
-              <w:left w:type="dxa" w:w="80"/>
-              <w:bottom w:type="dxa" w:w="40"/>
-              <w:right w:type="dxa" w:w="80"/>
-            </w:tcMar>
-            <w:vAlign w:val="center"/>
-          </w:tcPr>
-          <w:p>
-            <w:pPr>
-              <w:jc w:val="center"/>
-            </w:pPr>
-            <w:r>
-              <w:rPr>
-                <w:rFonts w:ascii="맑은 고딕" w:cs="맑은 고딕" w:eastAsia="맑은 고딕" w:hAnsi="맑은 고딕"/>
-                <w:b/>
-                <w:bCs/>
-                <w:sz w:val="19"/>
-                <w:szCs w:val="19"/>
-              </w:rPr>
-              <w:t xml:space="preserve">연락처</w:t>
-            </w:r>
-          </w:p>
-        </w:tc>
-        <w:tc>
-          <w:tcPr>
-            <w:tcW w:type="dxa" w:w="2200"/>
-            <w:tcBorders>
-              <w:top w:val="single" w:color="000000" w:sz="6"/>
-              <w:left w:val="single" w:color="000000" w:sz="6"/>
-              <w:bottom w:val="single" w:color="000000" w:sz="6"/>
-              <w:right w:val="single" w:color="000000" w:sz="6"/>
-            </w:tcBorders>
-            <w:shd w:fill="D9D9D9" w:color="auto" w:val="clear"/>
-            <w:tcMar>
-              <w:top w:type="dxa" w:w="40"/>
-              <w:left w:type="dxa" w:w="80"/>
-              <w:bottom w:type="dxa" w:w="40"/>
-              <w:right w:type="dxa" w:w="80"/>
-            </w:tcMar>
-            <w:vAlign w:val="center"/>
-          </w:tcPr>
-          <w:p>
-            <w:pPr>
-              <w:jc w:val="center"/>
-            </w:pPr>
-            <w:r>
-              <w:rPr>
-                <w:rFonts w:ascii="맑은 고딕" w:cs="맑은 고딕" w:eastAsia="맑은 고딕" w:hAnsi="맑은 고딕"/>
-                <w:b/>
-                <w:bCs/>
-                <w:sz w:val="19"/>
-                <w:szCs w:val="19"/>
-              </w:rPr>
-              <w:t xml:space="preserve">서  명</w:t>
-            </w:r>
-          </w:p>
-        </w:tc>
-        <w:tc>
-          <w:tcPr>
-            <w:tcW w:type="dxa" w:w="1538"/>
-            <w:tcBorders>
-              <w:top w:val="single" w:color="000000" w:sz="6"/>
-              <w:left w:val="single" w:color="000000" w:sz="6"/>
-              <w:bottom w:val="single" w:color="000000" w:sz="6"/>
-              <w:right w:val="single" w:color="000000" w:sz="6"/>
-            </w:tcBorders>
-            <w:shd w:fill="D9D9D9" w:color="auto" w:val="clear"/>
-            <w:tcMar>
-              <w:top w:type="dxa" w:w="40"/>
-              <w:left w:type="dxa" w:w="80"/>
-              <w:bottom w:type="dxa" w:w="40"/>
-              <w:right w:type="dxa" w:w="80"/>
-            </w:tcMar>
-            <w:vAlign w:val="center"/>
-          </w:tcPr>
-          <w:p>
-            <w:pPr>
-              <w:jc w:val="center"/>
-            </w:pPr>
-            <w:r>
-              <w:rPr>
-                <w:rFonts w:ascii="맑은 고딕" w:cs="맑은 고딕" w:eastAsia="맑은 고딕" w:hAnsi="맑은 고딕"/>
-                <w:b/>
-                <w:bCs/>
-                <w:sz w:val="19"/>
-                <w:szCs w:val="19"/>
-              </w:rPr>
-              <w:t xml:space="preserve">비고</w:t>
-            </w:r>
-          </w:p>
-        </w:tc>
-      </w:tr>
-      <w:tr>
-        <w:trPr>
-          <w:cantSplit/>
-          <w:trHeight w:val="560" w:hRule="atLeast"/>
-        </w:trPr>
-        <w:tc>
-          <w:tcPr>
-            <w:tcW w:type="dxa" w:w="700"/>
-            <w:tcBorders>
-              <w:top w:val="single" w:color="000000" w:sz="6"/>
-              <w:left w:val="single" w:color="000000" w:sz="6"/>
-              <w:bottom w:val="single" w:color="000000" w:sz="6"/>
-              <w:right w:val="single" w:color="000000" w:sz="6"/>
-            </w:tcBorders>
-            <w:tcMar>
-              <w:top w:type="dxa" w:w="40"/>
-              <w:left w:type="dxa" w:w="80"/>
-              <w:bottom w:type="dxa" w:w="40"/>
-              <w:right w:type="dxa" w:w="80"/>
-            </w:tcMar>
-            <w:vAlign w:val="center"/>
-          </w:tcPr>
-          <w:p>
-            <w:pPr>
-              <w:jc w:val="center"/>
-            </w:pPr>
-            <w:r>
-              <w:rPr>
-                <w:rFonts w:ascii="맑은 고딕" w:cs="맑은 고딕" w:eastAsia="맑은 고딕" w:hAnsi="맑은 고딕"/>
-                <w:b w:val="false"/>
-                <w:bCs w:val="false"/>
-                <w:sz w:val="18"/>
-                <w:szCs w:val="18"/>
-              </w:rPr>
-              <w:t xml:space="preserve">1</w:t>
-            </w:r>
-          </w:p>
-        </w:tc>
-        <w:tc>
-          <w:tcPr>
-            <w:tcW w:type="dxa" w:w="2300"/>
-            <w:tcBorders>
-              <w:top w:val="single" w:color="000000" w:sz="6"/>
-              <w:left w:val="single" w:color="000000" w:sz="6"/>
-              <w:bottom w:val="single" w:color="000000" w:sz="6"/>
-              <w:right w:val="single" w:color="000000" w:sz="6"/>
-            </w:tcBorders>
-            <w:tcMar>
-              <w:top w:type="dxa" w:w="40"/>
-              <w:left w:type="dxa" w:w="80"/>
-              <w:bottom w:type="dxa" w:w="40"/>
-              <w:right w:type="dxa" w:w="80"/>
-            </w:tcMar>
-            <w:vAlign w:val="center"/>
-          </w:tcPr>
-          <w:p>
-            <w:pPr>
-              <w:jc w:val="center"/>
-            </w:pPr>
-          </w:p>
-        </w:tc>
-        <w:tc>
-          <w:tcPr>
-            <w:tcW w:type="dxa" w:w="1900"/>
-            <w:tcBorders>
-              <w:top w:val="single" w:color="000000" w:sz="6"/>
-              <w:left w:val="single" w:color="000000" w:sz="6"/>
-              <w:bottom w:val="single" w:color="000000" w:sz="6"/>
-              <w:right w:val="single" w:color="000000" w:sz="6"/>
-            </w:tcBorders>
-            <w:tcMar>
-              <w:top w:type="dxa" w:w="40"/>
-              <w:left w:type="dxa" w:w="80"/>
-              <w:bottom w:type="dxa" w:w="40"/>
-              <w:right w:type="dxa" w:w="80"/>
-            </w:tcMar>
-            <w:vAlign w:val="center"/>
-          </w:tcPr>
-          <w:p>
-            <w:pPr>
-              <w:jc w:val="center"/>
-            </w:pPr>
-          </w:p>
-        </w:tc>
-        <w:tc>
-          <w:tcPr>
-            <w:tcW w:type="dxa" w:w="3600"/>
-            <w:tcBorders>
-              <w:top w:val="single" w:color="000000" w:sz="6"/>
-              <w:left w:val="single" w:color="000000" w:sz="6"/>
-              <w:bottom w:val="single" w:color="000000" w:sz="6"/>
-              <w:right w:val="single" w:color="000000" w:sz="6"/>
-            </w:tcBorders>
-            <w:tcMar>
-              <w:top w:type="dxa" w:w="40"/>
-              <w:left w:type="dxa" w:w="80"/>
-              <w:bottom w:type="dxa" w:w="40"/>
-              <w:right w:type="dxa" w:w="80"/>
-            </w:tcMar>
-            <w:vAlign w:val="center"/>
-          </w:tcPr>
-          <w:p>
-            <w:pPr>
-              <w:jc w:val="center"/>
-            </w:pPr>
-          </w:p>
-        </w:tc>
-        <w:tc>
-          <w:tcPr>
-            <w:tcW w:type="dxa" w:w="2600"/>
-            <w:tcBorders>
-              <w:top w:val="single" w:color="000000" w:sz="6"/>
-              <w:left w:val="single" w:color="000000" w:sz="6"/>
-              <w:bottom w:val="single" w:color="000000" w:sz="6"/>
-              <w:right w:val="single" w:color="000000" w:sz="6"/>
-            </w:tcBorders>
-            <w:tcMar>
-              <w:top w:type="dxa" w:w="40"/>
-              <w:left w:type="dxa" w:w="80"/>
-              <w:bottom w:type="dxa" w:w="40"/>
-              <w:right w:type="dxa" w:w="80"/>
-            </w:tcMar>
-            <w:vAlign w:val="center"/>
-          </w:tcPr>
-          <w:p>
-            <w:pPr>
-              <w:jc w:val="center"/>
-            </w:pPr>
-          </w:p>
-        </w:tc>
-        <w:tc>
-          <w:tcPr>
-            <w:tcW w:type="dxa" w:w="2200"/>
-            <w:tcBorders>
-              <w:top w:val="single" w:color="000000" w:sz="6"/>
-              <w:left w:val="single" w:color="000000" w:sz="6"/>
-              <w:bottom w:val="single" w:color="000000" w:sz="6"/>
-              <w:right w:val="single" w:color="000000" w:sz="6"/>
-            </w:tcBorders>
-            <w:tcMar>
-              <w:top w:type="dxa" w:w="40"/>
-              <w:left w:type="dxa" w:w="80"/>
-              <w:bottom w:type="dxa" w:w="40"/>
-              <w:right w:type="dxa" w:w="80"/>
-            </w:tcMar>
-            <w:vAlign w:val="center"/>
-          </w:tcPr>
-          <w:p>
-            <w:pPr>
-              <w:jc w:val="center"/>
-            </w:pPr>
-          </w:p>
-        </w:tc>
-        <w:tc>
-          <w:tcPr>
-            <w:tcW w:type="dxa" w:w="1538"/>
-            <w:tcBorders>
-              <w:top w:val="single" w:color="000000" w:sz="6"/>
-              <w:left w:val="single" w:color="000000" w:sz="6"/>
-              <w:bottom w:val="single" w:color="000000" w:sz="6"/>
-              <w:right w:val="single" w:color="000000" w:sz="6"/>
-            </w:tcBorders>
-            <w:tcMar>
-              <w:top w:type="dxa" w:w="40"/>
-              <w:left w:type="dxa" w:w="80"/>
-              <w:bottom w:type="dxa" w:w="40"/>
-              <w:right w:type="dxa" w:w="80"/>
-            </w:tcMar>
-            <w:vAlign w:val="center"/>
-          </w:tcPr>
-          <w:p>
-            <w:pPr>
-              <w:jc w:val="center"/>
-            </w:pPr>
-          </w:p>
-        </w:tc>
-      </w:tr>
-      <w:tr>
-        <w:trPr>
-          <w:cantSplit/>
-          <w:trHeight w:val="560" w:hRule="atLeast"/>
-        </w:trPr>
-        <w:tc>
-          <w:tcPr>
-            <w:tcW w:type="dxa" w:w="700"/>
-            <w:tcBorders>
-              <w:top w:val="single" w:color="000000" w:sz="6"/>
-              <w:left w:val="single" w:color="000000" w:sz="6"/>
-              <w:bottom w:val="single" w:color="000000" w:sz="6"/>
-              <w:right w:val="single" w:color="000000" w:sz="6"/>
-            </w:tcBorders>
-            <w:tcMar>
-              <w:top w:type="dxa" w:w="40"/>
-              <w:left w:type="dxa" w:w="80"/>
-              <w:bottom w:type="dxa" w:w="40"/>
-              <w:right w:type="dxa" w:w="80"/>
-            </w:tcMar>
-            <w:vAlign w:val="center"/>
-          </w:tcPr>
-          <w:p>
-            <w:pPr>
-              <w:jc w:val="center"/>
-            </w:pPr>
-            <w:r>
-              <w:rPr>
-                <w:rFonts w:ascii="맑은 고딕" w:cs="맑은 고딕" w:eastAsia="맑은 고딕" w:hAnsi="맑은 고딕"/>
-                <w:b w:val="false"/>
-                <w:bCs w:val="false"/>
-                <w:sz w:val="18"/>
-                <w:szCs w:val="18"/>
-              </w:rPr>
-              <w:t xml:space="preserve">2</w:t>
-            </w:r>
-          </w:p>
-        </w:tc>
-        <w:tc>
-          <w:tcPr>
-            <w:tcW w:type="dxa" w:w="2300"/>
-            <w:tcBorders>
-              <w:top w:val="single" w:color="000000" w:sz="6"/>
-              <w:left w:val="single" w:color="000000" w:sz="6"/>
-              <w:bottom w:val="single" w:color="000000" w:sz="6"/>
-              <w:right w:val="single" w:color="000000" w:sz="6"/>
-            </w:tcBorders>
-            <w:tcMar>
-              <w:top w:type="dxa" w:w="40"/>
-              <w:left w:type="dxa" w:w="80"/>
-              <w:bottom w:type="dxa" w:w="40"/>
-              <w:right w:type="dxa" w:w="80"/>
-            </w:tcMar>
-            <w:vAlign w:val="center"/>
-          </w:tcPr>
-          <w:p>
-            <w:pPr>
-              <w:jc w:val="center"/>
-            </w:pPr>
-          </w:p>
-        </w:tc>
-        <w:tc>
-          <w:tcPr>
-            <w:tcW w:type="dxa" w:w="1900"/>
-            <w:tcBorders>
-              <w:top w:val="single" w:color="000000" w:sz="6"/>
-              <w:left w:val="single" w:color="000000" w:sz="6"/>
-              <w:bottom w:val="single" w:color="000000" w:sz="6"/>
-              <w:right w:val="single" w:color="000000" w:sz="6"/>
-            </w:tcBorders>
-            <w:tcMar>
-              <w:top w:type="dxa" w:w="40"/>
-              <w:left w:type="dxa" w:w="80"/>
-              <w:bottom w:type="dxa" w:w="40"/>
-              <w:right w:type="dxa" w:w="80"/>
-            </w:tcMar>
-            <w:vAlign w:val="center"/>
-          </w:tcPr>
-          <w:p>
-            <w:pPr>
-              <w:jc w:val="center"/>
-            </w:pPr>
-          </w:p>
-        </w:tc>
-        <w:tc>
-          <w:tcPr>
-            <w:tcW w:type="dxa" w:w="3600"/>
-            <w:tcBorders>
-              <w:top w:val="single" w:color="000000" w:sz="6"/>
-              <w:left w:val="single" w:color="000000" w:sz="6"/>
-              <w:bottom w:val="single" w:color="000000" w:sz="6"/>
-              <w:right w:val="single" w:color="000000" w:sz="6"/>
-            </w:tcBorders>
-            <w:tcMar>
-              <w:top w:type="dxa" w:w="40"/>
-              <w:left w:type="dxa" w:w="80"/>
-              <w:bottom w:type="dxa" w:w="40"/>
-              <w:right w:type="dxa" w:w="80"/>
-            </w:tcMar>
-            <w:vAlign w:val="center"/>
-          </w:tcPr>
-          <w:p>
-            <w:pPr>
-              <w:jc w:val="center"/>
-            </w:pPr>
-          </w:p>
-        </w:tc>
-        <w:tc>
-          <w:tcPr>
-            <w:tcW w:type="dxa" w:w="2600"/>
-            <w:tcBorders>
-              <w:top w:val="single" w:color="000000" w:sz="6"/>
-              <w:left w:val="single" w:color="000000" w:sz="6"/>
-              <w:bottom w:val="single" w:color="000000" w:sz="6"/>
-              <w:right w:val="single" w:color="000000" w:sz="6"/>
-            </w:tcBorders>
-            <w:tcMar>
-              <w:top w:type="dxa" w:w="40"/>
-              <w:left w:type="dxa" w:w="80"/>
-              <w:bottom w:type="dxa" w:w="40"/>
-              <w:right w:type="dxa" w:w="80"/>
-            </w:tcMar>
-            <w:vAlign w:val="center"/>
-          </w:tcPr>
-          <w:p>
-            <w:pPr>
-              <w:jc w:val="center"/>
-            </w:pPr>
-          </w:p>
-        </w:tc>
-        <w:tc>
-          <w:tcPr>
-            <w:tcW w:type="dxa" w:w="2200"/>
-            <w:tcBorders>
-              <w:top w:val="single" w:color="000000" w:sz="6"/>
-              <w:left w:val="single" w:color="000000" w:sz="6"/>
-              <w:bottom w:val="single" w:color="000000" w:sz="6"/>
-              <w:right w:val="single" w:color="000000" w:sz="6"/>
-            </w:tcBorders>
-            <w:tcMar>
-              <w:top w:type="dxa" w:w="40"/>
-              <w:left w:type="dxa" w:w="80"/>
-              <w:bottom w:type="dxa" w:w="40"/>
-              <w:right w:type="dxa" w:w="80"/>
-            </w:tcMar>
-            <w:vAlign w:val="center"/>
-          </w:tcPr>
-          <w:p>
-            <w:pPr>
-              <w:jc w:val="center"/>
-            </w:pPr>
-          </w:p>
-        </w:tc>
-        <w:tc>
-          <w:tcPr>
-            <w:tcW w:type="dxa" w:w="1538"/>
-            <w:tcBorders>
-              <w:top w:val="single" w:color="000000" w:sz="6"/>
-              <w:left w:val="single" w:color="000000" w:sz="6"/>
-              <w:bottom w:val="single" w:color="000000" w:sz="6"/>
-              <w:right w:val="single" w:color="000000" w:sz="6"/>
-            </w:tcBorders>
-            <w:tcMar>
-              <w:top w:type="dxa" w:w="40"/>
-              <w:left w:type="dxa" w:w="80"/>
-              <w:bottom w:type="dxa" w:w="40"/>
-              <w:right w:type="dxa" w:w="80"/>
-            </w:tcMar>
-            <w:vAlign w:val="center"/>
-          </w:tcPr>
-          <w:p>
-            <w:pPr>
-              <w:jc w:val="center"/>
-            </w:pPr>
-          </w:p>
-        </w:tc>
-      </w:tr>
-      <w:tr>
-        <w:trPr>
-          <w:cantSplit/>
-          <w:trHeight w:val="560" w:hRule="atLeast"/>
-        </w:trPr>
-        <w:tc>
-          <w:tcPr>
-            <w:tcW w:type="dxa" w:w="700"/>
-            <w:tcBorders>
-              <w:top w:val="single" w:color="000000" w:sz="6"/>
-              <w:left w:val="single" w:color="000000" w:sz="6"/>
-              <w:bottom w:val="single" w:color="000000" w:sz="6"/>
-              <w:right w:val="single" w:color="000000" w:sz="6"/>
-            </w:tcBorders>
-            <w:tcMar>
-              <w:top w:type="dxa" w:w="40"/>
-              <w:left w:type="dxa" w:w="80"/>
-              <w:bottom w:type="dxa" w:w="40"/>
-              <w:right w:type="dxa" w:w="80"/>
-            </w:tcMar>
-            <w:vAlign w:val="center"/>
-          </w:tcPr>
-          <w:p>
-            <w:pPr>
-              <w:jc w:val="center"/>
-            </w:pPr>
-            <w:r>
-              <w:rPr>
-                <w:rFonts w:ascii="맑은 고딕" w:cs="맑은 고딕" w:eastAsia="맑은 고딕" w:hAnsi="맑은 고딕"/>
-                <w:b w:val="false"/>
-                <w:bCs w:val="false"/>
-                <w:sz w:val="18"/>
-                <w:szCs w:val="18"/>
-              </w:rPr>
-              <w:t xml:space="preserve">3</w:t>
-            </w:r>
-          </w:p>
-        </w:tc>
-        <w:tc>
-          <w:tcPr>
-            <w:tcW w:type="dxa" w:w="2300"/>
-            <w:tcBorders>
-              <w:top w:val="single" w:color="000000" w:sz="6"/>
-              <w:left w:val="single" w:color="000000" w:sz="6"/>
-              <w:bottom w:val="single" w:color="000000" w:sz="6"/>
-              <w:right w:val="single" w:color="000000" w:sz="6"/>
-            </w:tcBorders>
-            <w:tcMar>
-              <w:top w:type="dxa" w:w="40"/>
-              <w:left w:type="dxa" w:w="80"/>
-              <w:bottom w:type="dxa" w:w="40"/>
-              <w:right w:type="dxa" w:w="80"/>
-            </w:tcMar>
-            <w:vAlign w:val="center"/>
-          </w:tcPr>
-          <w:p>
-            <w:pPr>
-              <w:jc w:val="center"/>
-            </w:pPr>
-          </w:p>
-        </w:tc>
-        <w:tc>
-          <w:tcPr>
-            <w:tcW w:type="dxa" w:w="1900"/>
-            <w:tcBorders>
-              <w:top w:val="single" w:color="000000" w:sz="6"/>
-              <w:left w:val="single" w:color="000000" w:sz="6"/>
-              <w:bottom w:val="single" w:color="000000" w:sz="6"/>
-              <w:right w:val="single" w:color="000000" w:sz="6"/>
-            </w:tcBorders>
-            <w:tcMar>
-              <w:top w:type="dxa" w:w="40"/>
-              <w:left w:type="dxa" w:w="80"/>
-              <w:bottom w:type="dxa" w:w="40"/>
-              <w:right w:type="dxa" w:w="80"/>
-            </w:tcMar>
-            <w:vAlign w:val="center"/>
-          </w:tcPr>
-          <w:p>
-            <w:pPr>
-              <w:jc w:val="center"/>
-            </w:pPr>
-          </w:p>
-        </w:tc>
-        <w:tc>
-          <w:tcPr>
-            <w:tcW w:type="dxa" w:w="3600"/>
-            <w:tcBorders>
-              <w:top w:val="single" w:color="000000" w:sz="6"/>
-              <w:left w:val="single" w:color="000000" w:sz="6"/>
-              <w:bottom w:val="single" w:color="000000" w:sz="6"/>
-              <w:right w:val="single" w:color="000000" w:sz="6"/>
-            </w:tcBorders>
-            <w:tcMar>
-              <w:top w:type="dxa" w:w="40"/>
-              <w:left w:type="dxa" w:w="80"/>
-              <w:bottom w:type="dxa" w:w="40"/>
-              <w:right w:type="dxa" w:w="80"/>
-            </w:tcMar>
-            <w:vAlign w:val="center"/>
-          </w:tcPr>
-          <w:p>
-            <w:pPr>
-              <w:jc w:val="center"/>
-            </w:pPr>
-          </w:p>
-        </w:tc>
-        <w:tc>
-          <w:tcPr>
-            <w:tcW w:type="dxa" w:w="2600"/>
-            <w:tcBorders>
-              <w:top w:val="single" w:color="000000" w:sz="6"/>
-              <w:left w:val="single" w:color="000000" w:sz="6"/>
-              <w:bottom w:val="single" w:color="000000" w:sz="6"/>
-              <w:right w:val="single" w:color="000000" w:sz="6"/>
-            </w:tcBorders>
-            <w:tcMar>
-              <w:top w:type="dxa" w:w="40"/>
-              <w:left w:type="dxa" w:w="80"/>
-              <w:bottom w:type="dxa" w:w="40"/>
-              <w:right w:type="dxa" w:w="80"/>
-            </w:tcMar>
-            <w:vAlign w:val="center"/>
-          </w:tcPr>
-          <w:p>
-            <w:pPr>
-              <w:jc w:val="center"/>
-            </w:pPr>
-          </w:p>
-        </w:tc>
-        <w:tc>
-          <w:tcPr>
-            <w:tcW w:type="dxa" w:w="2200"/>
-            <w:tcBorders>
-              <w:top w:val="single" w:color="000000" w:sz="6"/>
-              <w:left w:val="single" w:color="000000" w:sz="6"/>
-              <w:bottom w:val="single" w:color="000000" w:sz="6"/>
-              <w:right w:val="single" w:color="000000" w:sz="6"/>
-            </w:tcBorders>
-            <w:tcMar>
-              <w:top w:type="dxa" w:w="40"/>
-              <w:left w:type="dxa" w:w="80"/>
-              <w:bottom w:type="dxa" w:w="40"/>
-              <w:right w:type="dxa" w:w="80"/>
-            </w:tcMar>
-            <w:vAlign w:val="center"/>
-          </w:tcPr>
-          <w:p>
-            <w:pPr>
-              <w:jc w:val="center"/>
-            </w:pPr>
-          </w:p>
-        </w:tc>
-        <w:tc>
-          <w:tcPr>
-            <w:tcW w:type="dxa" w:w="1538"/>
-            <w:tcBorders>
-              <w:top w:val="single" w:color="000000" w:sz="6"/>
-              <w:left w:val="single" w:color="000000" w:sz="6"/>
-              <w:bottom w:val="single" w:color="000000" w:sz="6"/>
-              <w:right w:val="single" w:color="000000" w:sz="6"/>
-            </w:tcBorders>
-            <w:tcMar>
-              <w:top w:type="dxa" w:w="40"/>
-              <w:left w:type="dxa" w:w="80"/>
-              <w:bottom w:type="dxa" w:w="40"/>
-              <w:right w:type="dxa" w:w="80"/>
-            </w:tcMar>
-            <w:vAlign w:val="center"/>
-          </w:tcPr>
-          <w:p>
-            <w:pPr>
-              <w:jc w:val="center"/>
-            </w:pPr>
-          </w:p>
-        </w:tc>
-      </w:tr>
-      <w:tr>
-        <w:trPr>
-          <w:cantSplit/>
-          <w:trHeight w:val="560" w:hRule="atLeast"/>
-        </w:trPr>
-        <w:tc>
-          <w:tcPr>
-            <w:tcW w:type="dxa" w:w="700"/>
-            <w:tcBorders>
-              <w:top w:val="single" w:color="000000" w:sz="6"/>
-              <w:left w:val="single" w:color="000000" w:sz="6"/>
-              <w:bottom w:val="single" w:color="000000" w:sz="6"/>
-              <w:right w:val="single" w:color="000000" w:sz="6"/>
-            </w:tcBorders>
-            <w:tcMar>
-              <w:top w:type="dxa" w:w="40"/>
-              <w:left w:type="dxa" w:w="80"/>
-              <w:bottom w:type="dxa" w:w="40"/>
-              <w:right w:type="dxa" w:w="80"/>
-            </w:tcMar>
-            <w:vAlign w:val="center"/>
-          </w:tcPr>
-          <w:p>
-            <w:pPr>
-              <w:jc w:val="center"/>
-            </w:pPr>
-            <w:r>
-              <w:rPr>
-                <w:rFonts w:ascii="맑은 고딕" w:cs="맑은 고딕" w:eastAsia="맑은 고딕" w:hAnsi="맑은 고딕"/>
-                <w:b w:val="false"/>
-                <w:bCs w:val="false"/>
-                <w:sz w:val="18"/>
-                <w:szCs w:val="18"/>
-              </w:rPr>
-              <w:t xml:space="preserve">4</w:t>
-            </w:r>
-          </w:p>
-        </w:tc>
-        <w:tc>
-          <w:tcPr>
-            <w:tcW w:type="dxa" w:w="2300"/>
-            <w:tcBorders>
-              <w:top w:val="single" w:color="000000" w:sz="6"/>
-              <w:left w:val="single" w:color="000000" w:sz="6"/>
-              <w:bottom w:val="single" w:color="000000" w:sz="6"/>
-              <w:right w:val="single" w:color="000000" w:sz="6"/>
-            </w:tcBorders>
-            <w:tcMar>
-              <w:top w:type="dxa" w:w="40"/>
-              <w:left w:type="dxa" w:w="80"/>
-              <w:bottom w:type="dxa" w:w="40"/>
-              <w:right w:type="dxa" w:w="80"/>
-            </w:tcMar>
-            <w:vAlign w:val="center"/>
-          </w:tcPr>
-          <w:p>
-            <w:pPr>
-              <w:jc w:val="center"/>
-            </w:pPr>
-          </w:p>
-        </w:tc>
-        <w:tc>
-          <w:tcPr>
-            <w:tcW w:type="dxa" w:w="1900"/>
-            <w:tcBorders>
-              <w:top w:val="single" w:color="000000" w:sz="6"/>
-              <w:left w:val="single" w:color="000000" w:sz="6"/>
-              <w:bottom w:val="single" w:color="000000" w:sz="6"/>
-              <w:right w:val="single" w:color="000000" w:sz="6"/>
-            </w:tcBorders>
-            <w:tcMar>
-              <w:top w:type="dxa" w:w="40"/>
-              <w:left w:type="dxa" w:w="80"/>
-              <w:bottom w:type="dxa" w:w="40"/>
-              <w:right w:type="dxa" w:w="80"/>
-            </w:tcMar>
-            <w:vAlign w:val="center"/>
-          </w:tcPr>
-          <w:p>
-            <w:pPr>
-              <w:jc w:val="center"/>
-            </w:pPr>
-          </w:p>
-        </w:tc>
-        <w:tc>
-          <w:tcPr>
-            <w:tcW w:type="dxa" w:w="3600"/>
-            <w:tcBorders>
-              <w:top w:val="single" w:color="000000" w:sz="6"/>
-              <w:left w:val="single" w:color="000000" w:sz="6"/>
-              <w:bottom w:val="single" w:color="000000" w:sz="6"/>
-              <w:right w:val="single" w:color="000000" w:sz="6"/>
-            </w:tcBorders>
-            <w:tcMar>
-              <w:top w:type="dxa" w:w="40"/>
-              <w:left w:type="dxa" w:w="80"/>
-              <w:bottom w:type="dxa" w:w="40"/>
-              <w:right w:type="dxa" w:w="80"/>
-            </w:tcMar>
-            <w:vAlign w:val="center"/>
-          </w:tcPr>
-          <w:p>
-            <w:pPr>
-              <w:jc w:val="center"/>
-            </w:pPr>
-          </w:p>
-        </w:tc>
-        <w:tc>
-          <w:tcPr>
-            <w:tcW w:type="dxa" w:w="2600"/>
-            <w:tcBorders>
-              <w:top w:val="single" w:color="000000" w:sz="6"/>
-              <w:left w:val="single" w:color="000000" w:sz="6"/>
-              <w:bottom w:val="single" w:color="000000" w:sz="6"/>
-              <w:right w:val="single" w:color="000000" w:sz="6"/>
-            </w:tcBorders>
-            <w:tcMar>
-              <w:top w:type="dxa" w:w="40"/>
-              <w:left w:type="dxa" w:w="80"/>
-              <w:bottom w:type="dxa" w:w="40"/>
-              <w:right w:type="dxa" w:w="80"/>
-            </w:tcMar>
-            <w:vAlign w:val="center"/>
-          </w:tcPr>
-          <w:p>
-            <w:pPr>
-              <w:jc w:val="center"/>
-            </w:pPr>
-          </w:p>
-        </w:tc>
-        <w:tc>
-          <w:tcPr>
-            <w:tcW w:type="dxa" w:w="2200"/>
-            <w:tcBorders>
-              <w:top w:val="single" w:color="000000" w:sz="6"/>
-              <w:left w:val="single" w:color="000000" w:sz="6"/>
-              <w:bottom w:val="single" w:color="000000" w:sz="6"/>
-              <w:right w:val="single" w:color="000000" w:sz="6"/>
-            </w:tcBorders>
-            <w:tcMar>
-              <w:top w:type="dxa" w:w="40"/>
-              <w:left w:type="dxa" w:w="80"/>
-              <w:bottom w:type="dxa" w:w="40"/>
-              <w:right w:type="dxa" w:w="80"/>
-            </w:tcMar>
-            <w:vAlign w:val="center"/>
-          </w:tcPr>
-          <w:p>
-            <w:pPr>
-              <w:jc w:val="center"/>
-            </w:pPr>
-          </w:p>
-        </w:tc>
-        <w:tc>
-          <w:tcPr>
-            <w:tcW w:type="dxa" w:w="1538"/>
-            <w:tcBorders>
-              <w:top w:val="single" w:color="000000" w:sz="6"/>
-              <w:left w:val="single" w:color="000000" w:sz="6"/>
-              <w:bottom w:val="single" w:color="000000" w:sz="6"/>
-              <w:right w:val="single" w:color="000000" w:sz="6"/>
-            </w:tcBorders>
-            <w:tcMar>
-              <w:top w:type="dxa" w:w="40"/>
-              <w:left w:type="dxa" w:w="80"/>
-              <w:bottom w:type="dxa" w:w="40"/>
-              <w:right w:type="dxa" w:w="80"/>
-            </w:tcMar>
-            <w:vAlign w:val="center"/>
-          </w:tcPr>
-          <w:p>
-            <w:pPr>
-              <w:jc w:val="center"/>
-            </w:pPr>
-          </w:p>
-        </w:tc>
-      </w:tr>
-      <w:tr>
-        <w:trPr>
-          <w:cantSplit/>
-          <w:trHeight w:val="560" w:hRule="atLeast"/>
-        </w:trPr>
-        <w:tc>
-          <w:tcPr>
-            <w:tcW w:type="dxa" w:w="700"/>
-            <w:tcBorders>
-              <w:top w:val="single" w:color="000000" w:sz="6"/>
-              <w:left w:val="single" w:color="000000" w:sz="6"/>
-              <w:bottom w:val="single" w:color="000000" w:sz="6"/>
-              <w:right w:val="single" w:color="000000" w:sz="6"/>
-            </w:tcBorders>
-            <w:tcMar>
-              <w:top w:type="dxa" w:w="40"/>
-              <w:left w:type="dxa" w:w="80"/>
-              <w:bottom w:type="dxa" w:w="40"/>
-              <w:right w:type="dxa" w:w="80"/>
-            </w:tcMar>
-            <w:vAlign w:val="center"/>
-          </w:tcPr>
-          <w:p>
-            <w:pPr>
-              <w:jc w:val="center"/>
-            </w:pPr>
-            <w:r>
-              <w:rPr>
-                <w:rFonts w:ascii="맑은 고딕" w:cs="맑은 고딕" w:eastAsia="맑은 고딕" w:hAnsi="맑은 고딕"/>
-                <w:b w:val="false"/>
-                <w:bCs w:val="false"/>
-                <w:sz w:val="18"/>
-                <w:szCs w:val="18"/>
-              </w:rPr>
-              <w:t xml:space="preserve">5</w:t>
-            </w:r>
-          </w:p>
-        </w:tc>
-        <w:tc>
-          <w:tcPr>
-            <w:tcW w:type="dxa" w:w="2300"/>
-            <w:tcBorders>
-              <w:top w:val="single" w:color="000000" w:sz="6"/>
-              <w:left w:val="single" w:color="000000" w:sz="6"/>
-              <w:bottom w:val="single" w:color="000000" w:sz="6"/>
-              <w:right w:val="single" w:color="000000" w:sz="6"/>
-            </w:tcBorders>
-            <w:tcMar>
-              <w:top w:type="dxa" w:w="40"/>
-              <w:left w:type="dxa" w:w="80"/>
-              <w:bottom w:type="dxa" w:w="40"/>
-              <w:right w:type="dxa" w:w="80"/>
-            </w:tcMar>
-            <w:vAlign w:val="center"/>
-          </w:tcPr>
-          <w:p>
-            <w:pPr>
-              <w:jc w:val="center"/>
-            </w:pPr>
-          </w:p>
-        </w:tc>
-        <w:tc>
-          <w:tcPr>
-            <w:tcW w:type="dxa" w:w="1900"/>
-            <w:tcBorders>
-              <w:top w:val="single" w:color="000000" w:sz="6"/>
-              <w:left w:val="single" w:color="000000" w:sz="6"/>
-              <w:bottom w:val="single" w:color="000000" w:sz="6"/>
-              <w:right w:val="single" w:color="000000" w:sz="6"/>
-            </w:tcBorders>
-            <w:tcMar>
-              <w:top w:type="dxa" w:w="40"/>
-              <w:left w:type="dxa" w:w="80"/>
-              <w:bottom w:type="dxa" w:w="40"/>
-              <w:right w:type="dxa" w:w="80"/>
-            </w:tcMar>
-            <w:vAlign w:val="center"/>
-          </w:tcPr>
-          <w:p>
-            <w:pPr>
-              <w:jc w:val="center"/>
-            </w:pPr>
-          </w:p>
-        </w:tc>
-        <w:tc>
-          <w:tcPr>
-            <w:tcW w:type="dxa" w:w="3600"/>
-            <w:tcBorders>
-              <w:top w:val="single" w:color="000000" w:sz="6"/>
-              <w:left w:val="single" w:color="000000" w:sz="6"/>
-              <w:bottom w:val="single" w:color="000000" w:sz="6"/>
-              <w:right w:val="single" w:color="000000" w:sz="6"/>
-            </w:tcBorders>
-            <w:tcMar>
-              <w:top w:type="dxa" w:w="40"/>
-              <w:left w:type="dxa" w:w="80"/>
-              <w:bottom w:type="dxa" w:w="40"/>
-              <w:right w:type="dxa" w:w="80"/>
-            </w:tcMar>
-            <w:vAlign w:val="center"/>
-          </w:tcPr>
-          <w:p>
-            <w:pPr>
-              <w:jc w:val="center"/>
-            </w:pPr>
-          </w:p>
-        </w:tc>
-        <w:tc>
-          <w:tcPr>
-            <w:tcW w:type="dxa" w:w="2600"/>
-            <w:tcBorders>
-              <w:top w:val="single" w:color="000000" w:sz="6"/>
-              <w:left w:val="single" w:color="000000" w:sz="6"/>
-              <w:bottom w:val="single" w:color="000000" w:sz="6"/>
-              <w:right w:val="single" w:color="000000" w:sz="6"/>
-            </w:tcBorders>
-            <w:tcMar>
-              <w:top w:type="dxa" w:w="40"/>
-              <w:left w:type="dxa" w:w="80"/>
-              <w:bottom w:type="dxa" w:w="40"/>
-              <w:right w:type="dxa" w:w="80"/>
-            </w:tcMar>
-            <w:vAlign w:val="center"/>
-          </w:tcPr>
-          <w:p>
-            <w:pPr>
-              <w:jc w:val="center"/>
-            </w:pPr>
-          </w:p>
-        </w:tc>
-        <w:tc>
-          <w:tcPr>
-            <w:tcW w:type="dxa" w:w="2200"/>
-            <w:tcBorders>
-              <w:top w:val="single" w:color="000000" w:sz="6"/>
-              <w:left w:val="single" w:color="000000" w:sz="6"/>
-              <w:bottom w:val="single" w:color="000000" w:sz="6"/>
-              <w:right w:val="single" w:color="000000" w:sz="6"/>
-            </w:tcBorders>
-            <w:tcMar>
-              <w:top w:type="dxa" w:w="40"/>
-              <w:left w:type="dxa" w:w="80"/>
-              <w:bottom w:type="dxa" w:w="40"/>
-              <w:right w:type="dxa" w:w="80"/>
-            </w:tcMar>
-            <w:vAlign w:val="center"/>
-          </w:tcPr>
-          <w:p>
-            <w:pPr>
-              <w:jc w:val="center"/>
-            </w:pPr>
-          </w:p>
-        </w:tc>
-        <w:tc>
-          <w:tcPr>
-            <w:tcW w:type="dxa" w:w="1538"/>
-            <w:tcBorders>
-              <w:top w:val="single" w:color="000000" w:sz="6"/>
-              <w:left w:val="single" w:color="000000" w:sz="6"/>
-              <w:bottom w:val="single" w:color="000000" w:sz="6"/>
-              <w:right w:val="single" w:color="000000" w:sz="6"/>
-            </w:tcBorders>
-            <w:tcMar>
-              <w:top w:type="dxa" w:w="40"/>
-              <w:left w:type="dxa" w:w="80"/>
-              <w:bottom w:type="dxa" w:w="40"/>
-              <w:right w:type="dxa" w:w="80"/>
-            </w:tcMar>
-            <w:vAlign w:val="center"/>
-          </w:tcPr>
-          <w:p>
-            <w:pPr>
-              <w:jc w:val="center"/>
-            </w:pPr>
-          </w:p>
-        </w:tc>
-      </w:tr>
-      <w:tr>
-        <w:trPr>
-          <w:cantSplit/>
-          <w:trHeight w:val="560" w:hRule="atLeast"/>
-        </w:trPr>
-        <w:tc>
-          <w:tcPr>
-            <w:tcW w:type="dxa" w:w="700"/>
-            <w:tcBorders>
-              <w:top w:val="single" w:color="000000" w:sz="6"/>
-              <w:left w:val="single" w:color="000000" w:sz="6"/>
-              <w:bottom w:val="single" w:color="000000" w:sz="6"/>
-              <w:right w:val="single" w:color="000000" w:sz="6"/>
-            </w:tcBorders>
-            <w:tcMar>
-              <w:top w:type="dxa" w:w="40"/>
-              <w:left w:type="dxa" w:w="80"/>
-              <w:bottom w:type="dxa" w:w="40"/>
-              <w:right w:type="dxa" w:w="80"/>
-            </w:tcMar>
-            <w:vAlign w:val="center"/>
-          </w:tcPr>
-          <w:p>
-            <w:pPr>
-              <w:jc w:val="center"/>
-            </w:pPr>
-            <w:r>
-              <w:rPr>
-                <w:rFonts w:ascii="맑은 고딕" w:cs="맑은 고딕" w:eastAsia="맑은 고딕" w:hAnsi="맑은 고딕"/>
-                <w:b w:val="false"/>
-                <w:bCs w:val="false"/>
-                <w:sz w:val="18"/>
-                <w:szCs w:val="18"/>
-              </w:rPr>
-              <w:t xml:space="preserve">6</w:t>
-            </w:r>
-          </w:p>
-        </w:tc>
-        <w:tc>
-          <w:tcPr>
-            <w:tcW w:type="dxa" w:w="2300"/>
-            <w:tcBorders>
-              <w:top w:val="single" w:color="000000" w:sz="6"/>
-              <w:left w:val="single" w:color="000000" w:sz="6"/>
-              <w:bottom w:val="single" w:color="000000" w:sz="6"/>
-              <w:right w:val="single" w:color="000000" w:sz="6"/>
-            </w:tcBorders>
-            <w:tcMar>
-              <w:top w:type="dxa" w:w="40"/>
-              <w:left w:type="dxa" w:w="80"/>
-              <w:bottom w:type="dxa" w:w="40"/>
-              <w:right w:type="dxa" w:w="80"/>
-            </w:tcMar>
-            <w:vAlign w:val="center"/>
-          </w:tcPr>
-          <w:p>
-            <w:pPr>
-              <w:jc w:val="center"/>
-            </w:pPr>
-          </w:p>
-        </w:tc>
-        <w:tc>
-          <w:tcPr>
-            <w:tcW w:type="dxa" w:w="1900"/>
-            <w:tcBorders>
-              <w:top w:val="single" w:color="000000" w:sz="6"/>
-              <w:left w:val="single" w:color="000000" w:sz="6"/>
-              <w:bottom w:val="single" w:color="000000" w:sz="6"/>
-              <w:right w:val="single" w:color="000000" w:sz="6"/>
-            </w:tcBorders>
-            <w:tcMar>
-              <w:top w:type="dxa" w:w="40"/>
-              <w:left w:type="dxa" w:w="80"/>
-              <w:bottom w:type="dxa" w:w="40"/>
-              <w:right w:type="dxa" w:w="80"/>
-            </w:tcMar>
-            <w:vAlign w:val="center"/>
-          </w:tcPr>
-          <w:p>
-            <w:pPr>
-              <w:jc w:val="center"/>
-            </w:pPr>
-          </w:p>
-        </w:tc>
-        <w:tc>
-          <w:tcPr>
-            <w:tcW w:type="dxa" w:w="3600"/>
-            <w:tcBorders>
-              <w:top w:val="single" w:color="000000" w:sz="6"/>
-              <w:left w:val="single" w:color="000000" w:sz="6"/>
-              <w:bottom w:val="single" w:color="000000" w:sz="6"/>
-              <w:right w:val="single" w:color="000000" w:sz="6"/>
-            </w:tcBorders>
-            <w:tcMar>
-              <w:top w:type="dxa" w:w="40"/>
-              <w:left w:type="dxa" w:w="80"/>
-              <w:bottom w:type="dxa" w:w="40"/>
-              <w:right w:type="dxa" w:w="80"/>
-            </w:tcMar>
-            <w:vAlign w:val="center"/>
-          </w:tcPr>
-          <w:p>
-            <w:pPr>
-              <w:jc w:val="center"/>
-            </w:pPr>
-          </w:p>
-        </w:tc>
-        <w:tc>
-          <w:tcPr>
-            <w:tcW w:type="dxa" w:w="2600"/>
-            <w:tcBorders>
-              <w:top w:val="single" w:color="000000" w:sz="6"/>
-              <w:left w:val="single" w:color="000000" w:sz="6"/>
-              <w:bottom w:val="single" w:color="000000" w:sz="6"/>
-              <w:right w:val="single" w:color="000000" w:sz="6"/>
-            </w:tcBorders>
-            <w:tcMar>
-              <w:top w:type="dxa" w:w="40"/>
-              <w:left w:type="dxa" w:w="80"/>
-              <w:bottom w:type="dxa" w:w="40"/>
-              <w:right w:type="dxa" w:w="80"/>
-            </w:tcMar>
-            <w:vAlign w:val="center"/>
-          </w:tcPr>
-          <w:p>
-            <w:pPr>
-              <w:jc w:val="center"/>
-            </w:pPr>
-          </w:p>
-        </w:tc>
-        <w:tc>
-          <w:tcPr>
-            <w:tcW w:type="dxa" w:w="2200"/>
-            <w:tcBorders>
-              <w:top w:val="single" w:color="000000" w:sz="6"/>
-              <w:left w:val="single" w:color="000000" w:sz="6"/>
-              <w:bottom w:val="single" w:color="000000" w:sz="6"/>
-              <w:right w:val="single" w:color="000000" w:sz="6"/>
-            </w:tcBorders>
-            <w:tcMar>
-              <w:top w:type="dxa" w:w="40"/>
-              <w:left w:type="dxa" w:w="80"/>
-              <w:bottom w:type="dxa" w:w="40"/>
-              <w:right w:type="dxa" w:w="80"/>
-            </w:tcMar>
-            <w:vAlign w:val="center"/>
-          </w:tcPr>
-          <w:p>
-            <w:pPr>
-              <w:jc w:val="center"/>
-            </w:pPr>
-          </w:p>
-        </w:tc>
-        <w:tc>
-          <w:tcPr>
-            <w:tcW w:type="dxa" w:w="1538"/>
-            <w:tcBorders>
-              <w:top w:val="single" w:color="000000" w:sz="6"/>
-              <w:left w:val="single" w:color="000000" w:sz="6"/>
-              <w:bottom w:val="single" w:color="000000" w:sz="6"/>
-              <w:right w:val="single" w:color="000000" w:sz="6"/>
-            </w:tcBorders>
-            <w:tcMar>
-              <w:top w:type="dxa" w:w="40"/>
-              <w:left w:type="dxa" w:w="80"/>
-              <w:bottom w:type="dxa" w:w="40"/>
-              <w:right w:type="dxa" w:w="80"/>
-            </w:tcMar>
-            <w:vAlign w:val="center"/>
-          </w:tcPr>
-          <w:p>
-            <w:pPr>
-              <w:jc w:val="center"/>
-            </w:pPr>
-          </w:p>
-        </w:tc>
-      </w:tr>
-      <w:tr>
-        <w:trPr>
-          <w:cantSplit/>
-          <w:trHeight w:val="560" w:hRule="atLeast"/>
-        </w:trPr>
-        <w:tc>
-          <w:tcPr>
-            <w:tcW w:type="dxa" w:w="700"/>
-            <w:tcBorders>
-              <w:top w:val="single" w:color="000000" w:sz="6"/>
-              <w:left w:val="single" w:color="000000" w:sz="6"/>
-              <w:bottom w:val="single" w:color="000000" w:sz="6"/>
-              <w:right w:val="single" w:color="000000" w:sz="6"/>
-            </w:tcBorders>
-            <w:tcMar>
-              <w:top w:type="dxa" w:w="40"/>
-              <w:left w:type="dxa" w:w="80"/>
-              <w:bottom w:type="dxa" w:w="40"/>
-              <w:right w:type="dxa" w:w="80"/>
-            </w:tcMar>
-            <w:vAlign w:val="center"/>
-          </w:tcPr>
-          <w:p>
-            <w:pPr>
-              <w:jc w:val="center"/>
-            </w:pPr>
-            <w:r>
-              <w:rPr>
-                <w:rFonts w:ascii="맑은 고딕" w:cs="맑은 고딕" w:eastAsia="맑은 고딕" w:hAnsi="맑은 고딕"/>
-                <w:b w:val="false"/>
-                <w:bCs w:val="false"/>
-                <w:sz w:val="18"/>
-                <w:szCs w:val="18"/>
-              </w:rPr>
-              <w:t xml:space="preserve">7</w:t>
-            </w:r>
-          </w:p>
-        </w:tc>
-        <w:tc>
-          <w:tcPr>
-            <w:tcW w:type="dxa" w:w="2300"/>
-            <w:tcBorders>
-              <w:top w:val="single" w:color="000000" w:sz="6"/>
-              <w:left w:val="single" w:color="000000" w:sz="6"/>
-              <w:bottom w:val="single" w:color="000000" w:sz="6"/>
-              <w:right w:val="single" w:color="000000" w:sz="6"/>
-            </w:tcBorders>
-            <w:tcMar>
-              <w:top w:type="dxa" w:w="40"/>
-              <w:left w:type="dxa" w:w="80"/>
-              <w:bottom w:type="dxa" w:w="40"/>
-              <w:right w:type="dxa" w:w="80"/>
-            </w:tcMar>
-            <w:vAlign w:val="center"/>
-          </w:tcPr>
-          <w:p>
-            <w:pPr>
-              <w:jc w:val="center"/>
-            </w:pPr>
-          </w:p>
-        </w:tc>
-        <w:tc>
-          <w:tcPr>
-            <w:tcW w:type="dxa" w:w="1900"/>
-            <w:tcBorders>
-              <w:top w:val="single" w:color="000000" w:sz="6"/>
-              <w:left w:val="single" w:color="000000" w:sz="6"/>
-              <w:bottom w:val="single" w:color="000000" w:sz="6"/>
-              <w:right w:val="single" w:color="000000" w:sz="6"/>
-            </w:tcBorders>
-            <w:tcMar>
-              <w:top w:type="dxa" w:w="40"/>
-              <w:left w:type="dxa" w:w="80"/>
-              <w:bottom w:type="dxa" w:w="40"/>
-              <w:right w:type="dxa" w:w="80"/>
-            </w:tcMar>
-            <w:vAlign w:val="center"/>
-          </w:tcPr>
-          <w:p>
-            <w:pPr>
-              <w:jc w:val="center"/>
-            </w:pPr>
-          </w:p>
-        </w:tc>
-        <w:tc>
-          <w:tcPr>
-            <w:tcW w:type="dxa" w:w="3600"/>
-            <w:tcBorders>
-              <w:top w:val="single" w:color="000000" w:sz="6"/>
-              <w:left w:val="single" w:color="000000" w:sz="6"/>
-              <w:bottom w:val="single" w:color="000000" w:sz="6"/>
-              <w:right w:val="single" w:color="000000" w:sz="6"/>
-            </w:tcBorders>
-            <w:tcMar>
-              <w:top w:type="dxa" w:w="40"/>
-              <w:left w:type="dxa" w:w="80"/>
-              <w:bottom w:type="dxa" w:w="40"/>
-              <w:right w:type="dxa" w:w="80"/>
-            </w:tcMar>
-            <w:vAlign w:val="center"/>
-          </w:tcPr>
-          <w:p>
-            <w:pPr>
-              <w:jc w:val="center"/>
-            </w:pPr>
-          </w:p>
-        </w:tc>
-        <w:tc>
-          <w:tcPr>
-            <w:tcW w:type="dxa" w:w="2600"/>
-            <w:tcBorders>
-              <w:top w:val="single" w:color="000000" w:sz="6"/>
-              <w:left w:val="single" w:color="000000" w:sz="6"/>
-              <w:bottom w:val="single" w:color="000000" w:sz="6"/>
-              <w:right w:val="single" w:color="000000" w:sz="6"/>
-            </w:tcBorders>
-            <w:tcMar>
-              <w:top w:type="dxa" w:w="40"/>
-              <w:left w:type="dxa" w:w="80"/>
-              <w:bottom w:type="dxa" w:w="40"/>
-              <w:right w:type="dxa" w:w="80"/>
-            </w:tcMar>
-            <w:vAlign w:val="center"/>
-          </w:tcPr>
-          <w:p>
-            <w:pPr>
-              <w:jc w:val="center"/>
-            </w:pPr>
-          </w:p>
-        </w:tc>
-        <w:tc>
-          <w:tcPr>
-            <w:tcW w:type="dxa" w:w="2200"/>
-            <w:tcBorders>
-              <w:top w:val="single" w:color="000000" w:sz="6"/>
-              <w:left w:val="single" w:color="000000" w:sz="6"/>
-              <w:bottom w:val="single" w:color="000000" w:sz="6"/>
-              <w:right w:val="single" w:color="000000" w:sz="6"/>
-            </w:tcBorders>
-            <w:tcMar>
-              <w:top w:type="dxa" w:w="40"/>
-              <w:left w:type="dxa" w:w="80"/>
-              <w:bottom w:type="dxa" w:w="40"/>
-              <w:right w:type="dxa" w:w="80"/>
-            </w:tcMar>
-            <w:vAlign w:val="center"/>
-          </w:tcPr>
-          <w:p>
-            <w:pPr>
-              <w:jc w:val="center"/>
-            </w:pPr>
-          </w:p>
-        </w:tc>
-        <w:tc>
-          <w:tcPr>
-            <w:tcW w:type="dxa" w:w="1538"/>
-            <w:tcBorders>
-              <w:top w:val="single" w:color="000000" w:sz="6"/>
-              <w:left w:val="single" w:color="000000" w:sz="6"/>
-              <w:bottom w:val="single" w:color="000000" w:sz="6"/>
-              <w:right w:val="single" w:color="000000" w:sz="6"/>
-            </w:tcBorders>
-            <w:tcMar>
-              <w:top w:type="dxa" w:w="40"/>
-              <w:left w:type="dxa" w:w="80"/>
-              <w:bottom w:type="dxa" w:w="40"/>
-              <w:right w:type="dxa" w:w="80"/>
-            </w:tcMar>
-            <w:vAlign w:val="center"/>
-          </w:tcPr>
-          <w:p>
-            <w:pPr>
-              <w:jc w:val="center"/>
-            </w:pPr>
-          </w:p>
-        </w:tc>
-      </w:tr>
-      <w:tr>
-        <w:trPr>
-          <w:cantSplit/>
-          <w:trHeight w:val="560" w:hRule="atLeast"/>
-        </w:trPr>
-        <w:tc>
-          <w:tcPr>
-            <w:tcW w:type="dxa" w:w="700"/>
-            <w:tcBorders>
-              <w:top w:val="single" w:color="000000" w:sz="6"/>
-              <w:left w:val="single" w:color="000000" w:sz="6"/>
-              <w:bottom w:val="single" w:color="000000" w:sz="6"/>
-              <w:right w:val="single" w:color="000000" w:sz="6"/>
-            </w:tcBorders>
-            <w:tcMar>
-              <w:top w:type="dxa" w:w="40"/>
-              <w:left w:type="dxa" w:w="80"/>
-              <w:bottom w:type="dxa" w:w="40"/>
-              <w:right w:type="dxa" w:w="80"/>
-            </w:tcMar>
-            <w:vAlign w:val="center"/>
-          </w:tcPr>
-          <w:p>
-            <w:pPr>
-              <w:jc w:val="center"/>
-            </w:pPr>
-            <w:r>
-              <w:rPr>
-                <w:rFonts w:ascii="맑은 고딕" w:cs="맑은 고딕" w:eastAsia="맑은 고딕" w:hAnsi="맑은 고딕"/>
-                <w:b w:val="false"/>
-                <w:bCs w:val="false"/>
-                <w:sz w:val="18"/>
-                <w:szCs w:val="18"/>
-              </w:rPr>
-              <w:t xml:space="preserve">8</w:t>
-            </w:r>
-          </w:p>
-        </w:tc>
-        <w:tc>
-          <w:tcPr>
-            <w:tcW w:type="dxa" w:w="2300"/>
-            <w:tcBorders>
-              <w:top w:val="single" w:color="000000" w:sz="6"/>
-              <w:left w:val="single" w:color="000000" w:sz="6"/>
-              <w:bottom w:val="single" w:color="000000" w:sz="6"/>
-              <w:right w:val="single" w:color="000000" w:sz="6"/>
-            </w:tcBorders>
-            <w:tcMar>
-              <w:top w:type="dxa" w:w="40"/>
-              <w:left w:type="dxa" w:w="80"/>
-              <w:bottom w:type="dxa" w:w="40"/>
-              <w:right w:type="dxa" w:w="80"/>
-            </w:tcMar>
-            <w:vAlign w:val="center"/>
-          </w:tcPr>
-          <w:p>
-            <w:pPr>
-              <w:jc w:val="center"/>
-            </w:pPr>
-          </w:p>
-        </w:tc>
-        <w:tc>
-          <w:tcPr>
-            <w:tcW w:type="dxa" w:w="1900"/>
-            <w:tcBorders>
-              <w:top w:val="single" w:color="000000" w:sz="6"/>
-              <w:left w:val="single" w:color="000000" w:sz="6"/>
-              <w:bottom w:val="single" w:color="000000" w:sz="6"/>
-              <w:right w:val="single" w:color="000000" w:sz="6"/>
-            </w:tcBorders>
-            <w:tcMar>
-              <w:top w:type="dxa" w:w="40"/>
-              <w:left w:type="dxa" w:w="80"/>
-              <w:bottom w:type="dxa" w:w="40"/>
-              <w:right w:type="dxa" w:w="80"/>
-            </w:tcMar>
-            <w:vAlign w:val="center"/>
-          </w:tcPr>
-          <w:p>
-            <w:pPr>
-              <w:jc w:val="center"/>
-            </w:pPr>
-          </w:p>
-        </w:tc>
-        <w:tc>
-          <w:tcPr>
-            <w:tcW w:type="dxa" w:w="3600"/>
-            <w:tcBorders>
-              <w:top w:val="single" w:color="000000" w:sz="6"/>
-              <w:left w:val="single" w:color="000000" w:sz="6"/>
-              <w:bottom w:val="single" w:color="000000" w:sz="6"/>
-              <w:right w:val="single" w:color="000000" w:sz="6"/>
-            </w:tcBorders>
-            <w:tcMar>
-              <w:top w:type="dxa" w:w="40"/>
-              <w:left w:type="dxa" w:w="80"/>
-              <w:bottom w:type="dxa" w:w="40"/>
-              <w:right w:type="dxa" w:w="80"/>
-            </w:tcMar>
-            <w:vAlign w:val="center"/>
-          </w:tcPr>
-          <w:p>
-            <w:pPr>
-              <w:jc w:val="center"/>
-            </w:pPr>
-          </w:p>
-        </w:tc>
-        <w:tc>
-          <w:tcPr>
-            <w:tcW w:type="dxa" w:w="2600"/>
-            <w:tcBorders>
-              <w:top w:val="single" w:color="000000" w:sz="6"/>
-              <w:left w:val="single" w:color="000000" w:sz="6"/>
-              <w:bottom w:val="single" w:color="000000" w:sz="6"/>
-              <w:right w:val="single" w:color="000000" w:sz="6"/>
-            </w:tcBorders>
-            <w:tcMar>
-              <w:top w:type="dxa" w:w="40"/>
-              <w:left w:type="dxa" w:w="80"/>
-              <w:bottom w:type="dxa" w:w="40"/>
-              <w:right w:type="dxa" w:w="80"/>
-            </w:tcMar>
-            <w:vAlign w:val="center"/>
-          </w:tcPr>
-          <w:p>
-            <w:pPr>
-              <w:jc w:val="center"/>
-            </w:pPr>
-          </w:p>
-        </w:tc>
-        <w:tc>
-          <w:tcPr>
-            <w:tcW w:type="dxa" w:w="2200"/>
-            <w:tcBorders>
-              <w:top w:val="single" w:color="000000" w:sz="6"/>
-              <w:left w:val="single" w:color="000000" w:sz="6"/>
-              <w:bottom w:val="single" w:color="000000" w:sz="6"/>
-              <w:right w:val="single" w:color="000000" w:sz="6"/>
-            </w:tcBorders>
-            <w:tcMar>
-              <w:top w:type="dxa" w:w="40"/>
-              <w:left w:type="dxa" w:w="80"/>
-              <w:bottom w:type="dxa" w:w="40"/>
-              <w:right w:type="dxa" w:w="80"/>
-            </w:tcMar>
-            <w:vAlign w:val="center"/>
-          </w:tcPr>
-          <w:p>
-            <w:pPr>
-              <w:jc w:val="center"/>
-            </w:pPr>
-          </w:p>
-        </w:tc>
-        <w:tc>
-          <w:tcPr>
-            <w:tcW w:type="dxa" w:w="1538"/>
-            <w:tcBorders>
-              <w:top w:val="single" w:color="000000" w:sz="6"/>
-              <w:left w:val="single" w:color="000000" w:sz="6"/>
-              <w:bottom w:val="single" w:color="000000" w:sz="6"/>
-              <w:right w:val="single" w:color="000000" w:sz="6"/>
-            </w:tcBorders>
-            <w:tcMar>
-              <w:top w:type="dxa" w:w="40"/>
-              <w:left w:type="dxa" w:w="80"/>
-              <w:bottom w:type="dxa" w:w="40"/>
-              <w:right w:type="dxa" w:w="80"/>
-            </w:tcMar>
-            <w:vAlign w:val="center"/>
-          </w:tcPr>
-          <w:p>
-            <w:pPr>
-              <w:jc w:val="center"/>
-            </w:pPr>
-          </w:p>
-        </w:tc>
-      </w:tr>
-      <w:tr>
-        <w:trPr>
-          <w:cantSplit/>
-          <w:trHeight w:val="560" w:hRule="atLeast"/>
-        </w:trPr>
-        <w:tc>
-          <w:tcPr>
-            <w:tcW w:type="dxa" w:w="700"/>
-            <w:tcBorders>
-              <w:top w:val="single" w:color="000000" w:sz="6"/>
-              <w:left w:val="single" w:color="000000" w:sz="6"/>
-              <w:bottom w:val="single" w:color="000000" w:sz="6"/>
-              <w:right w:val="single" w:color="000000" w:sz="6"/>
-            </w:tcBorders>
-            <w:tcMar>
-              <w:top w:type="dxa" w:w="40"/>
-              <w:left w:type="dxa" w:w="80"/>
-              <w:bottom w:type="dxa" w:w="40"/>
-              <w:right w:type="dxa" w:w="80"/>
-            </w:tcMar>
-            <w:vAlign w:val="center"/>
-          </w:tcPr>
-          <w:p>
-            <w:pPr>
-              <w:jc w:val="center"/>
-            </w:pPr>
-            <w:r>
-              <w:rPr>
-                <w:rFonts w:ascii="맑은 고딕" w:cs="맑은 고딕" w:eastAsia="맑은 고딕" w:hAnsi="맑은 고딕"/>
-                <w:b w:val="false"/>
-                <w:bCs w:val="false"/>
-                <w:sz w:val="18"/>
-                <w:szCs w:val="18"/>
-              </w:rPr>
-              <w:t xml:space="preserve">9</w:t>
-            </w:r>
-          </w:p>
-        </w:tc>
-        <w:tc>
-          <w:tcPr>
-            <w:tcW w:type="dxa" w:w="2300"/>
-            <w:tcBorders>
-              <w:top w:val="single" w:color="000000" w:sz="6"/>
-              <w:left w:val="single" w:color="000000" w:sz="6"/>
-              <w:bottom w:val="single" w:color="000000" w:sz="6"/>
-              <w:right w:val="single" w:color="000000" w:sz="6"/>
-            </w:tcBorders>
-            <w:tcMar>
-              <w:top w:type="dxa" w:w="40"/>
-              <w:left w:type="dxa" w:w="80"/>
-              <w:bottom w:type="dxa" w:w="40"/>
-              <w:right w:type="dxa" w:w="80"/>
-            </w:tcMar>
-            <w:vAlign w:val="center"/>
-          </w:tcPr>
-          <w:p>
-            <w:pPr>
-              <w:jc w:val="center"/>
-            </w:pPr>
-          </w:p>
-        </w:tc>
-        <w:tc>
-          <w:tcPr>
-            <w:tcW w:type="dxa" w:w="1900"/>
-            <w:tcBorders>
-              <w:top w:val="single" w:color="000000" w:sz="6"/>
-              <w:left w:val="single" w:color="000000" w:sz="6"/>
-              <w:bottom w:val="single" w:color="000000" w:sz="6"/>
-              <w:right w:val="single" w:color="000000" w:sz="6"/>
-            </w:tcBorders>
-            <w:tcMar>
-              <w:top w:type="dxa" w:w="40"/>
-              <w:left w:type="dxa" w:w="80"/>
-              <w:bottom w:type="dxa" w:w="40"/>
-              <w:right w:type="dxa" w:w="80"/>
-            </w:tcMar>
-            <w:vAlign w:val="center"/>
-          </w:tcPr>
-          <w:p>
-            <w:pPr>
-              <w:jc w:val="center"/>
-            </w:pPr>
-          </w:p>
-        </w:tc>
-        <w:tc>
-          <w:tcPr>
-            <w:tcW w:type="dxa" w:w="3600"/>
-            <w:tcBorders>
-              <w:top w:val="single" w:color="000000" w:sz="6"/>
-              <w:left w:val="single" w:color="000000" w:sz="6"/>
-              <w:bottom w:val="single" w:color="000000" w:sz="6"/>
-              <w:right w:val="single" w:color="000000" w:sz="6"/>
-            </w:tcBorders>
-            <w:tcMar>
-              <w:top w:type="dxa" w:w="40"/>
-              <w:left w:type="dxa" w:w="80"/>
-              <w:bottom w:type="dxa" w:w="40"/>
-              <w:right w:type="dxa" w:w="80"/>
-            </w:tcMar>
-            <w:vAlign w:val="center"/>
-          </w:tcPr>
-          <w:p>
-            <w:pPr>
-              <w:jc w:val="center"/>
-            </w:pPr>
-          </w:p>
-        </w:tc>
-        <w:tc>
-          <w:tcPr>
-            <w:tcW w:type="dxa" w:w="2600"/>
-            <w:tcBorders>
-              <w:top w:val="single" w:color="000000" w:sz="6"/>
-              <w:left w:val="single" w:color="000000" w:sz="6"/>
-              <w:bottom w:val="single" w:color="000000" w:sz="6"/>
-              <w:right w:val="single" w:color="000000" w:sz="6"/>
-            </w:tcBorders>
-            <w:tcMar>
-              <w:top w:type="dxa" w:w="40"/>
-              <w:left w:type="dxa" w:w="80"/>
-              <w:bottom w:type="dxa" w:w="40"/>
-              <w:right w:type="dxa" w:w="80"/>
-            </w:tcMar>
-            <w:vAlign w:val="center"/>
-          </w:tcPr>
-          <w:p>
-            <w:pPr>
-              <w:jc w:val="center"/>
-            </w:pPr>
-          </w:p>
-        </w:tc>
-        <w:tc>
-          <w:tcPr>
-            <w:tcW w:type="dxa" w:w="2200"/>
-            <w:tcBorders>
-              <w:top w:val="single" w:color="000000" w:sz="6"/>
-              <w:left w:val="single" w:color="000000" w:sz="6"/>
-              <w:bottom w:val="single" w:color="000000" w:sz="6"/>
-              <w:right w:val="single" w:color="000000" w:sz="6"/>
-            </w:tcBorders>
-            <w:tcMar>
-              <w:top w:type="dxa" w:w="40"/>
-              <w:left w:type="dxa" w:w="80"/>
-              <w:bottom w:type="dxa" w:w="40"/>
-              <w:right w:type="dxa" w:w="80"/>
-            </w:tcMar>
-            <w:vAlign w:val="center"/>
-          </w:tcPr>
-          <w:p>
-            <w:pPr>
-              <w:jc w:val="center"/>
-            </w:pPr>
-          </w:p>
-        </w:tc>
-        <w:tc>
-          <w:tcPr>
-            <w:tcW w:type="dxa" w:w="1538"/>
-            <w:tcBorders>
-              <w:top w:val="single" w:color="000000" w:sz="6"/>
-              <w:left w:val="single" w:color="000000" w:sz="6"/>
-              <w:bottom w:val="single" w:color="000000" w:sz="6"/>
-              <w:right w:val="single" w:color="000000" w:sz="6"/>
-            </w:tcBorders>
-            <w:tcMar>
-              <w:top w:type="dxa" w:w="40"/>
-              <w:left w:type="dxa" w:w="80"/>
-              <w:bottom w:type="dxa" w:w="40"/>
-              <w:right w:type="dxa" w:w="80"/>
-            </w:tcMar>
-            <w:vAlign w:val="center"/>
-          </w:tcPr>
-          <w:p>
-            <w:pPr>
-              <w:jc w:val="center"/>
-            </w:pPr>
-          </w:p>
-        </w:tc>
-      </w:tr>
-      <w:tr>
-        <w:trPr>
-          <w:cantSplit/>
-          <w:trHeight w:val="560" w:hRule="atLeast"/>
-        </w:trPr>
-        <w:tc>
-          <w:tcPr>
-            <w:tcW w:type="dxa" w:w="700"/>
-            <w:tcBorders>
-              <w:top w:val="single" w:color="000000" w:sz="6"/>
-              <w:left w:val="single" w:color="000000" w:sz="6"/>
-              <w:bottom w:val="single" w:color="000000" w:sz="6"/>
-              <w:right w:val="single" w:color="000000" w:sz="6"/>
-            </w:tcBorders>
-            <w:tcMar>
-              <w:top w:type="dxa" w:w="40"/>
-              <w:left w:type="dxa" w:w="80"/>
-              <w:bottom w:type="dxa" w:w="40"/>
-              <w:right w:type="dxa" w:w="80"/>
-            </w:tcMar>
-            <w:vAlign w:val="center"/>
-          </w:tcPr>
-          <w:p>
-            <w:pPr>
-              <w:jc w:val="center"/>
-            </w:pPr>
-            <w:r>
-              <w:rPr>
-                <w:rFonts w:ascii="맑은 고딕" w:cs="맑은 고딕" w:eastAsia="맑은 고딕" w:hAnsi="맑은 고딕"/>
-                <w:b w:val="false"/>
-                <w:bCs w:val="false"/>
-                <w:sz w:val="18"/>
-                <w:szCs w:val="18"/>
-              </w:rPr>
-              <w:t xml:space="preserve">10</w:t>
-            </w:r>
-          </w:p>
-        </w:tc>
-        <w:tc>
-          <w:tcPr>
-            <w:tcW w:type="dxa" w:w="2300"/>
-            <w:tcBorders>
-              <w:top w:val="single" w:color="000000" w:sz="6"/>
-              <w:left w:val="single" w:color="000000" w:sz="6"/>
-              <w:bottom w:val="single" w:color="000000" w:sz="6"/>
-              <w:right w:val="single" w:color="000000" w:sz="6"/>
-            </w:tcBorders>
-            <w:tcMar>
-              <w:top w:type="dxa" w:w="40"/>
-              <w:left w:type="dxa" w:w="80"/>
-              <w:bottom w:type="dxa" w:w="40"/>
-              <w:right w:type="dxa" w:w="80"/>
-            </w:tcMar>
-            <w:vAlign w:val="center"/>
-          </w:tcPr>
-          <w:p>
-            <w:pPr>
-              <w:jc w:val="center"/>
-            </w:pPr>
-          </w:p>
-        </w:tc>
-        <w:tc>
-          <w:tcPr>
-            <w:tcW w:type="dxa" w:w="1900"/>
-            <w:tcBorders>
-              <w:top w:val="single" w:color="000000" w:sz="6"/>
-              <w:left w:val="single" w:color="000000" w:sz="6"/>
-              <w:bottom w:val="single" w:color="000000" w:sz="6"/>
-              <w:right w:val="single" w:color="000000" w:sz="6"/>
-            </w:tcBorders>
-            <w:tcMar>
-              <w:top w:type="dxa" w:w="40"/>
-              <w:left w:type="dxa" w:w="80"/>
-              <w:bottom w:type="dxa" w:w="40"/>
-              <w:right w:type="dxa" w:w="80"/>
-            </w:tcMar>
-            <w:vAlign w:val="center"/>
-          </w:tcPr>
-          <w:p>
-            <w:pPr>
-              <w:jc w:val="center"/>
-            </w:pPr>
-          </w:p>
-        </w:tc>
-        <w:tc>
-          <w:tcPr>
-            <w:tcW w:type="dxa" w:w="3600"/>
-            <w:tcBorders>
-              <w:top w:val="single" w:color="000000" w:sz="6"/>
-              <w:left w:val="single" w:color="000000" w:sz="6"/>
-              <w:bottom w:val="single" w:color="000000" w:sz="6"/>
-              <w:right w:val="single" w:color="000000" w:sz="6"/>
-            </w:tcBorders>
-            <w:tcMar>
-              <w:top w:type="dxa" w:w="40"/>
-              <w:left w:type="dxa" w:w="80"/>
-              <w:bottom w:type="dxa" w:w="40"/>
-              <w:right w:type="dxa" w:w="80"/>
-            </w:tcMar>
-            <w:vAlign w:val="center"/>
-          </w:tcPr>
-          <w:p>
-            <w:pPr>
-              <w:jc w:val="center"/>
-            </w:pPr>
-          </w:p>
-        </w:tc>
-        <w:tc>
-          <w:tcPr>
-            <w:tcW w:type="dxa" w:w="2600"/>
-            <w:tcBorders>
-              <w:top w:val="single" w:color="000000" w:sz="6"/>
-              <w:left w:val="single" w:color="000000" w:sz="6"/>
-              <w:bottom w:val="single" w:color="000000" w:sz="6"/>
-              <w:right w:val="single" w:color="000000" w:sz="6"/>
-            </w:tcBorders>
-            <w:tcMar>
-              <w:top w:type="dxa" w:w="40"/>
-              <w:left w:type="dxa" w:w="80"/>
-              <w:bottom w:type="dxa" w:w="40"/>
-              <w:right w:type="dxa" w:w="80"/>
-            </w:tcMar>
-            <w:vAlign w:val="center"/>
-          </w:tcPr>
-          <w:p>
-            <w:pPr>
-              <w:jc w:val="center"/>
-            </w:pPr>
-          </w:p>
-        </w:tc>
-        <w:tc>
-          <w:tcPr>
-            <w:tcW w:type="dxa" w:w="2200"/>
-            <w:tcBorders>
-              <w:top w:val="single" w:color="000000" w:sz="6"/>
-              <w:left w:val="single" w:color="000000" w:sz="6"/>
-              <w:bottom w:val="single" w:color="000000" w:sz="6"/>
-              <w:right w:val="single" w:color="000000" w:sz="6"/>
-            </w:tcBorders>
-            <w:tcMar>
-              <w:top w:type="dxa" w:w="40"/>
-              <w:left w:type="dxa" w:w="80"/>
-              <w:bottom w:type="dxa" w:w="40"/>
-              <w:right w:type="dxa" w:w="80"/>
-            </w:tcMar>
-            <w:vAlign w:val="center"/>
-          </w:tcPr>
-          <w:p>
-            <w:pPr>
-              <w:jc w:val="center"/>
-            </w:pPr>
-          </w:p>
-        </w:tc>
-        <w:tc>
-          <w:tcPr>
-            <w:tcW w:type="dxa" w:w="1538"/>
-            <w:tcBorders>
-              <w:top w:val="single" w:color="000000" w:sz="6"/>
-              <w:left w:val="single" w:color="000000" w:sz="6"/>
-              <w:bottom w:val="single" w:color="000000" w:sz="6"/>
-              <w:right w:val="single" w:color="000000" w:sz="6"/>
-            </w:tcBorders>
-            <w:tcMar>
-              <w:top w:type="dxa" w:w="40"/>
-              <w:left w:type="dxa" w:w="80"/>
-              <w:bottom w:type="dxa" w:w="40"/>
-              <w:right w:type="dxa" w:w="80"/>
-            </w:tcMar>
-            <w:vAlign w:val="center"/>
-          </w:tcPr>
-          <w:p>
-            <w:pPr>
-              <w:jc w:val="center"/>
-            </w:pPr>
-          </w:p>
-        </w:tc>
-      </w:tr>
-      <w:tr>
-        <w:trPr>
-          <w:cantSplit/>
-          <w:trHeight w:val="560" w:hRule="atLeast"/>
-        </w:trPr>
-        <w:tc>
-          <w:tcPr>
-            <w:tcW w:type="dxa" w:w="700"/>
-            <w:tcBorders>
-              <w:top w:val="single" w:color="000000" w:sz="6"/>
-              <w:left w:val="single" w:color="000000" w:sz="6"/>
-              <w:bottom w:val="single" w:color="000000" w:sz="6"/>
-              <w:right w:val="single" w:color="000000" w:sz="6"/>
-            </w:tcBorders>
-            <w:tcMar>
-              <w:top w:type="dxa" w:w="40"/>
-              <w:left w:type="dxa" w:w="80"/>
-              <w:bottom w:type="dxa" w:w="40"/>
-              <w:right w:type="dxa" w:w="80"/>
-            </w:tcMar>
-            <w:vAlign w:val="center"/>
-          </w:tcPr>
-          <w:p>
-            <w:pPr>
-              <w:jc w:val="center"/>
-            </w:pPr>
-            <w:r>
-              <w:rPr>
-                <w:rFonts w:ascii="맑은 고딕" w:cs="맑은 고딕" w:eastAsia="맑은 고딕" w:hAnsi="맑은 고딕"/>
-                <w:b w:val="false"/>
-                <w:bCs w:val="false"/>
-                <w:sz w:val="18"/>
-                <w:szCs w:val="18"/>
-              </w:rPr>
-              <w:t xml:space="preserve">11</w:t>
-            </w:r>
-          </w:p>
-        </w:tc>
-        <w:tc>
-          <w:tcPr>
-            <w:tcW w:type="dxa" w:w="2300"/>
-            <w:tcBorders>
-              <w:top w:val="single" w:color="000000" w:sz="6"/>
-              <w:left w:val="single" w:color="000000" w:sz="6"/>
-              <w:bottom w:val="single" w:color="000000" w:sz="6"/>
-              <w:right w:val="single" w:color="000000" w:sz="6"/>
-            </w:tcBorders>
-            <w:tcMar>
-              <w:top w:type="dxa" w:w="40"/>
-              <w:left w:type="dxa" w:w="80"/>
-              <w:bottom w:type="dxa" w:w="40"/>
-              <w:right w:type="dxa" w:w="80"/>
-            </w:tcMar>
-            <w:vAlign w:val="center"/>
-          </w:tcPr>
-          <w:p>
-            <w:pPr>
-              <w:jc w:val="center"/>
-            </w:pPr>
-          </w:p>
-        </w:tc>
-        <w:tc>
-          <w:tcPr>
-            <w:tcW w:type="dxa" w:w="1900"/>
-            <w:tcBorders>
-              <w:top w:val="single" w:color="000000" w:sz="6"/>
-              <w:left w:val="single" w:color="000000" w:sz="6"/>
-              <w:bottom w:val="single" w:color="000000" w:sz="6"/>
-              <w:right w:val="single" w:color="000000" w:sz="6"/>
-            </w:tcBorders>
-            <w:tcMar>
-              <w:top w:type="dxa" w:w="40"/>
-              <w:left w:type="dxa" w:w="80"/>
-              <w:bottom w:type="dxa" w:w="40"/>
-              <w:right w:type="dxa" w:w="80"/>
-            </w:tcMar>
-            <w:vAlign w:val="center"/>
-          </w:tcPr>
-          <w:p>
-            <w:pPr>
-              <w:jc w:val="center"/>
-            </w:pPr>
-          </w:p>
-        </w:tc>
-        <w:tc>
-          <w:tcPr>
-            <w:tcW w:type="dxa" w:w="3600"/>
-            <w:tcBorders>
-              <w:top w:val="single" w:color="000000" w:sz="6"/>
-              <w:left w:val="single" w:color="000000" w:sz="6"/>
-              <w:bottom w:val="single" w:color="000000" w:sz="6"/>
-              <w:right w:val="single" w:color="000000" w:sz="6"/>
-            </w:tcBorders>
-            <w:tcMar>
-              <w:top w:type="dxa" w:w="40"/>
-              <w:left w:type="dxa" w:w="80"/>
-              <w:bottom w:type="dxa" w:w="40"/>
-              <w:right w:type="dxa" w:w="80"/>
-            </w:tcMar>
-            <w:vAlign w:val="center"/>
-          </w:tcPr>
-          <w:p>
-            <w:pPr>
-              <w:jc w:val="center"/>
-            </w:pPr>
-          </w:p>
-        </w:tc>
-        <w:tc>
-          <w:tcPr>
-            <w:tcW w:type="dxa" w:w="2600"/>
-            <w:tcBorders>
-              <w:top w:val="single" w:color="000000" w:sz="6"/>
-              <w:left w:val="single" w:color="000000" w:sz="6"/>
-              <w:bottom w:val="single" w:color="000000" w:sz="6"/>
-              <w:right w:val="single" w:color="000000" w:sz="6"/>
-            </w:tcBorders>
-            <w:tcMar>
-              <w:top w:type="dxa" w:w="40"/>
-              <w:left w:type="dxa" w:w="80"/>
-              <w:bottom w:type="dxa" w:w="40"/>
-              <w:right w:type="dxa" w:w="80"/>
-            </w:tcMar>
-            <w:vAlign w:val="center"/>
-          </w:tcPr>
-          <w:p>
-            <w:pPr>
-              <w:jc w:val="center"/>
-            </w:pPr>
-          </w:p>
-        </w:tc>
-        <w:tc>
-          <w:tcPr>
-            <w:tcW w:type="dxa" w:w="2200"/>
-            <w:tcBorders>
-              <w:top w:val="single" w:color="000000" w:sz="6"/>
-              <w:left w:val="single" w:color="000000" w:sz="6"/>
-              <w:bottom w:val="single" w:color="000000" w:sz="6"/>
-              <w:right w:val="single" w:color="000000" w:sz="6"/>
-            </w:tcBorders>
-            <w:tcMar>
-              <w:top w:type="dxa" w:w="40"/>
-              <w:left w:type="dxa" w:w="80"/>
-              <w:bottom w:type="dxa" w:w="40"/>
-              <w:right w:type="dxa" w:w="80"/>
-            </w:tcMar>
-            <w:vAlign w:val="center"/>
-          </w:tcPr>
-          <w:p>
-            <w:pPr>
-              <w:jc w:val="center"/>
-            </w:pPr>
-          </w:p>
-        </w:tc>
-        <w:tc>
-          <w:tcPr>
-            <w:tcW w:type="dxa" w:w="1538"/>
-            <w:tcBorders>
-              <w:top w:val="single" w:color="000000" w:sz="6"/>
-              <w:left w:val="single" w:color="000000" w:sz="6"/>
-              <w:bottom w:val="single" w:color="000000" w:sz="6"/>
-              <w:right w:val="single" w:color="000000" w:sz="6"/>
-            </w:tcBorders>
-            <w:tcMar>
-              <w:top w:type="dxa" w:w="40"/>
-              <w:left w:type="dxa" w:w="80"/>
-              <w:bottom w:type="dxa" w:w="40"/>
-              <w:right w:type="dxa" w:w="80"/>
-            </w:tcMar>
-            <w:vAlign w:val="center"/>
-          </w:tcPr>
-          <w:p>
-            <w:pPr>
-              <w:jc w:val="center"/>
-            </w:pPr>
-          </w:p>
-        </w:tc>
-      </w:tr>
-      <w:tr>
-        <w:trPr>
-          <w:cantSplit/>
-          <w:trHeight w:val="560" w:hRule="atLeast"/>
-        </w:trPr>
-        <w:tc>
-          <w:tcPr>
-            <w:tcW w:type="dxa" w:w="700"/>
-            <w:tcBorders>
-              <w:top w:val="single" w:color="000000" w:sz="6"/>
-              <w:left w:val="single" w:color="000000" w:sz="6"/>
-              <w:bottom w:val="single" w:color="000000" w:sz="6"/>
-              <w:right w:val="single" w:color="000000" w:sz="6"/>
-            </w:tcBorders>
-            <w:tcMar>
-              <w:top w:type="dxa" w:w="40"/>
-              <w:left w:type="dxa" w:w="80"/>
-              <w:bottom w:type="dxa" w:w="40"/>
-              <w:right w:type="dxa" w:w="80"/>
-            </w:tcMar>
-            <w:vAlign w:val="center"/>
-          </w:tcPr>
-          <w:p>
-            <w:pPr>
-              <w:jc w:val="center"/>
-            </w:pPr>
-            <w:r>
-              <w:rPr>
-                <w:rFonts w:ascii="맑은 고딕" w:cs="맑은 고딕" w:eastAsia="맑은 고딕" w:hAnsi="맑은 고딕"/>
-                <w:b w:val="false"/>
-                <w:bCs w:val="false"/>
-                <w:sz w:val="18"/>
-                <w:szCs w:val="18"/>
-              </w:rPr>
-              <w:t xml:space="preserve">12</w:t>
-            </w:r>
-          </w:p>
-        </w:tc>
-        <w:tc>
-          <w:tcPr>
-            <w:tcW w:type="dxa" w:w="2300"/>
-            <w:tcBorders>
-              <w:top w:val="single" w:color="000000" w:sz="6"/>
-              <w:left w:val="single" w:color="000000" w:sz="6"/>
-              <w:bottom w:val="single" w:color="000000" w:sz="6"/>
-              <w:right w:val="single" w:color="000000" w:sz="6"/>
-            </w:tcBorders>
-            <w:tcMar>
-              <w:top w:type="dxa" w:w="40"/>
-              <w:left w:type="dxa" w:w="80"/>
-              <w:bottom w:type="dxa" w:w="40"/>
-              <w:right w:type="dxa" w:w="80"/>
-            </w:tcMar>
-            <w:vAlign w:val="center"/>
-          </w:tcPr>
-          <w:p>
-            <w:pPr>
-              <w:jc w:val="center"/>
-            </w:pPr>
-          </w:p>
-        </w:tc>
-        <w:tc>
-          <w:tcPr>
-            <w:tcW w:type="dxa" w:w="1900"/>
-            <w:tcBorders>
-              <w:top w:val="single" w:color="000000" w:sz="6"/>
-              <w:left w:val="single" w:color="000000" w:sz="6"/>
-              <w:bottom w:val="single" w:color="000000" w:sz="6"/>
-              <w:right w:val="single" w:color="000000" w:sz="6"/>
-            </w:tcBorders>
-            <w:tcMar>
-              <w:top w:type="dxa" w:w="40"/>
-              <w:left w:type="dxa" w:w="80"/>
-              <w:bottom w:type="dxa" w:w="40"/>
-              <w:right w:type="dxa" w:w="80"/>
-            </w:tcMar>
-            <w:vAlign w:val="center"/>
-          </w:tcPr>
-          <w:p>
-            <w:pPr>
-              <w:jc w:val="center"/>
-            </w:pPr>
-          </w:p>
-        </w:tc>
-        <w:tc>
-          <w:tcPr>
-            <w:tcW w:type="dxa" w:w="3600"/>
-            <w:tcBorders>
-              <w:top w:val="single" w:color="000000" w:sz="6"/>
-              <w:left w:val="single" w:color="000000" w:sz="6"/>
-              <w:bottom w:val="single" w:color="000000" w:sz="6"/>
-              <w:right w:val="single" w:color="000000" w:sz="6"/>
-            </w:tcBorders>
-            <w:tcMar>
-              <w:top w:type="dxa" w:w="40"/>
-              <w:left w:type="dxa" w:w="80"/>
-              <w:bottom w:type="dxa" w:w="40"/>
-              <w:right w:type="dxa" w:w="80"/>
-            </w:tcMar>
-            <w:vAlign w:val="center"/>
-          </w:tcPr>
-          <w:p>
-            <w:pPr>
-              <w:jc w:val="center"/>
-            </w:pPr>
-          </w:p>
-        </w:tc>
-        <w:tc>
-          <w:tcPr>
-            <w:tcW w:type="dxa" w:w="2600"/>
-            <w:tcBorders>
-              <w:top w:val="single" w:color="000000" w:sz="6"/>
-              <w:left w:val="single" w:color="000000" w:sz="6"/>
-              <w:bottom w:val="single" w:color="000000" w:sz="6"/>
-              <w:right w:val="single" w:color="000000" w:sz="6"/>
-            </w:tcBorders>
-            <w:tcMar>
-              <w:top w:type="dxa" w:w="40"/>
-              <w:left w:type="dxa" w:w="80"/>
-              <w:bottom w:type="dxa" w:w="40"/>
-              <w:right w:type="dxa" w:w="80"/>
-            </w:tcMar>
-            <w:vAlign w:val="center"/>
-          </w:tcPr>
-          <w:p>
-            <w:pPr>
-              <w:jc w:val="center"/>
-            </w:pPr>
-          </w:p>
-        </w:tc>
-        <w:tc>
-          <w:tcPr>
-            <w:tcW w:type="dxa" w:w="2200"/>
-            <w:tcBorders>
-              <w:top w:val="single" w:color="000000" w:sz="6"/>
-              <w:left w:val="single" w:color="000000" w:sz="6"/>
-              <w:bottom w:val="single" w:color="000000" w:sz="6"/>
-              <w:right w:val="single" w:color="000000" w:sz="6"/>
-            </w:tcBorders>
-            <w:tcMar>
-              <w:top w:type="dxa" w:w="40"/>
-              <w:left w:type="dxa" w:w="80"/>
-              <w:bottom w:type="dxa" w:w="40"/>
-              <w:right w:type="dxa" w:w="80"/>
-            </w:tcMar>
-            <w:vAlign w:val="center"/>
-          </w:tcPr>
-          <w:p>
-            <w:pPr>
-              <w:jc w:val="center"/>
-            </w:pPr>
-          </w:p>
-        </w:tc>
-        <w:tc>
-          <w:tcPr>
-            <w:tcW w:type="dxa" w:w="1538"/>
-            <w:tcBorders>
-              <w:top w:val="single" w:color="000000" w:sz="6"/>
-              <w:left w:val="single" w:color="000000" w:sz="6"/>
-              <w:bottom w:val="single" w:color="000000" w:sz="6"/>
-              <w:right w:val="single" w:color="000000" w:sz="6"/>
-            </w:tcBorders>
-            <w:tcMar>
-              <w:top w:type="dxa" w:w="40"/>
-              <w:left w:type="dxa" w:w="80"/>
-              <w:bottom w:type="dxa" w:w="40"/>
-              <w:right w:type="dxa" w:w="80"/>
-            </w:tcMar>
-            <w:vAlign w:val="center"/>
-          </w:tcPr>
-          <w:p>
-            <w:pPr>
-              <w:jc w:val="center"/>
-            </w:pPr>
-          </w:p>
-        </w:tc>
-      </w:tr>
-    </w:tbl>
-    <w:p>
-      <w:pPr>
-        <w:spacing w:before="120"/>
-        <w:jc w:val="right"/>
-      </w:pPr>
-      <w:r>
-        <w:rPr>
-          <w:rFonts w:ascii="맑은 고딕" w:cs="맑은 고딕" w:eastAsia="맑은 고딕" w:hAnsi="맑은 고딕"/>
-          <w:sz w:val="18"/>
-          <w:szCs w:val="18"/>
-        </w:rPr>
-        <w:t xml:space="preserve">서명일: 2026년 ____월 ____일          확인자(수합 책임자): ______________ (서명)</w:t>
-      </w:r>
-    </w:p>
-    <w:p>
-      <w:r>
-        <w:br w:type="page"/>
-      </w:r>
-    </w:p>
-    <w:p>
-      <w:pPr>
-        <w:spacing w:after="60"/>
-        <w:jc w:val="center"/>
-      </w:pPr>
-      <w:r>
-        <w:rPr>
-          <w:rFonts w:ascii="맑은 고딕" w:cs="맑은 고딕" w:eastAsia="맑은 고딕" w:hAnsi="맑은 고딕"/>
-          <w:b/>
-          <w:bCs/>
-          <w:sz w:val="30"/>
-          <w:szCs w:val="30"/>
-        </w:rPr>
-        <w:t xml:space="preserve">주민 서명부 — (          )마을</w:t>
       </w:r>
     </w:p>
     <w:tbl>

</xml_diff>